<commit_message>
Pattern matching aan file read toegevoegd. Eerste iteratie van hoofdstuk 2 verslag gemaakt.
</commit_message>
<xml_diff>
--- a/HAN-Rapport.docx
+++ b/HAN-Rapport.docx
@@ -1,10 +1,10 @@
 
 <file path=word/document.xml><?xml version="1.0" encoding="utf-8"?>
-<w:document xmlns:wpc="http://schemas.microsoft.com/office/word/2010/wordprocessingCanvas" xmlns:cx="http://schemas.microsoft.com/office/drawing/2014/chartex" xmlns:cx1="http://schemas.microsoft.com/office/drawing/2015/9/8/chartex" xmlns:cx2="http://schemas.microsoft.com/office/drawing/2015/10/21/chartex" xmlns:cx3="http://schemas.microsoft.com/office/drawing/2016/5/9/chartex" xmlns:cx4="http://schemas.microsoft.com/office/drawing/2016/5/10/chartex" xmlns:cx5="http://schemas.microsoft.com/office/drawing/2016/5/11/chartex" xmlns:cx6="http://schemas.microsoft.com/office/drawing/2016/5/12/chartex" xmlns:cx7="http://schemas.microsoft.com/office/drawing/2016/5/13/chartex" xmlns:cx8="http://schemas.microsoft.com/office/drawing/2016/5/14/chartex" xmlns:mc="http://schemas.openxmlformats.org/markup-compatibility/2006" xmlns:aink="http://schemas.microsoft.com/office/drawing/2016/ink" xmlns:am3d="http://schemas.microsoft.com/office/drawing/2017/model3d" xmlns:o="urn:schemas-microsoft-com:office:office" xmlns:r="http://schemas.openxmlformats.org/officeDocument/2006/relationships" xmlns:m="http://schemas.openxmlformats.org/officeDocument/2006/math" xmlns:v="urn:schemas-microsoft-com:vml" xmlns:wp14="http://schemas.microsoft.com/office/word/2010/wordprocessingDrawing" xmlns:wp="http://schemas.openxmlformats.org/drawingml/2006/wordprocessingDrawing" xmlns:w10="urn:schemas-microsoft-com:office:word" xmlns:w="http://schemas.openxmlformats.org/wordprocessingml/2006/main" xmlns:w14="http://schemas.microsoft.com/office/word/2010/wordml" xmlns:w15="http://schemas.microsoft.com/office/word/2012/wordml" xmlns:w16cex="http://schemas.microsoft.com/office/word/2018/wordml/cex" xmlns:w16cid="http://schemas.microsoft.com/office/word/2016/wordml/cid" xmlns:w16="http://schemas.microsoft.com/office/word/2018/wordml" xmlns:w16sdtdh="http://schemas.microsoft.com/office/word/2020/wordml/sdtdatahash" xmlns:w16se="http://schemas.microsoft.com/office/word/2015/wordml/symex" xmlns:wpg="http://schemas.microsoft.com/office/word/2010/wordprocessingGroup" xmlns:wpi="http://schemas.microsoft.com/office/word/2010/wordprocessingInk" xmlns:wne="http://schemas.microsoft.com/office/word/2006/wordml" xmlns:wps="http://schemas.microsoft.com/office/word/2010/wordprocessingShape" mc:Ignorable="w14 w15 w16se w16cid w16 w16cex w16sdtdh wp14">
+<w:document xmlns:wpc="http://schemas.microsoft.com/office/word/2010/wordprocessingCanvas" xmlns:cx="http://schemas.microsoft.com/office/drawing/2014/chartex" xmlns:cx1="http://schemas.microsoft.com/office/drawing/2015/9/8/chartex" xmlns:cx2="http://schemas.microsoft.com/office/drawing/2015/10/21/chartex" xmlns:cx3="http://schemas.microsoft.com/office/drawing/2016/5/9/chartex" xmlns:cx4="http://schemas.microsoft.com/office/drawing/2016/5/10/chartex" xmlns:cx5="http://schemas.microsoft.com/office/drawing/2016/5/11/chartex" xmlns:cx6="http://schemas.microsoft.com/office/drawing/2016/5/12/chartex" xmlns:cx7="http://schemas.microsoft.com/office/drawing/2016/5/13/chartex" xmlns:cx8="http://schemas.microsoft.com/office/drawing/2016/5/14/chartex" xmlns:mc="http://schemas.openxmlformats.org/markup-compatibility/2006" xmlns:aink="http://schemas.microsoft.com/office/drawing/2016/ink" xmlns:am3d="http://schemas.microsoft.com/office/drawing/2017/model3d" xmlns:o="urn:schemas-microsoft-com:office:office" xmlns:oel="http://schemas.microsoft.com/office/2019/extlst" xmlns:r="http://schemas.openxmlformats.org/officeDocument/2006/relationships" xmlns:m="http://schemas.openxmlformats.org/officeDocument/2006/math" xmlns:v="urn:schemas-microsoft-com:vml" xmlns:wp14="http://schemas.microsoft.com/office/word/2010/wordprocessingDrawing" xmlns:wp="http://schemas.openxmlformats.org/drawingml/2006/wordprocessingDrawing" xmlns:w10="urn:schemas-microsoft-com:office:word" xmlns:w="http://schemas.openxmlformats.org/wordprocessingml/2006/main" xmlns:w14="http://schemas.microsoft.com/office/word/2010/wordml" xmlns:w15="http://schemas.microsoft.com/office/word/2012/wordml" xmlns:w16cex="http://schemas.microsoft.com/office/word/2018/wordml/cex" xmlns:w16cid="http://schemas.microsoft.com/office/word/2016/wordml/cid" xmlns:w16="http://schemas.microsoft.com/office/word/2018/wordml" xmlns:w16du="http://schemas.microsoft.com/office/word/2023/wordml/word16du" xmlns:w16sdtdh="http://schemas.microsoft.com/office/word/2020/wordml/sdtdatahash" xmlns:w16sdtfl="http://schemas.microsoft.com/office/word/2024/wordml/sdtformatlock" xmlns:w16se="http://schemas.microsoft.com/office/word/2015/wordml/symex" xmlns:wpg="http://schemas.microsoft.com/office/word/2010/wordprocessingGroup" xmlns:wpi="http://schemas.microsoft.com/office/word/2010/wordprocessingInk" xmlns:wne="http://schemas.microsoft.com/office/word/2006/wordml" xmlns:wps="http://schemas.microsoft.com/office/word/2010/wordprocessingShape" mc:Ignorable="w14 w15 w16se w16cid w16 w16cex w16sdtdh w16sdtfl w16du wp14">
   <w:body>
     <w:tbl>
       <w:tblPr>
-        <w:tblStyle w:val="TableGrid0"/>
+        <w:tblStyle w:val="Tabelraster"/>
         <w:tblW w:w="0" w:type="auto"/>
         <w:tblBorders>
           <w:top w:val="none" w:sz="0" w:space="0" w:color="auto"/>
@@ -34,7 +34,7 @@
           </w:tcPr>
           <w:p>
             <w:pPr>
-              <w:pStyle w:val="Title"/>
+              <w:pStyle w:val="Titel"/>
               <w:rPr>
                 <w:rFonts w:asciiTheme="minorHAnsi" w:hAnsiTheme="minorHAnsi" w:cstheme="minorHAnsi"/>
                 <w:b w:val="0"/>
@@ -53,10 +53,9 @@
                 <w:dataBinding w:prefixMappings="xmlns:ns0='http://purl.org/dc/elements/1.1/' xmlns:ns1='http://schemas.openxmlformats.org/package/2006/metadata/core-properties' " w:xpath="/ns1:coreProperties[1]/ns0:subject[1]" w:storeItemID="{6C3C8BC8-F283-45AE-878A-BAB7291924A1}"/>
                 <w:text w:multiLine="1"/>
               </w:sdtPr>
-              <w:sdtEndPr/>
               <w:sdtContent>
                 <w:r>
-                  <w:t>titel van document</w:t>
+                  <w:t>Opdracht Functioneel Paradigma</w:t>
                 </w:r>
               </w:sdtContent>
             </w:sdt>
@@ -72,39 +71,30 @@
           </w:p>
           <w:p>
             <w:pPr>
-              <w:pStyle w:val="Subtitle"/>
+              <w:pStyle w:val="Ondertitel"/>
+              <w:rPr>
+                <w:lang w:val="en-NL"/>
+              </w:rPr>
             </w:pPr>
-            <w:sdt>
-              <w:sdtPr>
-                <w:id w:val="-1871829710"/>
-                <w:placeholder>
-                  <w:docPart w:val="1A68DFEB80AE484CB30C897E5AFE95E1"/>
-                </w:placeholder>
-                <w:temporary/>
-                <w:showingPlcHdr/>
-              </w:sdtPr>
-              <w:sdtEndPr/>
-              <w:sdtContent>
-                <w:r>
-                  <w:rPr>
-                    <w:rStyle w:val="PlaceholderText"/>
-                  </w:rPr>
-                  <w:t>[</w:t>
-                </w:r>
-                <w:r>
-                  <w:rPr>
-                    <w:rStyle w:val="PlaceholderText"/>
-                  </w:rPr>
-                  <w:t>ondertitel</w:t>
-                </w:r>
-                <w:r>
-                  <w:rPr>
-                    <w:rStyle w:val="PlaceholderText"/>
-                  </w:rPr>
-                  <w:t>]</w:t>
-                </w:r>
-              </w:sdtContent>
-            </w:sdt>
+            <w:r>
+              <w:rPr>
+                <w:lang w:val="en-NL"/>
+              </w:rPr>
+              <w:t xml:space="preserve">Michel </w:t>
+            </w:r>
+            <w:proofErr w:type="spellStart"/>
+            <w:r>
+              <w:rPr>
+                <w:lang w:val="en-NL"/>
+              </w:rPr>
+              <w:t>Koolwaaij</w:t>
+            </w:r>
+            <w:proofErr w:type="spellEnd"/>
+          </w:p>
+          <w:p>
+            <w:pPr>
+              <w:pStyle w:val="Ondertitel"/>
+            </w:pPr>
           </w:p>
         </w:tc>
       </w:tr>
@@ -116,37 +106,9 @@
           <w:rFonts w:eastAsia="Arial Unicode MS"/>
         </w:rPr>
       </w:pPr>
-      <w:sdt>
-        <w:sdtPr>
-          <w:id w:val="2034681001"/>
-          <w:placeholder>
-            <w:docPart w:val="A7076FB95A574DBDAAFADC8377B4AE6F"/>
-          </w:placeholder>
-          <w:temporary/>
-          <w:showingPlcHdr/>
-        </w:sdtPr>
-        <w:sdtEndPr/>
-        <w:sdtContent>
-          <w:r>
-            <w:rPr>
-              <w:rStyle w:val="PlaceholderText"/>
-            </w:rPr>
-            <w:t>[</w:t>
-          </w:r>
-          <w:r>
-            <w:rPr>
-              <w:rStyle w:val="PlaceholderText"/>
-            </w:rPr>
-            <w:t>auteur(s)</w:t>
-          </w:r>
-          <w:r>
-            <w:rPr>
-              <w:rStyle w:val="PlaceholderText"/>
-            </w:rPr>
-            <w:t>]</w:t>
-          </w:r>
-        </w:sdtContent>
-      </w:sdt>
+      <w:r>
+        <w:t>Yunus Kaya 2145900</w:t>
+      </w:r>
     </w:p>
     <w:p>
       <w:pPr>
@@ -158,33 +120,16 @@
           <w:placeholder>
             <w:docPart w:val="3663EDD6474F4B9CA4A375AA3FDCC278"/>
           </w:placeholder>
-          <w:showingPlcHdr/>
-          <w:date>
+          <w:date w:fullDate="2026-03-06T00:00:00Z">
             <w:dateFormat w:val="d MMMM yyyy"/>
             <w:lid w:val="nl-NL"/>
             <w:storeMappedDataAs w:val="dateTime"/>
             <w:calendar w:val="gregorian"/>
           </w:date>
         </w:sdtPr>
-        <w:sdtEndPr/>
         <w:sdtContent>
           <w:r>
-            <w:rPr>
-              <w:rStyle w:val="PlaceholderText"/>
-            </w:rPr>
-            <w:t xml:space="preserve">[kies een </w:t>
-          </w:r>
-          <w:r>
-            <w:rPr>
-              <w:rStyle w:val="PlaceholderText"/>
-            </w:rPr>
-            <w:t>datum</w:t>
-          </w:r>
-          <w:r>
-            <w:rPr>
-              <w:rStyle w:val="PlaceholderText"/>
-            </w:rPr>
-            <w:t>]</w:t>
+            <w:t>6 maart 2026</w:t>
           </w:r>
         </w:sdtContent>
       </w:sdt>
@@ -208,7 +153,7 @@
     </w:p>
     <w:p>
       <w:pPr>
-        <w:pStyle w:val="TOCHeading"/>
+        <w:pStyle w:val="Kopvaninhoudsopgave"/>
       </w:pPr>
       <w:r>
         <w:lastRenderedPageBreak/>
@@ -224,17 +169,20 @@
           <w:docPartUnique/>
         </w:docPartObj>
       </w:sdtPr>
-      <w:sdtEndPr/>
       <w:sdtContent>
         <w:p>
           <w:pPr>
-            <w:pStyle w:val="TOC1"/>
+            <w:pStyle w:val="Inhopg1"/>
             <w:rPr>
               <w:rFonts w:eastAsiaTheme="minorEastAsia" w:cstheme="minorBidi"/>
               <w:b w:val="0"/>
               <w:caps w:val="0"/>
               <w:color w:val="auto"/>
-              <w:sz w:val="22"/>
+              <w:kern w:val="2"/>
+              <w:sz w:val="24"/>
+              <w:szCs w:val="24"/>
+              <w:lang w:val="en-NL" w:eastAsia="en-NL"/>
+              <w14:ligatures w14:val="standardContextual"/>
             </w:rPr>
           </w:pPr>
           <w:r>
@@ -246,12 +194,32 @@
           <w:r>
             <w:fldChar w:fldCharType="separate"/>
           </w:r>
-          <w:hyperlink w:anchor="_Toc18073183" w:history="1">
+          <w:hyperlink w:anchor="_Toc223702473" w:history="1">
             <w:r>
               <w:rPr>
                 <w:rStyle w:val="Hyperlink"/>
               </w:rPr>
-              <w:t>INLEIDING</w:t>
+              <w:t>1</w:t>
+            </w:r>
+            <w:r>
+              <w:rPr>
+                <w:rFonts w:eastAsiaTheme="minorEastAsia" w:cstheme="minorBidi"/>
+                <w:b w:val="0"/>
+                <w:caps w:val="0"/>
+                <w:color w:val="auto"/>
+                <w:kern w:val="2"/>
+                <w:sz w:val="24"/>
+                <w:szCs w:val="24"/>
+                <w:lang w:val="en-NL" w:eastAsia="en-NL"/>
+                <w14:ligatures w14:val="standardContextual"/>
+              </w:rPr>
+              <w:tab/>
+            </w:r>
+            <w:r>
+              <w:rPr>
+                <w:rStyle w:val="Hyperlink"/>
+              </w:rPr>
+              <w:t>Onderzoek</w:t>
             </w:r>
             <w:r>
               <w:rPr>
@@ -269,7 +237,7 @@
               <w:rPr>
                 <w:webHidden/>
               </w:rPr>
-              <w:instrText xml:space="preserve"> PAGEREF _Toc18073183 \h </w:instrText>
+              <w:instrText xml:space="preserve"> PAGEREF _Toc223702473 \h </w:instrText>
             </w:r>
             <w:r>
               <w:rPr>
@@ -286,7 +254,7 @@
               <w:rPr>
                 <w:webHidden/>
               </w:rPr>
-              <w:t>2</w:t>
+              <w:t>4</w:t>
             </w:r>
             <w:r>
               <w:rPr>
@@ -298,21 +266,106 @@
         </w:p>
         <w:p>
           <w:pPr>
-            <w:pStyle w:val="TOC1"/>
+            <w:pStyle w:val="Inhopg2"/>
+            <w:rPr>
+              <w:rFonts w:eastAsiaTheme="minorEastAsia" w:cstheme="minorBidi"/>
+              <w:color w:val="auto"/>
+              <w:kern w:val="2"/>
+              <w:sz w:val="24"/>
+              <w:szCs w:val="24"/>
+              <w:lang w:val="en-NL" w:eastAsia="en-NL"/>
+              <w14:ligatures w14:val="standardContextual"/>
+            </w:rPr>
+          </w:pPr>
+          <w:hyperlink w:anchor="_Toc223702474" w:history="1">
+            <w:r>
+              <w:rPr>
+                <w:rStyle w:val="Hyperlink"/>
+              </w:rPr>
+              <w:t>1.1</w:t>
+            </w:r>
+            <w:r>
+              <w:rPr>
+                <w:rFonts w:eastAsiaTheme="minorEastAsia" w:cstheme="minorBidi"/>
+                <w:color w:val="auto"/>
+                <w:kern w:val="2"/>
+                <w:sz w:val="24"/>
+                <w:szCs w:val="24"/>
+                <w:lang w:val="en-NL" w:eastAsia="en-NL"/>
+                <w14:ligatures w14:val="standardContextual"/>
+              </w:rPr>
+              <w:tab/>
+            </w:r>
+            <w:r>
+              <w:rPr>
+                <w:rStyle w:val="Hyperlink"/>
+              </w:rPr>
+              <w:t>[Paragraaftitel]</w:t>
+            </w:r>
+            <w:r>
+              <w:rPr>
+                <w:webHidden/>
+              </w:rPr>
+              <w:tab/>
+            </w:r>
+            <w:r>
+              <w:rPr>
+                <w:webHidden/>
+              </w:rPr>
+              <w:fldChar w:fldCharType="begin"/>
+            </w:r>
+            <w:r>
+              <w:rPr>
+                <w:webHidden/>
+              </w:rPr>
+              <w:instrText xml:space="preserve"> PAGEREF _Toc223702474 \h </w:instrText>
+            </w:r>
+            <w:r>
+              <w:rPr>
+                <w:webHidden/>
+              </w:rPr>
+            </w:r>
+            <w:r>
+              <w:rPr>
+                <w:webHidden/>
+              </w:rPr>
+              <w:fldChar w:fldCharType="separate"/>
+            </w:r>
+            <w:r>
+              <w:rPr>
+                <w:webHidden/>
+              </w:rPr>
+              <w:t>4</w:t>
+            </w:r>
+            <w:r>
+              <w:rPr>
+                <w:webHidden/>
+              </w:rPr>
+              <w:fldChar w:fldCharType="end"/>
+            </w:r>
+          </w:hyperlink>
+        </w:p>
+        <w:p>
+          <w:pPr>
+            <w:pStyle w:val="Inhopg1"/>
             <w:rPr>
               <w:rFonts w:eastAsiaTheme="minorEastAsia" w:cstheme="minorBidi"/>
               <w:b w:val="0"/>
               <w:caps w:val="0"/>
               <w:color w:val="auto"/>
-              <w:sz w:val="22"/>
+              <w:kern w:val="2"/>
+              <w:sz w:val="24"/>
+              <w:szCs w:val="24"/>
+              <w:lang w:val="en-NL" w:eastAsia="en-NL"/>
+              <w14:ligatures w14:val="standardContextual"/>
             </w:rPr>
           </w:pPr>
-          <w:hyperlink w:anchor="_Toc18073184" w:history="1">
+          <w:hyperlink w:anchor="_Toc223702475" w:history="1">
             <w:r>
               <w:rPr>
                 <w:rStyle w:val="Hyperlink"/>
               </w:rPr>
-              <w:t>1</w:t>
+              <w:t>2</w:t>
             </w:r>
             <w:r>
               <w:rPr>
@@ -320,7 +373,11 @@
                 <w:b w:val="0"/>
                 <w:caps w:val="0"/>
                 <w:color w:val="auto"/>
-                <w:sz w:val="22"/>
+                <w:kern w:val="2"/>
+                <w:sz w:val="24"/>
+                <w:szCs w:val="24"/>
+                <w:lang w:val="en-NL" w:eastAsia="en-NL"/>
+                <w14:ligatures w14:val="standardContextual"/>
               </w:rPr>
               <w:tab/>
             </w:r>
@@ -328,7 +385,7 @@
               <w:rPr>
                 <w:rStyle w:val="Hyperlink"/>
               </w:rPr>
-              <w:t>[hoofdstuktitel]</w:t>
+              <w:t>Challenge</w:t>
             </w:r>
             <w:r>
               <w:rPr>
@@ -346,7 +403,7 @@
               <w:rPr>
                 <w:webHidden/>
               </w:rPr>
-              <w:instrText xml:space="preserve"> PAGEREF _Toc18073184 \h </w:instrText>
+              <w:instrText xml:space="preserve"> PAGEREF _Toc223702475 \h </w:instrText>
             </w:r>
             <w:r>
               <w:rPr>
@@ -363,7 +420,7 @@
               <w:rPr>
                 <w:webHidden/>
               </w:rPr>
-              <w:t>2</w:t>
+              <w:t>4</w:t>
             </w:r>
             <w:r>
               <w:rPr>
@@ -375,25 +432,37 @@
         </w:p>
         <w:p>
           <w:pPr>
-            <w:pStyle w:val="TOC2"/>
+            <w:pStyle w:val="Inhopg1"/>
             <w:rPr>
               <w:rFonts w:eastAsiaTheme="minorEastAsia" w:cstheme="minorBidi"/>
+              <w:b w:val="0"/>
+              <w:caps w:val="0"/>
               <w:color w:val="auto"/>
-              <w:sz w:val="22"/>
+              <w:kern w:val="2"/>
+              <w:sz w:val="24"/>
+              <w:szCs w:val="24"/>
+              <w:lang w:val="en-NL" w:eastAsia="en-NL"/>
+              <w14:ligatures w14:val="standardContextual"/>
             </w:rPr>
           </w:pPr>
-          <w:hyperlink w:anchor="_Toc18073185" w:history="1">
+          <w:hyperlink w:anchor="_Toc223702476" w:history="1">
             <w:r>
               <w:rPr>
                 <w:rStyle w:val="Hyperlink"/>
               </w:rPr>
-              <w:t>1.1</w:t>
+              <w:t>3</w:t>
             </w:r>
             <w:r>
               <w:rPr>
                 <w:rFonts w:eastAsiaTheme="minorEastAsia" w:cstheme="minorBidi"/>
+                <w:b w:val="0"/>
+                <w:caps w:val="0"/>
                 <w:color w:val="auto"/>
-                <w:sz w:val="22"/>
+                <w:kern w:val="2"/>
+                <w:sz w:val="24"/>
+                <w:szCs w:val="24"/>
+                <w:lang w:val="en-NL" w:eastAsia="en-NL"/>
+                <w14:ligatures w14:val="standardContextual"/>
               </w:rPr>
               <w:tab/>
             </w:r>
@@ -401,7 +470,7 @@
               <w:rPr>
                 <w:rStyle w:val="Hyperlink"/>
               </w:rPr>
-              <w:t>[Paragraaftitel]</w:t>
+              <w:t>Implementatie</w:t>
             </w:r>
             <w:r>
               <w:rPr>
@@ -419,7 +488,7 @@
               <w:rPr>
                 <w:webHidden/>
               </w:rPr>
-              <w:instrText xml:space="preserve"> PAGEREF _Toc18073185 \h </w:instrText>
+              <w:instrText xml:space="preserve"> PAGEREF _Toc223702476 \h </w:instrText>
             </w:r>
             <w:r>
               <w:rPr>
@@ -436,7 +505,7 @@
               <w:rPr>
                 <w:webHidden/>
               </w:rPr>
-              <w:t>2</w:t>
+              <w:t>4</w:t>
             </w:r>
             <w:r>
               <w:rPr>
@@ -448,7 +517,177 @@
         </w:p>
         <w:p>
           <w:pPr>
-            <w:pStyle w:val="TOC1"/>
+            <w:pStyle w:val="Inhopg1"/>
+            <w:rPr>
+              <w:rFonts w:eastAsiaTheme="minorEastAsia" w:cstheme="minorBidi"/>
+              <w:b w:val="0"/>
+              <w:caps w:val="0"/>
+              <w:color w:val="auto"/>
+              <w:kern w:val="2"/>
+              <w:sz w:val="24"/>
+              <w:szCs w:val="24"/>
+              <w:lang w:val="en-NL" w:eastAsia="en-NL"/>
+              <w14:ligatures w14:val="standardContextual"/>
+            </w:rPr>
+          </w:pPr>
+          <w:hyperlink w:anchor="_Toc223702477" w:history="1">
+            <w:r>
+              <w:rPr>
+                <w:rStyle w:val="Hyperlink"/>
+              </w:rPr>
+              <w:t>4</w:t>
+            </w:r>
+            <w:r>
+              <w:rPr>
+                <w:rFonts w:eastAsiaTheme="minorEastAsia" w:cstheme="minorBidi"/>
+                <w:b w:val="0"/>
+                <w:caps w:val="0"/>
+                <w:color w:val="auto"/>
+                <w:kern w:val="2"/>
+                <w:sz w:val="24"/>
+                <w:szCs w:val="24"/>
+                <w:lang w:val="en-NL" w:eastAsia="en-NL"/>
+                <w14:ligatures w14:val="standardContextual"/>
+              </w:rPr>
+              <w:tab/>
+            </w:r>
+            <w:r>
+              <w:rPr>
+                <w:rStyle w:val="Hyperlink"/>
+              </w:rPr>
+              <w:t>reflectie</w:t>
+            </w:r>
+            <w:r>
+              <w:rPr>
+                <w:webHidden/>
+              </w:rPr>
+              <w:tab/>
+            </w:r>
+            <w:r>
+              <w:rPr>
+                <w:webHidden/>
+              </w:rPr>
+              <w:fldChar w:fldCharType="begin"/>
+            </w:r>
+            <w:r>
+              <w:rPr>
+                <w:webHidden/>
+              </w:rPr>
+              <w:instrText xml:space="preserve"> PAGEREF _Toc223702477 \h </w:instrText>
+            </w:r>
+            <w:r>
+              <w:rPr>
+                <w:webHidden/>
+              </w:rPr>
+            </w:r>
+            <w:r>
+              <w:rPr>
+                <w:webHidden/>
+              </w:rPr>
+              <w:fldChar w:fldCharType="separate"/>
+            </w:r>
+            <w:r>
+              <w:rPr>
+                <w:webHidden/>
+              </w:rPr>
+              <w:t>4</w:t>
+            </w:r>
+            <w:r>
+              <w:rPr>
+                <w:webHidden/>
+              </w:rPr>
+              <w:fldChar w:fldCharType="end"/>
+            </w:r>
+          </w:hyperlink>
+        </w:p>
+        <w:p>
+          <w:pPr>
+            <w:pStyle w:val="Inhopg1"/>
+            <w:rPr>
+              <w:rFonts w:eastAsiaTheme="minorEastAsia" w:cstheme="minorBidi"/>
+              <w:b w:val="0"/>
+              <w:caps w:val="0"/>
+              <w:color w:val="auto"/>
+              <w:kern w:val="2"/>
+              <w:sz w:val="24"/>
+              <w:szCs w:val="24"/>
+              <w:lang w:val="en-NL" w:eastAsia="en-NL"/>
+              <w14:ligatures w14:val="standardContextual"/>
+            </w:rPr>
+          </w:pPr>
+          <w:hyperlink w:anchor="_Toc223702478" w:history="1">
+            <w:r>
+              <w:rPr>
+                <w:rStyle w:val="Hyperlink"/>
+              </w:rPr>
+              <w:t>5</w:t>
+            </w:r>
+            <w:r>
+              <w:rPr>
+                <w:rFonts w:eastAsiaTheme="minorEastAsia" w:cstheme="minorBidi"/>
+                <w:b w:val="0"/>
+                <w:caps w:val="0"/>
+                <w:color w:val="auto"/>
+                <w:kern w:val="2"/>
+                <w:sz w:val="24"/>
+                <w:szCs w:val="24"/>
+                <w:lang w:val="en-NL" w:eastAsia="en-NL"/>
+                <w14:ligatures w14:val="standardContextual"/>
+              </w:rPr>
+              <w:tab/>
+            </w:r>
+            <w:r>
+              <w:rPr>
+                <w:rStyle w:val="Hyperlink"/>
+              </w:rPr>
+              <w:t>Conclusie</w:t>
+            </w:r>
+            <w:r>
+              <w:rPr>
+                <w:webHidden/>
+              </w:rPr>
+              <w:tab/>
+            </w:r>
+            <w:r>
+              <w:rPr>
+                <w:webHidden/>
+              </w:rPr>
+              <w:fldChar w:fldCharType="begin"/>
+            </w:r>
+            <w:r>
+              <w:rPr>
+                <w:webHidden/>
+              </w:rPr>
+              <w:instrText xml:space="preserve"> PAGEREF _Toc223702478 \h </w:instrText>
+            </w:r>
+            <w:r>
+              <w:rPr>
+                <w:webHidden/>
+              </w:rPr>
+            </w:r>
+            <w:r>
+              <w:rPr>
+                <w:webHidden/>
+              </w:rPr>
+              <w:fldChar w:fldCharType="separate"/>
+            </w:r>
+            <w:r>
+              <w:rPr>
+                <w:webHidden/>
+              </w:rPr>
+              <w:t>4</w:t>
+            </w:r>
+            <w:r>
+              <w:rPr>
+                <w:webHidden/>
+              </w:rPr>
+              <w:fldChar w:fldCharType="end"/>
+            </w:r>
+          </w:hyperlink>
+        </w:p>
+        <w:p>
+          <w:pPr>
+            <w:pStyle w:val="Inhopg1"/>
           </w:pPr>
           <w:r>
             <w:fldChar w:fldCharType="end"/>
@@ -456,11 +695,11 @@
         </w:p>
       </w:sdtContent>
     </w:sdt>
-    <w:bookmarkStart w:id="0" w:name="_Toc453919959" w:displacedByCustomXml="prev"/>
-    <w:bookmarkStart w:id="1" w:name="_Toc453920324" w:displacedByCustomXml="prev"/>
+    <w:bookmarkStart w:id="0" w:name="_Toc453921976" w:displacedByCustomXml="prev"/>
+    <w:bookmarkStart w:id="1" w:name="_Toc453921523" w:displacedByCustomXml="prev"/>
     <w:bookmarkStart w:id="2" w:name="_Toc453921312" w:displacedByCustomXml="prev"/>
-    <w:bookmarkStart w:id="3" w:name="_Toc453921523" w:displacedByCustomXml="prev"/>
-    <w:bookmarkStart w:id="4" w:name="_Toc453921976" w:displacedByCustomXml="prev"/>
+    <w:bookmarkStart w:id="3" w:name="_Toc453920324" w:displacedByCustomXml="prev"/>
+    <w:bookmarkStart w:id="4" w:name="_Toc453919959" w:displacedByCustomXml="prev"/>
     <w:p>
       <w:r>
         <w:br w:type="page"/>
@@ -473,7 +712,6 @@
       <w:bookmarkStart w:id="5" w:name="_Toc455750738"/>
       <w:bookmarkStart w:id="6" w:name="_Toc455759782"/>
       <w:bookmarkStart w:id="7" w:name="_Toc536188568"/>
-      <w:bookmarkStart w:id="8" w:name="_Toc18073183"/>
       <w:bookmarkEnd w:id="4"/>
       <w:bookmarkEnd w:id="3"/>
       <w:bookmarkEnd w:id="2"/>
@@ -486,7 +724,6 @@
       <w:bookmarkEnd w:id="5"/>
       <w:bookmarkEnd w:id="6"/>
       <w:bookmarkEnd w:id="7"/>
-      <w:bookmarkEnd w:id="8"/>
     </w:p>
     <w:p/>
     <w:p>
@@ -499,11 +736,10 @@
           <w:temporary/>
           <w:showingPlcHdr/>
         </w:sdtPr>
-        <w:sdtEndPr/>
         <w:sdtContent>
           <w:r>
             <w:rPr>
-              <w:rStyle w:val="PlaceholderText"/>
+              <w:rStyle w:val="Tekstvantijdelijkeaanduiding"/>
             </w:rPr>
             <w:t>[Klik hier als je tekst wilt invoeren, maak gebruik van de stijlen op de tab MIJN DOCUMENT voor het typen van (genummerde) koppen.]</w:t>
           </w:r>
@@ -522,31 +758,16 @@
         <w:br w:type="page"/>
       </w:r>
     </w:p>
-    <w:bookmarkStart w:id="9" w:name="_Toc18073184"/>
     <w:p>
       <w:pPr>
-        <w:pStyle w:val="Heading1"/>
-      </w:pPr>
-      <w:sdt>
-        <w:sdtPr>
-          <w:id w:val="1838117392"/>
-          <w:placeholder>
-            <w:docPart w:val="71027C4CD6AD4262B8C97B5234E60A56"/>
-          </w:placeholder>
-          <w:temporary/>
-          <w:showingPlcHdr/>
-        </w:sdtPr>
-        <w:sdtEndPr/>
-        <w:sdtContent>
-          <w:r>
-            <w:rPr>
-              <w:rStyle w:val="PlaceholderText"/>
-            </w:rPr>
-            <w:t>[hoofdstuktitel]</w:t>
-          </w:r>
-        </w:sdtContent>
-      </w:sdt>
-      <w:bookmarkEnd w:id="9"/>
+        <w:pStyle w:val="Kop1"/>
+      </w:pPr>
+      <w:bookmarkStart w:id="8" w:name="_Toc223702473"/>
+      <w:r>
+        <w:lastRenderedPageBreak/>
+        <w:t>Onderzoek</w:t>
+      </w:r>
+      <w:bookmarkEnd w:id="8"/>
     </w:p>
     <w:p>
       <w:pPr>
@@ -567,11 +788,10 @@
           <w:temporary/>
           <w:showingPlcHdr/>
         </w:sdtPr>
-        <w:sdtEndPr/>
         <w:sdtContent>
           <w:r>
             <w:rPr>
-              <w:rStyle w:val="PlaceholderText"/>
+              <w:rStyle w:val="Tekstvantijdelijkeaanduiding"/>
             </w:rPr>
             <w:t>[Klik hier als je tekst wilt invoeren.]</w:t>
           </w:r>
@@ -586,10 +806,10 @@
         </w:rPr>
       </w:pPr>
     </w:p>
-    <w:bookmarkStart w:id="10" w:name="_Toc18073185"/>
+    <w:bookmarkStart w:id="9" w:name="_Toc223702474"/>
     <w:p>
       <w:pPr>
-        <w:pStyle w:val="Heading2"/>
+        <w:pStyle w:val="Kop2"/>
       </w:pPr>
       <w:sdt>
         <w:sdtPr>
@@ -600,38 +820,114 @@
           <w:temporary/>
           <w:showingPlcHdr/>
         </w:sdtPr>
-        <w:sdtEndPr/>
         <w:sdtContent>
           <w:r>
             <w:rPr>
-              <w:rStyle w:val="PlaceholderText"/>
+              <w:rStyle w:val="Tekstvantijdelijkeaanduiding"/>
             </w:rPr>
             <w:t>[Paragraaftitel]</w:t>
           </w:r>
         </w:sdtContent>
       </w:sdt>
+      <w:bookmarkEnd w:id="9"/>
+    </w:p>
+    <w:p>
+      <w:pPr>
+        <w:pStyle w:val="Kop1"/>
+      </w:pPr>
+      <w:bookmarkStart w:id="10" w:name="_Toc223702475"/>
+      <w:r>
+        <w:t>Challenge</w:t>
+      </w:r>
       <w:bookmarkEnd w:id="10"/>
     </w:p>
     <w:p>
-      <w:sdt>
-        <w:sdtPr>
-          <w:id w:val="-1913077080"/>
-          <w:placeholder>
-            <w:docPart w:val="49AD912F06B34D36BCD3F2F78C167564"/>
-          </w:placeholder>
-          <w:temporary/>
-          <w:showingPlcHdr/>
-        </w:sdtPr>
-        <w:sdtEndPr/>
-        <w:sdtContent>
-          <w:r>
-            <w:rPr>
-              <w:rStyle w:val="PlaceholderText"/>
-            </w:rPr>
-            <w:t>[Klik hier als je tekst wilt invoeren.]</w:t>
-          </w:r>
-        </w:sdtContent>
-      </w:sdt>
+      <w:r>
+        <w:t>Voor deze opdracht heb ik gekozen voor Run-</w:t>
+      </w:r>
+      <w:proofErr w:type="spellStart"/>
+      <w:r>
+        <w:t>Length</w:t>
+      </w:r>
+      <w:proofErr w:type="spellEnd"/>
+      <w:r>
+        <w:t>-</w:t>
+      </w:r>
+      <w:proofErr w:type="spellStart"/>
+      <w:r>
+        <w:t>Encoding</w:t>
+      </w:r>
+      <w:proofErr w:type="spellEnd"/>
+      <w:r>
+        <w:t xml:space="preserve"> compressie (RLE-compressie). Dit </w:t>
+      </w:r>
+      <w:proofErr w:type="spellStart"/>
+      <w:r>
+        <w:t>algorithem</w:t>
+      </w:r>
+      <w:proofErr w:type="spellEnd"/>
+      <w:r>
+        <w:t xml:space="preserve"> comprimeert en decomprimeert herhalende data. RLE is geschikt om functionele concepten zoals </w:t>
+      </w:r>
+      <w:proofErr w:type="spellStart"/>
+      <w:r>
+        <w:t>patternmatching</w:t>
+      </w:r>
+      <w:proofErr w:type="spellEnd"/>
+      <w:r>
+        <w:t xml:space="preserve"> en </w:t>
+      </w:r>
+      <w:proofErr w:type="spellStart"/>
+      <w:r>
+        <w:t>recursion</w:t>
+      </w:r>
+      <w:proofErr w:type="spellEnd"/>
+      <w:r>
+        <w:t xml:space="preserve"> op toe te passen.</w:t>
+      </w:r>
+      <w:r>
+        <w:t xml:space="preserve"> Voor mijn implementatie wil ik RLE uitvoeren op </w:t>
+      </w:r>
+      <w:proofErr w:type="spellStart"/>
+      <w:r>
+        <w:t>teskstbestanden</w:t>
+      </w:r>
+      <w:proofErr w:type="spellEnd"/>
+      <w:r>
+        <w:t>.</w:t>
+      </w:r>
+    </w:p>
+    <w:p/>
+    <w:p/>
+    <w:p>
+      <w:pPr>
+        <w:pStyle w:val="Kop1"/>
+      </w:pPr>
+      <w:bookmarkStart w:id="11" w:name="_Toc223702476"/>
+      <w:r>
+        <w:t>Implementatie</w:t>
+      </w:r>
+      <w:bookmarkEnd w:id="11"/>
+    </w:p>
+    <w:p>
+      <w:pPr>
+        <w:pStyle w:val="Kop1"/>
+      </w:pPr>
+      <w:bookmarkStart w:id="12" w:name="_Toc223702477"/>
+      <w:r>
+        <w:t>reflectie</w:t>
+      </w:r>
+      <w:bookmarkEnd w:id="12"/>
+    </w:p>
+    <w:p>
+      <w:pPr>
+        <w:pStyle w:val="Kop1"/>
+      </w:pPr>
+      <w:bookmarkStart w:id="13" w:name="_Toc223702478"/>
+      <w:r>
+        <w:t>Conclusie</w:t>
+      </w:r>
+      <w:bookmarkEnd w:id="13"/>
     </w:p>
     <w:p>
       <w:pPr>
@@ -857,7 +1153,7 @@
 </file>
 
 <file path=word/endnotes.xml><?xml version="1.0" encoding="utf-8"?>
-<w:endnotes xmlns:wpc="http://schemas.microsoft.com/office/word/2010/wordprocessingCanvas" xmlns:cx="http://schemas.microsoft.com/office/drawing/2014/chartex" xmlns:cx1="http://schemas.microsoft.com/office/drawing/2015/9/8/chartex" xmlns:cx2="http://schemas.microsoft.com/office/drawing/2015/10/21/chartex" xmlns:cx3="http://schemas.microsoft.com/office/drawing/2016/5/9/chartex" xmlns:cx4="http://schemas.microsoft.com/office/drawing/2016/5/10/chartex" xmlns:cx5="http://schemas.microsoft.com/office/drawing/2016/5/11/chartex" xmlns:cx6="http://schemas.microsoft.com/office/drawing/2016/5/12/chartex" xmlns:cx7="http://schemas.microsoft.com/office/drawing/2016/5/13/chartex" xmlns:cx8="http://schemas.microsoft.com/office/drawing/2016/5/14/chartex" xmlns:mc="http://schemas.openxmlformats.org/markup-compatibility/2006" xmlns:aink="http://schemas.microsoft.com/office/drawing/2016/ink" xmlns:am3d="http://schemas.microsoft.com/office/drawing/2017/model3d" xmlns:o="urn:schemas-microsoft-com:office:office" xmlns:r="http://schemas.openxmlformats.org/officeDocument/2006/relationships" xmlns:m="http://schemas.openxmlformats.org/officeDocument/2006/math" xmlns:v="urn:schemas-microsoft-com:vml" xmlns:wp14="http://schemas.microsoft.com/office/word/2010/wordprocessingDrawing" xmlns:wp="http://schemas.openxmlformats.org/drawingml/2006/wordprocessingDrawing" xmlns:w10="urn:schemas-microsoft-com:office:word" xmlns:w="http://schemas.openxmlformats.org/wordprocessingml/2006/main" xmlns:w14="http://schemas.microsoft.com/office/word/2010/wordml" xmlns:w15="http://schemas.microsoft.com/office/word/2012/wordml" xmlns:w16cex="http://schemas.microsoft.com/office/word/2018/wordml/cex" xmlns:w16cid="http://schemas.microsoft.com/office/word/2016/wordml/cid" xmlns:w16="http://schemas.microsoft.com/office/word/2018/wordml" xmlns:w16sdtdh="http://schemas.microsoft.com/office/word/2020/wordml/sdtdatahash" xmlns:w16se="http://schemas.microsoft.com/office/word/2015/wordml/symex" xmlns:wpg="http://schemas.microsoft.com/office/word/2010/wordprocessingGroup" xmlns:wpi="http://schemas.microsoft.com/office/word/2010/wordprocessingInk" xmlns:wne="http://schemas.microsoft.com/office/word/2006/wordml" xmlns:wps="http://schemas.microsoft.com/office/word/2010/wordprocessingShape" mc:Ignorable="w14 w15 w16se w16cid w16 w16cex w16sdtdh wp14">
+<w:endnotes xmlns:wpc="http://schemas.microsoft.com/office/word/2010/wordprocessingCanvas" xmlns:cx="http://schemas.microsoft.com/office/drawing/2014/chartex" xmlns:cx1="http://schemas.microsoft.com/office/drawing/2015/9/8/chartex" xmlns:cx2="http://schemas.microsoft.com/office/drawing/2015/10/21/chartex" xmlns:cx3="http://schemas.microsoft.com/office/drawing/2016/5/9/chartex" xmlns:cx4="http://schemas.microsoft.com/office/drawing/2016/5/10/chartex" xmlns:cx5="http://schemas.microsoft.com/office/drawing/2016/5/11/chartex" xmlns:cx6="http://schemas.microsoft.com/office/drawing/2016/5/12/chartex" xmlns:cx7="http://schemas.microsoft.com/office/drawing/2016/5/13/chartex" xmlns:cx8="http://schemas.microsoft.com/office/drawing/2016/5/14/chartex" xmlns:mc="http://schemas.openxmlformats.org/markup-compatibility/2006" xmlns:aink="http://schemas.microsoft.com/office/drawing/2016/ink" xmlns:am3d="http://schemas.microsoft.com/office/drawing/2017/model3d" xmlns:o="urn:schemas-microsoft-com:office:office" xmlns:oel="http://schemas.microsoft.com/office/2019/extlst" xmlns:r="http://schemas.openxmlformats.org/officeDocument/2006/relationships" xmlns:m="http://schemas.openxmlformats.org/officeDocument/2006/math" xmlns:v="urn:schemas-microsoft-com:vml" xmlns:wp14="http://schemas.microsoft.com/office/word/2010/wordprocessingDrawing" xmlns:wp="http://schemas.openxmlformats.org/drawingml/2006/wordprocessingDrawing" xmlns:w10="urn:schemas-microsoft-com:office:word" xmlns:w="http://schemas.openxmlformats.org/wordprocessingml/2006/main" xmlns:w14="http://schemas.microsoft.com/office/word/2010/wordml" xmlns:w15="http://schemas.microsoft.com/office/word/2012/wordml" xmlns:w16cex="http://schemas.microsoft.com/office/word/2018/wordml/cex" xmlns:w16cid="http://schemas.microsoft.com/office/word/2016/wordml/cid" xmlns:w16="http://schemas.microsoft.com/office/word/2018/wordml" xmlns:w16du="http://schemas.microsoft.com/office/word/2023/wordml/word16du" xmlns:w16sdtdh="http://schemas.microsoft.com/office/word/2020/wordml/sdtdatahash" xmlns:w16sdtfl="http://schemas.microsoft.com/office/word/2024/wordml/sdtformatlock" xmlns:w16se="http://schemas.microsoft.com/office/word/2015/wordml/symex" xmlns:wpg="http://schemas.microsoft.com/office/word/2010/wordprocessingGroup" xmlns:wpi="http://schemas.microsoft.com/office/word/2010/wordprocessingInk" xmlns:wne="http://schemas.microsoft.com/office/word/2006/wordml" xmlns:wps="http://schemas.microsoft.com/office/word/2010/wordprocessingShape" mc:Ignorable="w14 w15 w16se w16cid w16 w16cex w16sdtdh w16sdtfl w16du wp14">
   <w:endnote w:type="separator" w:id="-1">
     <w:p>
       <w:pPr>
@@ -882,7 +1178,7 @@
 </file>
 
 <file path=word/footer1.xml><?xml version="1.0" encoding="utf-8"?>
-<w:ftr xmlns:wpc="http://schemas.microsoft.com/office/word/2010/wordprocessingCanvas" xmlns:cx="http://schemas.microsoft.com/office/drawing/2014/chartex" xmlns:cx1="http://schemas.microsoft.com/office/drawing/2015/9/8/chartex" xmlns:cx2="http://schemas.microsoft.com/office/drawing/2015/10/21/chartex" xmlns:cx3="http://schemas.microsoft.com/office/drawing/2016/5/9/chartex" xmlns:cx4="http://schemas.microsoft.com/office/drawing/2016/5/10/chartex" xmlns:cx5="http://schemas.microsoft.com/office/drawing/2016/5/11/chartex" xmlns:cx6="http://schemas.microsoft.com/office/drawing/2016/5/12/chartex" xmlns:cx7="http://schemas.microsoft.com/office/drawing/2016/5/13/chartex" xmlns:cx8="http://schemas.microsoft.com/office/drawing/2016/5/14/chartex" xmlns:mc="http://schemas.openxmlformats.org/markup-compatibility/2006" xmlns:aink="http://schemas.microsoft.com/office/drawing/2016/ink" xmlns:am3d="http://schemas.microsoft.com/office/drawing/2017/model3d" xmlns:o="urn:schemas-microsoft-com:office:office" xmlns:r="http://schemas.openxmlformats.org/officeDocument/2006/relationships" xmlns:m="http://schemas.openxmlformats.org/officeDocument/2006/math" xmlns:v="urn:schemas-microsoft-com:vml" xmlns:wp14="http://schemas.microsoft.com/office/word/2010/wordprocessingDrawing" xmlns:wp="http://schemas.openxmlformats.org/drawingml/2006/wordprocessingDrawing" xmlns:w10="urn:schemas-microsoft-com:office:word" xmlns:w="http://schemas.openxmlformats.org/wordprocessingml/2006/main" xmlns:w14="http://schemas.microsoft.com/office/word/2010/wordml" xmlns:w15="http://schemas.microsoft.com/office/word/2012/wordml" xmlns:w16cex="http://schemas.microsoft.com/office/word/2018/wordml/cex" xmlns:w16cid="http://schemas.microsoft.com/office/word/2016/wordml/cid" xmlns:w16="http://schemas.microsoft.com/office/word/2018/wordml" xmlns:w16sdtdh="http://schemas.microsoft.com/office/word/2020/wordml/sdtdatahash" xmlns:w16se="http://schemas.microsoft.com/office/word/2015/wordml/symex" xmlns:wpg="http://schemas.microsoft.com/office/word/2010/wordprocessingGroup" xmlns:wpi="http://schemas.microsoft.com/office/word/2010/wordprocessingInk" xmlns:wne="http://schemas.microsoft.com/office/word/2006/wordml" xmlns:wps="http://schemas.microsoft.com/office/word/2010/wordprocessingShape" mc:Ignorable="w14 w15 w16se w16cid w16 w16cex w16sdtdh wp14">
+<w:ftr xmlns:wpc="http://schemas.microsoft.com/office/word/2010/wordprocessingCanvas" xmlns:cx="http://schemas.microsoft.com/office/drawing/2014/chartex" xmlns:cx1="http://schemas.microsoft.com/office/drawing/2015/9/8/chartex" xmlns:cx2="http://schemas.microsoft.com/office/drawing/2015/10/21/chartex" xmlns:cx3="http://schemas.microsoft.com/office/drawing/2016/5/9/chartex" xmlns:cx4="http://schemas.microsoft.com/office/drawing/2016/5/10/chartex" xmlns:cx5="http://schemas.microsoft.com/office/drawing/2016/5/11/chartex" xmlns:cx6="http://schemas.microsoft.com/office/drawing/2016/5/12/chartex" xmlns:cx7="http://schemas.microsoft.com/office/drawing/2016/5/13/chartex" xmlns:cx8="http://schemas.microsoft.com/office/drawing/2016/5/14/chartex" xmlns:mc="http://schemas.openxmlformats.org/markup-compatibility/2006" xmlns:aink="http://schemas.microsoft.com/office/drawing/2016/ink" xmlns:am3d="http://schemas.microsoft.com/office/drawing/2017/model3d" xmlns:o="urn:schemas-microsoft-com:office:office" xmlns:oel="http://schemas.microsoft.com/office/2019/extlst" xmlns:r="http://schemas.openxmlformats.org/officeDocument/2006/relationships" xmlns:m="http://schemas.openxmlformats.org/officeDocument/2006/math" xmlns:v="urn:schemas-microsoft-com:vml" xmlns:wp14="http://schemas.microsoft.com/office/word/2010/wordprocessingDrawing" xmlns:wp="http://schemas.openxmlformats.org/drawingml/2006/wordprocessingDrawing" xmlns:w10="urn:schemas-microsoft-com:office:word" xmlns:w="http://schemas.openxmlformats.org/wordprocessingml/2006/main" xmlns:w14="http://schemas.microsoft.com/office/word/2010/wordml" xmlns:w15="http://schemas.microsoft.com/office/word/2012/wordml" xmlns:w16cex="http://schemas.microsoft.com/office/word/2018/wordml/cex" xmlns:w16cid="http://schemas.microsoft.com/office/word/2016/wordml/cid" xmlns:w16="http://schemas.microsoft.com/office/word/2018/wordml" xmlns:w16du="http://schemas.microsoft.com/office/word/2023/wordml/word16du" xmlns:w16sdtdh="http://schemas.microsoft.com/office/word/2020/wordml/sdtdatahash" xmlns:w16sdtfl="http://schemas.microsoft.com/office/word/2024/wordml/sdtformatlock" xmlns:w16se="http://schemas.microsoft.com/office/word/2015/wordml/symex" xmlns:wpg="http://schemas.microsoft.com/office/word/2010/wordprocessingGroup" xmlns:wpi="http://schemas.microsoft.com/office/word/2010/wordprocessingInk" xmlns:wne="http://schemas.microsoft.com/office/word/2006/wordml" xmlns:wps="http://schemas.microsoft.com/office/word/2010/wordprocessingShape" mc:Ignorable="w14 w15 w16se w16cid w16 w16cex w16sdtdh w16sdtfl w16du wp14">
   <w:p>
     <w:pPr>
       <w:spacing w:after="160" w:line="259" w:lineRule="auto"/>
@@ -897,10 +1193,10 @@
 </file>
 
 <file path=word/footer2.xml><?xml version="1.0" encoding="utf-8"?>
-<w:ftr xmlns:wpc="http://schemas.microsoft.com/office/word/2010/wordprocessingCanvas" xmlns:cx="http://schemas.microsoft.com/office/drawing/2014/chartex" xmlns:cx1="http://schemas.microsoft.com/office/drawing/2015/9/8/chartex" xmlns:cx2="http://schemas.microsoft.com/office/drawing/2015/10/21/chartex" xmlns:cx3="http://schemas.microsoft.com/office/drawing/2016/5/9/chartex" xmlns:cx4="http://schemas.microsoft.com/office/drawing/2016/5/10/chartex" xmlns:cx5="http://schemas.microsoft.com/office/drawing/2016/5/11/chartex" xmlns:cx6="http://schemas.microsoft.com/office/drawing/2016/5/12/chartex" xmlns:cx7="http://schemas.microsoft.com/office/drawing/2016/5/13/chartex" xmlns:cx8="http://schemas.microsoft.com/office/drawing/2016/5/14/chartex" xmlns:mc="http://schemas.openxmlformats.org/markup-compatibility/2006" xmlns:aink="http://schemas.microsoft.com/office/drawing/2016/ink" xmlns:am3d="http://schemas.microsoft.com/office/drawing/2017/model3d" xmlns:o="urn:schemas-microsoft-com:office:office" xmlns:r="http://schemas.openxmlformats.org/officeDocument/2006/relationships" xmlns:m="http://schemas.openxmlformats.org/officeDocument/2006/math" xmlns:v="urn:schemas-microsoft-com:vml" xmlns:wp14="http://schemas.microsoft.com/office/word/2010/wordprocessingDrawing" xmlns:wp="http://schemas.openxmlformats.org/drawingml/2006/wordprocessingDrawing" xmlns:w10="urn:schemas-microsoft-com:office:word" xmlns:w="http://schemas.openxmlformats.org/wordprocessingml/2006/main" xmlns:w14="http://schemas.microsoft.com/office/word/2010/wordml" xmlns:w15="http://schemas.microsoft.com/office/word/2012/wordml" xmlns:w16cex="http://schemas.microsoft.com/office/word/2018/wordml/cex" xmlns:w16cid="http://schemas.microsoft.com/office/word/2016/wordml/cid" xmlns:w16="http://schemas.microsoft.com/office/word/2018/wordml" xmlns:w16sdtdh="http://schemas.microsoft.com/office/word/2020/wordml/sdtdatahash" xmlns:w16se="http://schemas.microsoft.com/office/word/2015/wordml/symex" xmlns:wpg="http://schemas.microsoft.com/office/word/2010/wordprocessingGroup" xmlns:wpi="http://schemas.microsoft.com/office/word/2010/wordprocessingInk" xmlns:wne="http://schemas.microsoft.com/office/word/2006/wordml" xmlns:wps="http://schemas.microsoft.com/office/word/2010/wordprocessingShape" mc:Ignorable="w14 w15 w16se w16cid w16 w16cex w16sdtdh wp14">
+<w:ftr xmlns:wpc="http://schemas.microsoft.com/office/word/2010/wordprocessingCanvas" xmlns:cx="http://schemas.microsoft.com/office/drawing/2014/chartex" xmlns:cx1="http://schemas.microsoft.com/office/drawing/2015/9/8/chartex" xmlns:cx2="http://schemas.microsoft.com/office/drawing/2015/10/21/chartex" xmlns:cx3="http://schemas.microsoft.com/office/drawing/2016/5/9/chartex" xmlns:cx4="http://schemas.microsoft.com/office/drawing/2016/5/10/chartex" xmlns:cx5="http://schemas.microsoft.com/office/drawing/2016/5/11/chartex" xmlns:cx6="http://schemas.microsoft.com/office/drawing/2016/5/12/chartex" xmlns:cx7="http://schemas.microsoft.com/office/drawing/2016/5/13/chartex" xmlns:cx8="http://schemas.microsoft.com/office/drawing/2016/5/14/chartex" xmlns:mc="http://schemas.openxmlformats.org/markup-compatibility/2006" xmlns:aink="http://schemas.microsoft.com/office/drawing/2016/ink" xmlns:am3d="http://schemas.microsoft.com/office/drawing/2017/model3d" xmlns:o="urn:schemas-microsoft-com:office:office" xmlns:oel="http://schemas.microsoft.com/office/2019/extlst" xmlns:r="http://schemas.openxmlformats.org/officeDocument/2006/relationships" xmlns:m="http://schemas.openxmlformats.org/officeDocument/2006/math" xmlns:v="urn:schemas-microsoft-com:vml" xmlns:wp14="http://schemas.microsoft.com/office/word/2010/wordprocessingDrawing" xmlns:wp="http://schemas.openxmlformats.org/drawingml/2006/wordprocessingDrawing" xmlns:w10="urn:schemas-microsoft-com:office:word" xmlns:w="http://schemas.openxmlformats.org/wordprocessingml/2006/main" xmlns:w14="http://schemas.microsoft.com/office/word/2010/wordml" xmlns:w15="http://schemas.microsoft.com/office/word/2012/wordml" xmlns:w16cex="http://schemas.microsoft.com/office/word/2018/wordml/cex" xmlns:w16cid="http://schemas.microsoft.com/office/word/2016/wordml/cid" xmlns:w16="http://schemas.microsoft.com/office/word/2018/wordml" xmlns:w16du="http://schemas.microsoft.com/office/word/2023/wordml/word16du" xmlns:w16sdtdh="http://schemas.microsoft.com/office/word/2020/wordml/sdtdatahash" xmlns:w16sdtfl="http://schemas.microsoft.com/office/word/2024/wordml/sdtformatlock" xmlns:w16se="http://schemas.microsoft.com/office/word/2015/wordml/symex" xmlns:wpg="http://schemas.microsoft.com/office/word/2010/wordprocessingGroup" xmlns:wpi="http://schemas.microsoft.com/office/word/2010/wordprocessingInk" xmlns:wne="http://schemas.microsoft.com/office/word/2006/wordml" xmlns:wps="http://schemas.microsoft.com/office/word/2010/wordprocessingShape" mc:Ignorable="w14 w15 w16se w16cid w16 w16cex w16sdtdh w16sdtfl w16du wp14">
   <w:p>
     <w:pPr>
-      <w:pStyle w:val="Footer"/>
+      <w:pStyle w:val="Voettekst"/>
       <w:tabs>
         <w:tab w:val="clear" w:pos="9185"/>
         <w:tab w:val="right" w:pos="9184"/>
@@ -978,10 +1274,10 @@
 </file>
 
 <file path=word/footer3.xml><?xml version="1.0" encoding="utf-8"?>
-<w:ftr xmlns:wpc="http://schemas.microsoft.com/office/word/2010/wordprocessingCanvas" xmlns:cx="http://schemas.microsoft.com/office/drawing/2014/chartex" xmlns:cx1="http://schemas.microsoft.com/office/drawing/2015/9/8/chartex" xmlns:cx2="http://schemas.microsoft.com/office/drawing/2015/10/21/chartex" xmlns:cx3="http://schemas.microsoft.com/office/drawing/2016/5/9/chartex" xmlns:cx4="http://schemas.microsoft.com/office/drawing/2016/5/10/chartex" xmlns:cx5="http://schemas.microsoft.com/office/drawing/2016/5/11/chartex" xmlns:cx6="http://schemas.microsoft.com/office/drawing/2016/5/12/chartex" xmlns:cx7="http://schemas.microsoft.com/office/drawing/2016/5/13/chartex" xmlns:cx8="http://schemas.microsoft.com/office/drawing/2016/5/14/chartex" xmlns:mc="http://schemas.openxmlformats.org/markup-compatibility/2006" xmlns:aink="http://schemas.microsoft.com/office/drawing/2016/ink" xmlns:am3d="http://schemas.microsoft.com/office/drawing/2017/model3d" xmlns:o="urn:schemas-microsoft-com:office:office" xmlns:r="http://schemas.openxmlformats.org/officeDocument/2006/relationships" xmlns:m="http://schemas.openxmlformats.org/officeDocument/2006/math" xmlns:v="urn:schemas-microsoft-com:vml" xmlns:wp14="http://schemas.microsoft.com/office/word/2010/wordprocessingDrawing" xmlns:wp="http://schemas.openxmlformats.org/drawingml/2006/wordprocessingDrawing" xmlns:w10="urn:schemas-microsoft-com:office:word" xmlns:w="http://schemas.openxmlformats.org/wordprocessingml/2006/main" xmlns:w14="http://schemas.microsoft.com/office/word/2010/wordml" xmlns:w15="http://schemas.microsoft.com/office/word/2012/wordml" xmlns:w16cex="http://schemas.microsoft.com/office/word/2018/wordml/cex" xmlns:w16cid="http://schemas.microsoft.com/office/word/2016/wordml/cid" xmlns:w16="http://schemas.microsoft.com/office/word/2018/wordml" xmlns:w16sdtdh="http://schemas.microsoft.com/office/word/2020/wordml/sdtdatahash" xmlns:w16se="http://schemas.microsoft.com/office/word/2015/wordml/symex" xmlns:wpg="http://schemas.microsoft.com/office/word/2010/wordprocessingGroup" xmlns:wpi="http://schemas.microsoft.com/office/word/2010/wordprocessingInk" xmlns:wne="http://schemas.microsoft.com/office/word/2006/wordml" xmlns:wps="http://schemas.microsoft.com/office/word/2010/wordprocessingShape" mc:Ignorable="w14 w15 w16se w16cid w16 w16cex w16sdtdh wp14">
+<w:ftr xmlns:wpc="http://schemas.microsoft.com/office/word/2010/wordprocessingCanvas" xmlns:cx="http://schemas.microsoft.com/office/drawing/2014/chartex" xmlns:cx1="http://schemas.microsoft.com/office/drawing/2015/9/8/chartex" xmlns:cx2="http://schemas.microsoft.com/office/drawing/2015/10/21/chartex" xmlns:cx3="http://schemas.microsoft.com/office/drawing/2016/5/9/chartex" xmlns:cx4="http://schemas.microsoft.com/office/drawing/2016/5/10/chartex" xmlns:cx5="http://schemas.microsoft.com/office/drawing/2016/5/11/chartex" xmlns:cx6="http://schemas.microsoft.com/office/drawing/2016/5/12/chartex" xmlns:cx7="http://schemas.microsoft.com/office/drawing/2016/5/13/chartex" xmlns:cx8="http://schemas.microsoft.com/office/drawing/2016/5/14/chartex" xmlns:mc="http://schemas.openxmlformats.org/markup-compatibility/2006" xmlns:aink="http://schemas.microsoft.com/office/drawing/2016/ink" xmlns:am3d="http://schemas.microsoft.com/office/drawing/2017/model3d" xmlns:o="urn:schemas-microsoft-com:office:office" xmlns:oel="http://schemas.microsoft.com/office/2019/extlst" xmlns:r="http://schemas.openxmlformats.org/officeDocument/2006/relationships" xmlns:m="http://schemas.openxmlformats.org/officeDocument/2006/math" xmlns:v="urn:schemas-microsoft-com:vml" xmlns:wp14="http://schemas.microsoft.com/office/word/2010/wordprocessingDrawing" xmlns:wp="http://schemas.openxmlformats.org/drawingml/2006/wordprocessingDrawing" xmlns:w10="urn:schemas-microsoft-com:office:word" xmlns:w="http://schemas.openxmlformats.org/wordprocessingml/2006/main" xmlns:w14="http://schemas.microsoft.com/office/word/2010/wordml" xmlns:w15="http://schemas.microsoft.com/office/word/2012/wordml" xmlns:w16cex="http://schemas.microsoft.com/office/word/2018/wordml/cex" xmlns:w16cid="http://schemas.microsoft.com/office/word/2016/wordml/cid" xmlns:w16="http://schemas.microsoft.com/office/word/2018/wordml" xmlns:w16du="http://schemas.microsoft.com/office/word/2023/wordml/word16du" xmlns:w16sdtdh="http://schemas.microsoft.com/office/word/2020/wordml/sdtdatahash" xmlns:w16sdtfl="http://schemas.microsoft.com/office/word/2024/wordml/sdtformatlock" xmlns:w16se="http://schemas.microsoft.com/office/word/2015/wordml/symex" xmlns:wpg="http://schemas.microsoft.com/office/word/2010/wordprocessingGroup" xmlns:wpi="http://schemas.microsoft.com/office/word/2010/wordprocessingInk" xmlns:wne="http://schemas.microsoft.com/office/word/2006/wordml" xmlns:wps="http://schemas.microsoft.com/office/word/2010/wordprocessingShape" mc:Ignorable="w14 w15 w16se w16cid w16 w16cex w16sdtdh w16sdtfl w16du wp14">
   <w:p>
     <w:pPr>
-      <w:pStyle w:val="Footer"/>
+      <w:pStyle w:val="Voettekst"/>
     </w:pPr>
     <w:r>
       <w:rPr>
@@ -1055,7 +1351,7 @@
 </file>
 
 <file path=word/footer4.xml><?xml version="1.0" encoding="utf-8"?>
-<w:ftr xmlns:wpc="http://schemas.microsoft.com/office/word/2010/wordprocessingCanvas" xmlns:cx="http://schemas.microsoft.com/office/drawing/2014/chartex" xmlns:cx1="http://schemas.microsoft.com/office/drawing/2015/9/8/chartex" xmlns:cx2="http://schemas.microsoft.com/office/drawing/2015/10/21/chartex" xmlns:cx3="http://schemas.microsoft.com/office/drawing/2016/5/9/chartex" xmlns:cx4="http://schemas.microsoft.com/office/drawing/2016/5/10/chartex" xmlns:cx5="http://schemas.microsoft.com/office/drawing/2016/5/11/chartex" xmlns:cx6="http://schemas.microsoft.com/office/drawing/2016/5/12/chartex" xmlns:cx7="http://schemas.microsoft.com/office/drawing/2016/5/13/chartex" xmlns:cx8="http://schemas.microsoft.com/office/drawing/2016/5/14/chartex" xmlns:mc="http://schemas.openxmlformats.org/markup-compatibility/2006" xmlns:aink="http://schemas.microsoft.com/office/drawing/2016/ink" xmlns:am3d="http://schemas.microsoft.com/office/drawing/2017/model3d" xmlns:o="urn:schemas-microsoft-com:office:office" xmlns:r="http://schemas.openxmlformats.org/officeDocument/2006/relationships" xmlns:m="http://schemas.openxmlformats.org/officeDocument/2006/math" xmlns:v="urn:schemas-microsoft-com:vml" xmlns:wp14="http://schemas.microsoft.com/office/word/2010/wordprocessingDrawing" xmlns:wp="http://schemas.openxmlformats.org/drawingml/2006/wordprocessingDrawing" xmlns:w10="urn:schemas-microsoft-com:office:word" xmlns:w="http://schemas.openxmlformats.org/wordprocessingml/2006/main" xmlns:w14="http://schemas.microsoft.com/office/word/2010/wordml" xmlns:w15="http://schemas.microsoft.com/office/word/2012/wordml" xmlns:w16cex="http://schemas.microsoft.com/office/word/2018/wordml/cex" xmlns:w16cid="http://schemas.microsoft.com/office/word/2016/wordml/cid" xmlns:w16="http://schemas.microsoft.com/office/word/2018/wordml" xmlns:w16sdtdh="http://schemas.microsoft.com/office/word/2020/wordml/sdtdatahash" xmlns:w16se="http://schemas.microsoft.com/office/word/2015/wordml/symex" xmlns:wpg="http://schemas.microsoft.com/office/word/2010/wordprocessingGroup" xmlns:wpi="http://schemas.microsoft.com/office/word/2010/wordprocessingInk" xmlns:wne="http://schemas.microsoft.com/office/word/2006/wordml" xmlns:wps="http://schemas.microsoft.com/office/word/2010/wordprocessingShape" mc:Ignorable="w14 w15 w16se w16cid w16 w16cex w16sdtdh wp14">
+<w:ftr xmlns:wpc="http://schemas.microsoft.com/office/word/2010/wordprocessingCanvas" xmlns:cx="http://schemas.microsoft.com/office/drawing/2014/chartex" xmlns:cx1="http://schemas.microsoft.com/office/drawing/2015/9/8/chartex" xmlns:cx2="http://schemas.microsoft.com/office/drawing/2015/10/21/chartex" xmlns:cx3="http://schemas.microsoft.com/office/drawing/2016/5/9/chartex" xmlns:cx4="http://schemas.microsoft.com/office/drawing/2016/5/10/chartex" xmlns:cx5="http://schemas.microsoft.com/office/drawing/2016/5/11/chartex" xmlns:cx6="http://schemas.microsoft.com/office/drawing/2016/5/12/chartex" xmlns:cx7="http://schemas.microsoft.com/office/drawing/2016/5/13/chartex" xmlns:cx8="http://schemas.microsoft.com/office/drawing/2016/5/14/chartex" xmlns:mc="http://schemas.openxmlformats.org/markup-compatibility/2006" xmlns:aink="http://schemas.microsoft.com/office/drawing/2016/ink" xmlns:am3d="http://schemas.microsoft.com/office/drawing/2017/model3d" xmlns:o="urn:schemas-microsoft-com:office:office" xmlns:oel="http://schemas.microsoft.com/office/2019/extlst" xmlns:r="http://schemas.openxmlformats.org/officeDocument/2006/relationships" xmlns:m="http://schemas.openxmlformats.org/officeDocument/2006/math" xmlns:v="urn:schemas-microsoft-com:vml" xmlns:wp14="http://schemas.microsoft.com/office/word/2010/wordprocessingDrawing" xmlns:wp="http://schemas.openxmlformats.org/drawingml/2006/wordprocessingDrawing" xmlns:w10="urn:schemas-microsoft-com:office:word" xmlns:w="http://schemas.openxmlformats.org/wordprocessingml/2006/main" xmlns:w14="http://schemas.microsoft.com/office/word/2010/wordml" xmlns:w15="http://schemas.microsoft.com/office/word/2012/wordml" xmlns:w16cex="http://schemas.microsoft.com/office/word/2018/wordml/cex" xmlns:w16cid="http://schemas.microsoft.com/office/word/2016/wordml/cid" xmlns:w16="http://schemas.microsoft.com/office/word/2018/wordml" xmlns:w16du="http://schemas.microsoft.com/office/word/2023/wordml/word16du" xmlns:w16sdtdh="http://schemas.microsoft.com/office/word/2020/wordml/sdtdatahash" xmlns:w16sdtfl="http://schemas.microsoft.com/office/word/2024/wordml/sdtformatlock" xmlns:w16se="http://schemas.microsoft.com/office/word/2015/wordml/symex" xmlns:wpg="http://schemas.microsoft.com/office/word/2010/wordprocessingGroup" xmlns:wpi="http://schemas.microsoft.com/office/word/2010/wordprocessingInk" xmlns:wne="http://schemas.microsoft.com/office/word/2006/wordml" xmlns:wps="http://schemas.microsoft.com/office/word/2010/wordprocessingShape" mc:Ignorable="w14 w15 w16se w16cid w16 w16cex w16sdtdh w16sdtfl w16du wp14">
   <w:sdt>
     <w:sdtPr>
       <w:rPr>
@@ -1068,11 +1364,10 @@
         <w:docPartUnique/>
       </w:docPartObj>
     </w:sdtPr>
-    <w:sdtEndPr/>
     <w:sdtContent>
       <w:p>
         <w:pPr>
-          <w:pStyle w:val="Footer"/>
+          <w:pStyle w:val="Voettekst"/>
           <w:rPr>
             <w:rFonts w:ascii="Arial" w:hAnsi="Arial" w:cs="Arial"/>
             <w:szCs w:val="16"/>
@@ -1136,7 +1431,7 @@
                           <w:txbxContent>
                             <w:p>
                               <w:pPr>
-                                <w:pStyle w:val="Footer"/>
+                                <w:pStyle w:val="Voettekst"/>
                                 <w:jc w:val="right"/>
                               </w:pPr>
                               <w:r>
@@ -1160,27 +1455,14 @@
                               <w:r>
                                 <w:t>/</w:t>
                               </w:r>
-                              <w:r>
-                                <w:fldChar w:fldCharType="begin"/>
-                              </w:r>
-                              <w:r>
-                                <w:instrText xml:space="preserve"> NUMPAGES   \* MERGEFORMAT </w:instrText>
-                              </w:r>
-                              <w:r>
-                                <w:fldChar w:fldCharType="separate"/>
-                              </w:r>
-                              <w:r>
-                                <w:rPr>
-                                  <w:noProof/>
-                                </w:rPr>
-                                <w:t>5</w:t>
-                              </w:r>
-                              <w:r>
-                                <w:rPr>
-                                  <w:noProof/>
-                                </w:rPr>
-                                <w:fldChar w:fldCharType="end"/>
-                              </w:r>
+                              <w:fldSimple w:instr=" NUMPAGES   \* MERGEFORMAT ">
+                                <w:r>
+                                  <w:rPr>
+                                    <w:noProof/>
+                                  </w:rPr>
+                                  <w:t>5</w:t>
+                                </w:r>
+                              </w:fldSimple>
                             </w:p>
                           </w:txbxContent>
                         </wps:txbx>
@@ -1208,7 +1490,7 @@
                   <v:stroke joinstyle="miter"/>
                   <v:path gradientshapeok="t" o:connecttype="rect"/>
                 </v:shapetype>
-                <v:shape id="Tekstvak 19" o:spid="_x0000_s1026" type="#_x0000_t202" style="position:absolute;margin-left:29pt;margin-top:18.2pt;width:80.2pt;height:9.65pt;z-index:251674624;visibility:visible;mso-wrap-style:square;mso-width-percent:0;mso-height-percent:0;mso-wrap-distance-left:9pt;mso-wrap-distance-top:0;mso-wrap-distance-right:9pt;mso-wrap-distance-bottom:0;mso-position-horizontal:right;mso-position-horizontal-relative:margin;mso-position-vertical:absolute;mso-position-vertical-relative:text;mso-width-percent:0;mso-height-percent:0;mso-width-relative:margin;mso-height-relative:margin;v-text-anchor:top" o:gfxdata="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" filled="f" stroked="f" strokeweight=".5pt">
+                <v:shape id="Tekstvak 19" o:spid="_x0000_s1026" type="#_x0000_t202" style="position:absolute;margin-left:29pt;margin-top:18.2pt;width:80.2pt;height:9.65pt;z-index:251674624;visibility:visible;mso-wrap-style:square;mso-width-percent:0;mso-height-percent:0;mso-wrap-distance-left:9pt;mso-wrap-distance-top:0;mso-wrap-distance-right:9pt;mso-wrap-distance-bottom:0;mso-position-horizontal:right;mso-position-horizontal-relative:margin;mso-position-vertical:absolute;mso-position-vertical-relative:text;mso-width-percent:0;mso-height-percent:0;mso-width-relative:margin;mso-height-relative:margin;v-text-anchor:top" o:gfxdata="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" filled="f" stroked="f" strokeweight=".5pt">
                   <v:textbox inset="0,0,0,0">
                     <w:txbxContent>
                       <w:p>
@@ -1268,11 +1550,10 @@
             <w:docPartUnique/>
           </w:docPartObj>
         </w:sdtPr>
-        <w:sdtEndPr/>
         <w:sdtContent>
           <w:p>
             <w:pPr>
-              <w:pStyle w:val="Footer"/>
+              <w:pStyle w:val="Voettekst"/>
               <w:tabs>
                 <w:tab w:val="clear" w:pos="9185"/>
                 <w:tab w:val="right" w:pos="9184"/>
@@ -1285,7 +1566,7 @@
           </w:p>
           <w:p>
             <w:pPr>
-              <w:pStyle w:val="Footer"/>
+              <w:pStyle w:val="Voettekst"/>
               <w:rPr>
                 <w:rFonts w:ascii="Arial" w:hAnsi="Arial" w:cs="Arial"/>
                 <w:szCs w:val="16"/>
@@ -1304,13 +1585,12 @@
                 <w:dataBinding w:prefixMappings="xmlns:ns0='http://purl.org/dc/elements/1.1/' xmlns:ns1='http://schemas.openxmlformats.org/package/2006/metadata/core-properties' " w:xpath="/ns1:coreProperties[1]/ns0:subject[1]" w:storeItemID="{6C3C8BC8-F283-45AE-878A-BAB7291924A1}"/>
                 <w:text/>
               </w:sdtPr>
-              <w:sdtEndPr/>
               <w:sdtContent>
                 <w:r>
                   <w:rPr>
                     <w:caps/>
                   </w:rPr>
-                  <w:t>titel van document</w:t>
+                  <w:t>Opdracht Functioneel Paradigma</w:t>
                 </w:r>
               </w:sdtContent>
             </w:sdt>
@@ -1323,7 +1603,7 @@
 </file>
 
 <file path=word/footnotes.xml><?xml version="1.0" encoding="utf-8"?>
-<w:footnotes xmlns:wpc="http://schemas.microsoft.com/office/word/2010/wordprocessingCanvas" xmlns:cx="http://schemas.microsoft.com/office/drawing/2014/chartex" xmlns:cx1="http://schemas.microsoft.com/office/drawing/2015/9/8/chartex" xmlns:cx2="http://schemas.microsoft.com/office/drawing/2015/10/21/chartex" xmlns:cx3="http://schemas.microsoft.com/office/drawing/2016/5/9/chartex" xmlns:cx4="http://schemas.microsoft.com/office/drawing/2016/5/10/chartex" xmlns:cx5="http://schemas.microsoft.com/office/drawing/2016/5/11/chartex" xmlns:cx6="http://schemas.microsoft.com/office/drawing/2016/5/12/chartex" xmlns:cx7="http://schemas.microsoft.com/office/drawing/2016/5/13/chartex" xmlns:cx8="http://schemas.microsoft.com/office/drawing/2016/5/14/chartex" xmlns:mc="http://schemas.openxmlformats.org/markup-compatibility/2006" xmlns:aink="http://schemas.microsoft.com/office/drawing/2016/ink" xmlns:am3d="http://schemas.microsoft.com/office/drawing/2017/model3d" xmlns:o="urn:schemas-microsoft-com:office:office" xmlns:r="http://schemas.openxmlformats.org/officeDocument/2006/relationships" xmlns:m="http://schemas.openxmlformats.org/officeDocument/2006/math" xmlns:v="urn:schemas-microsoft-com:vml" xmlns:wp14="http://schemas.microsoft.com/office/word/2010/wordprocessingDrawing" xmlns:wp="http://schemas.openxmlformats.org/drawingml/2006/wordprocessingDrawing" xmlns:w10="urn:schemas-microsoft-com:office:word" xmlns:w="http://schemas.openxmlformats.org/wordprocessingml/2006/main" xmlns:w14="http://schemas.microsoft.com/office/word/2010/wordml" xmlns:w15="http://schemas.microsoft.com/office/word/2012/wordml" xmlns:w16cex="http://schemas.microsoft.com/office/word/2018/wordml/cex" xmlns:w16cid="http://schemas.microsoft.com/office/word/2016/wordml/cid" xmlns:w16="http://schemas.microsoft.com/office/word/2018/wordml" xmlns:w16sdtdh="http://schemas.microsoft.com/office/word/2020/wordml/sdtdatahash" xmlns:w16se="http://schemas.microsoft.com/office/word/2015/wordml/symex" xmlns:wpg="http://schemas.microsoft.com/office/word/2010/wordprocessingGroup" xmlns:wpi="http://schemas.microsoft.com/office/word/2010/wordprocessingInk" xmlns:wne="http://schemas.microsoft.com/office/word/2006/wordml" xmlns:wps="http://schemas.microsoft.com/office/word/2010/wordprocessingShape" mc:Ignorable="w14 w15 w16se w16cid w16 w16cex w16sdtdh wp14">
+<w:footnotes xmlns:wpc="http://schemas.microsoft.com/office/word/2010/wordprocessingCanvas" xmlns:cx="http://schemas.microsoft.com/office/drawing/2014/chartex" xmlns:cx1="http://schemas.microsoft.com/office/drawing/2015/9/8/chartex" xmlns:cx2="http://schemas.microsoft.com/office/drawing/2015/10/21/chartex" xmlns:cx3="http://schemas.microsoft.com/office/drawing/2016/5/9/chartex" xmlns:cx4="http://schemas.microsoft.com/office/drawing/2016/5/10/chartex" xmlns:cx5="http://schemas.microsoft.com/office/drawing/2016/5/11/chartex" xmlns:cx6="http://schemas.microsoft.com/office/drawing/2016/5/12/chartex" xmlns:cx7="http://schemas.microsoft.com/office/drawing/2016/5/13/chartex" xmlns:cx8="http://schemas.microsoft.com/office/drawing/2016/5/14/chartex" xmlns:mc="http://schemas.openxmlformats.org/markup-compatibility/2006" xmlns:aink="http://schemas.microsoft.com/office/drawing/2016/ink" xmlns:am3d="http://schemas.microsoft.com/office/drawing/2017/model3d" xmlns:o="urn:schemas-microsoft-com:office:office" xmlns:oel="http://schemas.microsoft.com/office/2019/extlst" xmlns:r="http://schemas.openxmlformats.org/officeDocument/2006/relationships" xmlns:m="http://schemas.openxmlformats.org/officeDocument/2006/math" xmlns:v="urn:schemas-microsoft-com:vml" xmlns:wp14="http://schemas.microsoft.com/office/word/2010/wordprocessingDrawing" xmlns:wp="http://schemas.openxmlformats.org/drawingml/2006/wordprocessingDrawing" xmlns:w10="urn:schemas-microsoft-com:office:word" xmlns:w="http://schemas.openxmlformats.org/wordprocessingml/2006/main" xmlns:w14="http://schemas.microsoft.com/office/word/2010/wordml" xmlns:w15="http://schemas.microsoft.com/office/word/2012/wordml" xmlns:w16cex="http://schemas.microsoft.com/office/word/2018/wordml/cex" xmlns:w16cid="http://schemas.microsoft.com/office/word/2016/wordml/cid" xmlns:w16="http://schemas.microsoft.com/office/word/2018/wordml" xmlns:w16du="http://schemas.microsoft.com/office/word/2023/wordml/word16du" xmlns:w16sdtdh="http://schemas.microsoft.com/office/word/2020/wordml/sdtdatahash" xmlns:w16sdtfl="http://schemas.microsoft.com/office/word/2024/wordml/sdtformatlock" xmlns:w16se="http://schemas.microsoft.com/office/word/2015/wordml/symex" xmlns:wpg="http://schemas.microsoft.com/office/word/2010/wordprocessingGroup" xmlns:wpi="http://schemas.microsoft.com/office/word/2010/wordprocessingInk" xmlns:wne="http://schemas.microsoft.com/office/word/2006/wordml" xmlns:wps="http://schemas.microsoft.com/office/word/2010/wordprocessingShape" mc:Ignorable="w14 w15 w16se w16cid w16 w16cex w16sdtdh w16sdtfl w16du wp14">
   <w:footnote w:type="separator" w:id="-1">
     <w:p>
       <w:pPr>
@@ -1348,7 +1628,7 @@
 </file>
 
 <file path=word/header1.xml><?xml version="1.0" encoding="utf-8"?>
-<w:hdr xmlns:wpc="http://schemas.microsoft.com/office/word/2010/wordprocessingCanvas" xmlns:cx="http://schemas.microsoft.com/office/drawing/2014/chartex" xmlns:cx1="http://schemas.microsoft.com/office/drawing/2015/9/8/chartex" xmlns:cx2="http://schemas.microsoft.com/office/drawing/2015/10/21/chartex" xmlns:cx3="http://schemas.microsoft.com/office/drawing/2016/5/9/chartex" xmlns:cx4="http://schemas.microsoft.com/office/drawing/2016/5/10/chartex" xmlns:cx5="http://schemas.microsoft.com/office/drawing/2016/5/11/chartex" xmlns:cx6="http://schemas.microsoft.com/office/drawing/2016/5/12/chartex" xmlns:cx7="http://schemas.microsoft.com/office/drawing/2016/5/13/chartex" xmlns:cx8="http://schemas.microsoft.com/office/drawing/2016/5/14/chartex" xmlns:mc="http://schemas.openxmlformats.org/markup-compatibility/2006" xmlns:aink="http://schemas.microsoft.com/office/drawing/2016/ink" xmlns:am3d="http://schemas.microsoft.com/office/drawing/2017/model3d" xmlns:o="urn:schemas-microsoft-com:office:office" xmlns:r="http://schemas.openxmlformats.org/officeDocument/2006/relationships" xmlns:m="http://schemas.openxmlformats.org/officeDocument/2006/math" xmlns:v="urn:schemas-microsoft-com:vml" xmlns:wp14="http://schemas.microsoft.com/office/word/2010/wordprocessingDrawing" xmlns:wp="http://schemas.openxmlformats.org/drawingml/2006/wordprocessingDrawing" xmlns:w10="urn:schemas-microsoft-com:office:word" xmlns:w="http://schemas.openxmlformats.org/wordprocessingml/2006/main" xmlns:w14="http://schemas.microsoft.com/office/word/2010/wordml" xmlns:w15="http://schemas.microsoft.com/office/word/2012/wordml" xmlns:w16cex="http://schemas.microsoft.com/office/word/2018/wordml/cex" xmlns:w16cid="http://schemas.microsoft.com/office/word/2016/wordml/cid" xmlns:w16="http://schemas.microsoft.com/office/word/2018/wordml" xmlns:w16sdtdh="http://schemas.microsoft.com/office/word/2020/wordml/sdtdatahash" xmlns:w16se="http://schemas.microsoft.com/office/word/2015/wordml/symex" xmlns:wpg="http://schemas.microsoft.com/office/word/2010/wordprocessingGroup" xmlns:wpi="http://schemas.microsoft.com/office/word/2010/wordprocessingInk" xmlns:wne="http://schemas.microsoft.com/office/word/2006/wordml" xmlns:wps="http://schemas.microsoft.com/office/word/2010/wordprocessingShape" mc:Ignorable="w14 w15 w16se w16cid w16 w16cex w16sdtdh wp14">
+<w:hdr xmlns:wpc="http://schemas.microsoft.com/office/word/2010/wordprocessingCanvas" xmlns:cx="http://schemas.microsoft.com/office/drawing/2014/chartex" xmlns:cx1="http://schemas.microsoft.com/office/drawing/2015/9/8/chartex" xmlns:cx2="http://schemas.microsoft.com/office/drawing/2015/10/21/chartex" xmlns:cx3="http://schemas.microsoft.com/office/drawing/2016/5/9/chartex" xmlns:cx4="http://schemas.microsoft.com/office/drawing/2016/5/10/chartex" xmlns:cx5="http://schemas.microsoft.com/office/drawing/2016/5/11/chartex" xmlns:cx6="http://schemas.microsoft.com/office/drawing/2016/5/12/chartex" xmlns:cx7="http://schemas.microsoft.com/office/drawing/2016/5/13/chartex" xmlns:cx8="http://schemas.microsoft.com/office/drawing/2016/5/14/chartex" xmlns:mc="http://schemas.openxmlformats.org/markup-compatibility/2006" xmlns:aink="http://schemas.microsoft.com/office/drawing/2016/ink" xmlns:am3d="http://schemas.microsoft.com/office/drawing/2017/model3d" xmlns:o="urn:schemas-microsoft-com:office:office" xmlns:oel="http://schemas.microsoft.com/office/2019/extlst" xmlns:r="http://schemas.openxmlformats.org/officeDocument/2006/relationships" xmlns:m="http://schemas.openxmlformats.org/officeDocument/2006/math" xmlns:v="urn:schemas-microsoft-com:vml" xmlns:wp14="http://schemas.microsoft.com/office/word/2010/wordprocessingDrawing" xmlns:wp="http://schemas.openxmlformats.org/drawingml/2006/wordprocessingDrawing" xmlns:w10="urn:schemas-microsoft-com:office:word" xmlns:w="http://schemas.openxmlformats.org/wordprocessingml/2006/main" xmlns:w14="http://schemas.microsoft.com/office/word/2010/wordml" xmlns:w15="http://schemas.microsoft.com/office/word/2012/wordml" xmlns:w16cex="http://schemas.microsoft.com/office/word/2018/wordml/cex" xmlns:w16cid="http://schemas.microsoft.com/office/word/2016/wordml/cid" xmlns:w16="http://schemas.microsoft.com/office/word/2018/wordml" xmlns:w16du="http://schemas.microsoft.com/office/word/2023/wordml/word16du" xmlns:w16sdtdh="http://schemas.microsoft.com/office/word/2020/wordml/sdtdatahash" xmlns:w16sdtfl="http://schemas.microsoft.com/office/word/2024/wordml/sdtformatlock" xmlns:w16se="http://schemas.microsoft.com/office/word/2015/wordml/symex" xmlns:wpg="http://schemas.microsoft.com/office/word/2010/wordprocessingGroup" xmlns:wpi="http://schemas.microsoft.com/office/word/2010/wordprocessingInk" xmlns:wne="http://schemas.microsoft.com/office/word/2006/wordml" xmlns:wps="http://schemas.microsoft.com/office/word/2010/wordprocessingShape" mc:Ignorable="w14 w15 w16se w16cid w16 w16cex w16sdtdh w16sdtfl w16du wp14">
   <w:p>
     <w:pPr>
       <w:spacing w:after="160" w:line="259" w:lineRule="auto"/>
@@ -1359,7 +1639,7 @@
 </file>
 
 <file path=word/header2.xml><?xml version="1.0" encoding="utf-8"?>
-<w:hdr xmlns:wpc="http://schemas.microsoft.com/office/word/2010/wordprocessingCanvas" xmlns:cx="http://schemas.microsoft.com/office/drawing/2014/chartex" xmlns:cx1="http://schemas.microsoft.com/office/drawing/2015/9/8/chartex" xmlns:cx2="http://schemas.microsoft.com/office/drawing/2015/10/21/chartex" xmlns:cx3="http://schemas.microsoft.com/office/drawing/2016/5/9/chartex" xmlns:cx4="http://schemas.microsoft.com/office/drawing/2016/5/10/chartex" xmlns:cx5="http://schemas.microsoft.com/office/drawing/2016/5/11/chartex" xmlns:cx6="http://schemas.microsoft.com/office/drawing/2016/5/12/chartex" xmlns:cx7="http://schemas.microsoft.com/office/drawing/2016/5/13/chartex" xmlns:cx8="http://schemas.microsoft.com/office/drawing/2016/5/14/chartex" xmlns:mc="http://schemas.openxmlformats.org/markup-compatibility/2006" xmlns:aink="http://schemas.microsoft.com/office/drawing/2016/ink" xmlns:am3d="http://schemas.microsoft.com/office/drawing/2017/model3d" xmlns:o="urn:schemas-microsoft-com:office:office" xmlns:r="http://schemas.openxmlformats.org/officeDocument/2006/relationships" xmlns:m="http://schemas.openxmlformats.org/officeDocument/2006/math" xmlns:v="urn:schemas-microsoft-com:vml" xmlns:wp14="http://schemas.microsoft.com/office/word/2010/wordprocessingDrawing" xmlns:wp="http://schemas.openxmlformats.org/drawingml/2006/wordprocessingDrawing" xmlns:w10="urn:schemas-microsoft-com:office:word" xmlns:w="http://schemas.openxmlformats.org/wordprocessingml/2006/main" xmlns:w14="http://schemas.microsoft.com/office/word/2010/wordml" xmlns:w15="http://schemas.microsoft.com/office/word/2012/wordml" xmlns:w16cex="http://schemas.microsoft.com/office/word/2018/wordml/cex" xmlns:w16cid="http://schemas.microsoft.com/office/word/2016/wordml/cid" xmlns:w16="http://schemas.microsoft.com/office/word/2018/wordml" xmlns:w16sdtdh="http://schemas.microsoft.com/office/word/2020/wordml/sdtdatahash" xmlns:w16se="http://schemas.microsoft.com/office/word/2015/wordml/symex" xmlns:wpg="http://schemas.microsoft.com/office/word/2010/wordprocessingGroup" xmlns:wpi="http://schemas.microsoft.com/office/word/2010/wordprocessingInk" xmlns:wne="http://schemas.microsoft.com/office/word/2006/wordml" xmlns:wps="http://schemas.microsoft.com/office/word/2010/wordprocessingShape" mc:Ignorable="w14 w15 w16se w16cid w16 w16cex w16sdtdh wp14">
+<w:hdr xmlns:wpc="http://schemas.microsoft.com/office/word/2010/wordprocessingCanvas" xmlns:cx="http://schemas.microsoft.com/office/drawing/2014/chartex" xmlns:cx1="http://schemas.microsoft.com/office/drawing/2015/9/8/chartex" xmlns:cx2="http://schemas.microsoft.com/office/drawing/2015/10/21/chartex" xmlns:cx3="http://schemas.microsoft.com/office/drawing/2016/5/9/chartex" xmlns:cx4="http://schemas.microsoft.com/office/drawing/2016/5/10/chartex" xmlns:cx5="http://schemas.microsoft.com/office/drawing/2016/5/11/chartex" xmlns:cx6="http://schemas.microsoft.com/office/drawing/2016/5/12/chartex" xmlns:cx7="http://schemas.microsoft.com/office/drawing/2016/5/13/chartex" xmlns:cx8="http://schemas.microsoft.com/office/drawing/2016/5/14/chartex" xmlns:mc="http://schemas.openxmlformats.org/markup-compatibility/2006" xmlns:aink="http://schemas.microsoft.com/office/drawing/2016/ink" xmlns:am3d="http://schemas.microsoft.com/office/drawing/2017/model3d" xmlns:o="urn:schemas-microsoft-com:office:office" xmlns:oel="http://schemas.microsoft.com/office/2019/extlst" xmlns:r="http://schemas.openxmlformats.org/officeDocument/2006/relationships" xmlns:m="http://schemas.openxmlformats.org/officeDocument/2006/math" xmlns:v="urn:schemas-microsoft-com:vml" xmlns:wp14="http://schemas.microsoft.com/office/word/2010/wordprocessingDrawing" xmlns:wp="http://schemas.openxmlformats.org/drawingml/2006/wordprocessingDrawing" xmlns:w10="urn:schemas-microsoft-com:office:word" xmlns:w="http://schemas.openxmlformats.org/wordprocessingml/2006/main" xmlns:w14="http://schemas.microsoft.com/office/word/2010/wordml" xmlns:w15="http://schemas.microsoft.com/office/word/2012/wordml" xmlns:w16cex="http://schemas.microsoft.com/office/word/2018/wordml/cex" xmlns:w16cid="http://schemas.microsoft.com/office/word/2016/wordml/cid" xmlns:w16="http://schemas.microsoft.com/office/word/2018/wordml" xmlns:w16du="http://schemas.microsoft.com/office/word/2023/wordml/word16du" xmlns:w16sdtdh="http://schemas.microsoft.com/office/word/2020/wordml/sdtdatahash" xmlns:w16sdtfl="http://schemas.microsoft.com/office/word/2024/wordml/sdtformatlock" xmlns:w16se="http://schemas.microsoft.com/office/word/2015/wordml/symex" xmlns:wpg="http://schemas.microsoft.com/office/word/2010/wordprocessingGroup" xmlns:wpi="http://schemas.microsoft.com/office/word/2010/wordprocessingInk" xmlns:wne="http://schemas.microsoft.com/office/word/2006/wordml" xmlns:wps="http://schemas.microsoft.com/office/word/2010/wordprocessingShape" mc:Ignorable="w14 w15 w16se w16cid w16 w16cex w16sdtdh w16sdtfl w16du wp14">
   <w:p>
     <w:pPr>
       <w:tabs>
@@ -1509,7 +1789,7 @@
 </file>
 
 <file path=word/header3.xml><?xml version="1.0" encoding="utf-8"?>
-<w:hdr xmlns:wpc="http://schemas.microsoft.com/office/word/2010/wordprocessingCanvas" xmlns:cx="http://schemas.microsoft.com/office/drawing/2014/chartex" xmlns:cx1="http://schemas.microsoft.com/office/drawing/2015/9/8/chartex" xmlns:cx2="http://schemas.microsoft.com/office/drawing/2015/10/21/chartex" xmlns:cx3="http://schemas.microsoft.com/office/drawing/2016/5/9/chartex" xmlns:cx4="http://schemas.microsoft.com/office/drawing/2016/5/10/chartex" xmlns:cx5="http://schemas.microsoft.com/office/drawing/2016/5/11/chartex" xmlns:cx6="http://schemas.microsoft.com/office/drawing/2016/5/12/chartex" xmlns:cx7="http://schemas.microsoft.com/office/drawing/2016/5/13/chartex" xmlns:cx8="http://schemas.microsoft.com/office/drawing/2016/5/14/chartex" xmlns:mc="http://schemas.openxmlformats.org/markup-compatibility/2006" xmlns:aink="http://schemas.microsoft.com/office/drawing/2016/ink" xmlns:am3d="http://schemas.microsoft.com/office/drawing/2017/model3d" xmlns:o="urn:schemas-microsoft-com:office:office" xmlns:r="http://schemas.openxmlformats.org/officeDocument/2006/relationships" xmlns:m="http://schemas.openxmlformats.org/officeDocument/2006/math" xmlns:v="urn:schemas-microsoft-com:vml" xmlns:wp14="http://schemas.microsoft.com/office/word/2010/wordprocessingDrawing" xmlns:wp="http://schemas.openxmlformats.org/drawingml/2006/wordprocessingDrawing" xmlns:w10="urn:schemas-microsoft-com:office:word" xmlns:w="http://schemas.openxmlformats.org/wordprocessingml/2006/main" xmlns:w14="http://schemas.microsoft.com/office/word/2010/wordml" xmlns:w15="http://schemas.microsoft.com/office/word/2012/wordml" xmlns:w16cex="http://schemas.microsoft.com/office/word/2018/wordml/cex" xmlns:w16cid="http://schemas.microsoft.com/office/word/2016/wordml/cid" xmlns:w16="http://schemas.microsoft.com/office/word/2018/wordml" xmlns:w16sdtdh="http://schemas.microsoft.com/office/word/2020/wordml/sdtdatahash" xmlns:w16se="http://schemas.microsoft.com/office/word/2015/wordml/symex" xmlns:wpg="http://schemas.microsoft.com/office/word/2010/wordprocessingGroup" xmlns:wpi="http://schemas.microsoft.com/office/word/2010/wordprocessingInk" xmlns:wne="http://schemas.microsoft.com/office/word/2006/wordml" xmlns:wps="http://schemas.microsoft.com/office/word/2010/wordprocessingShape" mc:Ignorable="w14 w15 w16se w16cid w16 w16cex w16sdtdh wp14">
+<w:hdr xmlns:wpc="http://schemas.microsoft.com/office/word/2010/wordprocessingCanvas" xmlns:cx="http://schemas.microsoft.com/office/drawing/2014/chartex" xmlns:cx1="http://schemas.microsoft.com/office/drawing/2015/9/8/chartex" xmlns:cx2="http://schemas.microsoft.com/office/drawing/2015/10/21/chartex" xmlns:cx3="http://schemas.microsoft.com/office/drawing/2016/5/9/chartex" xmlns:cx4="http://schemas.microsoft.com/office/drawing/2016/5/10/chartex" xmlns:cx5="http://schemas.microsoft.com/office/drawing/2016/5/11/chartex" xmlns:cx6="http://schemas.microsoft.com/office/drawing/2016/5/12/chartex" xmlns:cx7="http://schemas.microsoft.com/office/drawing/2016/5/13/chartex" xmlns:cx8="http://schemas.microsoft.com/office/drawing/2016/5/14/chartex" xmlns:mc="http://schemas.openxmlformats.org/markup-compatibility/2006" xmlns:aink="http://schemas.microsoft.com/office/drawing/2016/ink" xmlns:am3d="http://schemas.microsoft.com/office/drawing/2017/model3d" xmlns:o="urn:schemas-microsoft-com:office:office" xmlns:oel="http://schemas.microsoft.com/office/2019/extlst" xmlns:r="http://schemas.openxmlformats.org/officeDocument/2006/relationships" xmlns:m="http://schemas.openxmlformats.org/officeDocument/2006/math" xmlns:v="urn:schemas-microsoft-com:vml" xmlns:wp14="http://schemas.microsoft.com/office/word/2010/wordprocessingDrawing" xmlns:wp="http://schemas.openxmlformats.org/drawingml/2006/wordprocessingDrawing" xmlns:w10="urn:schemas-microsoft-com:office:word" xmlns:w="http://schemas.openxmlformats.org/wordprocessingml/2006/main" xmlns:w14="http://schemas.microsoft.com/office/word/2010/wordml" xmlns:w15="http://schemas.microsoft.com/office/word/2012/wordml" xmlns:w16cex="http://schemas.microsoft.com/office/word/2018/wordml/cex" xmlns:w16cid="http://schemas.microsoft.com/office/word/2016/wordml/cid" xmlns:w16="http://schemas.microsoft.com/office/word/2018/wordml" xmlns:w16du="http://schemas.microsoft.com/office/word/2023/wordml/word16du" xmlns:w16sdtdh="http://schemas.microsoft.com/office/word/2020/wordml/sdtdatahash" xmlns:w16sdtfl="http://schemas.microsoft.com/office/word/2024/wordml/sdtformatlock" xmlns:w16se="http://schemas.microsoft.com/office/word/2015/wordml/symex" xmlns:wpg="http://schemas.microsoft.com/office/word/2010/wordprocessingGroup" xmlns:wpi="http://schemas.microsoft.com/office/word/2010/wordprocessingInk" xmlns:wne="http://schemas.microsoft.com/office/word/2006/wordml" xmlns:wps="http://schemas.microsoft.com/office/word/2010/wordprocessingShape" mc:Ignorable="w14 w15 w16se w16cid w16 w16cex w16sdtdh w16sdtfl w16du wp14">
   <w:p>
     <w:pPr>
       <w:tabs>
@@ -1659,10 +1939,10 @@
 </file>
 
 <file path=word/header4.xml><?xml version="1.0" encoding="utf-8"?>
-<w:hdr xmlns:wpc="http://schemas.microsoft.com/office/word/2010/wordprocessingCanvas" xmlns:cx="http://schemas.microsoft.com/office/drawing/2014/chartex" xmlns:cx1="http://schemas.microsoft.com/office/drawing/2015/9/8/chartex" xmlns:cx2="http://schemas.microsoft.com/office/drawing/2015/10/21/chartex" xmlns:cx3="http://schemas.microsoft.com/office/drawing/2016/5/9/chartex" xmlns:cx4="http://schemas.microsoft.com/office/drawing/2016/5/10/chartex" xmlns:cx5="http://schemas.microsoft.com/office/drawing/2016/5/11/chartex" xmlns:cx6="http://schemas.microsoft.com/office/drawing/2016/5/12/chartex" xmlns:cx7="http://schemas.microsoft.com/office/drawing/2016/5/13/chartex" xmlns:cx8="http://schemas.microsoft.com/office/drawing/2016/5/14/chartex" xmlns:mc="http://schemas.openxmlformats.org/markup-compatibility/2006" xmlns:aink="http://schemas.microsoft.com/office/drawing/2016/ink" xmlns:am3d="http://schemas.microsoft.com/office/drawing/2017/model3d" xmlns:o="urn:schemas-microsoft-com:office:office" xmlns:r="http://schemas.openxmlformats.org/officeDocument/2006/relationships" xmlns:m="http://schemas.openxmlformats.org/officeDocument/2006/math" xmlns:v="urn:schemas-microsoft-com:vml" xmlns:wp14="http://schemas.microsoft.com/office/word/2010/wordprocessingDrawing" xmlns:wp="http://schemas.openxmlformats.org/drawingml/2006/wordprocessingDrawing" xmlns:w10="urn:schemas-microsoft-com:office:word" xmlns:w="http://schemas.openxmlformats.org/wordprocessingml/2006/main" xmlns:w14="http://schemas.microsoft.com/office/word/2010/wordml" xmlns:w15="http://schemas.microsoft.com/office/word/2012/wordml" xmlns:w16cex="http://schemas.microsoft.com/office/word/2018/wordml/cex" xmlns:w16cid="http://schemas.microsoft.com/office/word/2016/wordml/cid" xmlns:w16="http://schemas.microsoft.com/office/word/2018/wordml" xmlns:w16sdtdh="http://schemas.microsoft.com/office/word/2020/wordml/sdtdatahash" xmlns:w16se="http://schemas.microsoft.com/office/word/2015/wordml/symex" xmlns:wpg="http://schemas.microsoft.com/office/word/2010/wordprocessingGroup" xmlns:wpi="http://schemas.microsoft.com/office/word/2010/wordprocessingInk" xmlns:wne="http://schemas.microsoft.com/office/word/2006/wordml" xmlns:wps="http://schemas.microsoft.com/office/word/2010/wordprocessingShape" mc:Ignorable="w14 w15 w16se w16cid w16 w16cex w16sdtdh wp14">
+<w:hdr xmlns:wpc="http://schemas.microsoft.com/office/word/2010/wordprocessingCanvas" xmlns:cx="http://schemas.microsoft.com/office/drawing/2014/chartex" xmlns:cx1="http://schemas.microsoft.com/office/drawing/2015/9/8/chartex" xmlns:cx2="http://schemas.microsoft.com/office/drawing/2015/10/21/chartex" xmlns:cx3="http://schemas.microsoft.com/office/drawing/2016/5/9/chartex" xmlns:cx4="http://schemas.microsoft.com/office/drawing/2016/5/10/chartex" xmlns:cx5="http://schemas.microsoft.com/office/drawing/2016/5/11/chartex" xmlns:cx6="http://schemas.microsoft.com/office/drawing/2016/5/12/chartex" xmlns:cx7="http://schemas.microsoft.com/office/drawing/2016/5/13/chartex" xmlns:cx8="http://schemas.microsoft.com/office/drawing/2016/5/14/chartex" xmlns:mc="http://schemas.openxmlformats.org/markup-compatibility/2006" xmlns:aink="http://schemas.microsoft.com/office/drawing/2016/ink" xmlns:am3d="http://schemas.microsoft.com/office/drawing/2017/model3d" xmlns:o="urn:schemas-microsoft-com:office:office" xmlns:oel="http://schemas.microsoft.com/office/2019/extlst" xmlns:r="http://schemas.openxmlformats.org/officeDocument/2006/relationships" xmlns:m="http://schemas.openxmlformats.org/officeDocument/2006/math" xmlns:v="urn:schemas-microsoft-com:vml" xmlns:wp14="http://schemas.microsoft.com/office/word/2010/wordprocessingDrawing" xmlns:wp="http://schemas.openxmlformats.org/drawingml/2006/wordprocessingDrawing" xmlns:w10="urn:schemas-microsoft-com:office:word" xmlns:w="http://schemas.openxmlformats.org/wordprocessingml/2006/main" xmlns:w14="http://schemas.microsoft.com/office/word/2010/wordml" xmlns:w15="http://schemas.microsoft.com/office/word/2012/wordml" xmlns:w16cex="http://schemas.microsoft.com/office/word/2018/wordml/cex" xmlns:w16cid="http://schemas.microsoft.com/office/word/2016/wordml/cid" xmlns:w16="http://schemas.microsoft.com/office/word/2018/wordml" xmlns:w16du="http://schemas.microsoft.com/office/word/2023/wordml/word16du" xmlns:w16sdtdh="http://schemas.microsoft.com/office/word/2020/wordml/sdtdatahash" xmlns:w16sdtfl="http://schemas.microsoft.com/office/word/2024/wordml/sdtformatlock" xmlns:w16se="http://schemas.microsoft.com/office/word/2015/wordml/symex" xmlns:wpg="http://schemas.microsoft.com/office/word/2010/wordprocessingGroup" xmlns:wpi="http://schemas.microsoft.com/office/word/2010/wordprocessingInk" xmlns:wne="http://schemas.microsoft.com/office/word/2006/wordml" xmlns:wps="http://schemas.microsoft.com/office/word/2010/wordprocessingShape" mc:Ignorable="w14 w15 w16se w16cid w16 w16cex w16sdtdh w16sdtfl w16du wp14">
   <w:p>
     <w:pPr>
-      <w:pStyle w:val="Header"/>
+      <w:pStyle w:val="Koptekst"/>
     </w:pPr>
     <w:r>
       <w:rPr>
@@ -1737,14 +2017,14 @@
   </w:p>
   <w:p>
     <w:pPr>
-      <w:pStyle w:val="Header"/>
+      <w:pStyle w:val="Koptekst"/>
     </w:pPr>
   </w:p>
 </w:hdr>
 </file>
 
 <file path=word/numbering.xml><?xml version="1.0" encoding="utf-8"?>
-<w:numbering xmlns:wpc="http://schemas.microsoft.com/office/word/2010/wordprocessingCanvas" xmlns:cx="http://schemas.microsoft.com/office/drawing/2014/chartex" xmlns:cx1="http://schemas.microsoft.com/office/drawing/2015/9/8/chartex" xmlns:cx2="http://schemas.microsoft.com/office/drawing/2015/10/21/chartex" xmlns:cx3="http://schemas.microsoft.com/office/drawing/2016/5/9/chartex" xmlns:cx4="http://schemas.microsoft.com/office/drawing/2016/5/10/chartex" xmlns:cx5="http://schemas.microsoft.com/office/drawing/2016/5/11/chartex" xmlns:cx6="http://schemas.microsoft.com/office/drawing/2016/5/12/chartex" xmlns:cx7="http://schemas.microsoft.com/office/drawing/2016/5/13/chartex" xmlns:cx8="http://schemas.microsoft.com/office/drawing/2016/5/14/chartex" xmlns:mc="http://schemas.openxmlformats.org/markup-compatibility/2006" xmlns:aink="http://schemas.microsoft.com/office/drawing/2016/ink" xmlns:am3d="http://schemas.microsoft.com/office/drawing/2017/model3d" xmlns:o="urn:schemas-microsoft-com:office:office" xmlns:r="http://schemas.openxmlformats.org/officeDocument/2006/relationships" xmlns:m="http://schemas.openxmlformats.org/officeDocument/2006/math" xmlns:v="urn:schemas-microsoft-com:vml" xmlns:wp14="http://schemas.microsoft.com/office/word/2010/wordprocessingDrawing" xmlns:wp="http://schemas.openxmlformats.org/drawingml/2006/wordprocessingDrawing" xmlns:w10="urn:schemas-microsoft-com:office:word" xmlns:w="http://schemas.openxmlformats.org/wordprocessingml/2006/main" xmlns:w14="http://schemas.microsoft.com/office/word/2010/wordml" xmlns:w15="http://schemas.microsoft.com/office/word/2012/wordml" xmlns:w16cex="http://schemas.microsoft.com/office/word/2018/wordml/cex" xmlns:w16cid="http://schemas.microsoft.com/office/word/2016/wordml/cid" xmlns:w16="http://schemas.microsoft.com/office/word/2018/wordml" xmlns:w16sdtdh="http://schemas.microsoft.com/office/word/2020/wordml/sdtdatahash" xmlns:w16se="http://schemas.microsoft.com/office/word/2015/wordml/symex" xmlns:wpg="http://schemas.microsoft.com/office/word/2010/wordprocessingGroup" xmlns:wpi="http://schemas.microsoft.com/office/word/2010/wordprocessingInk" xmlns:wne="http://schemas.microsoft.com/office/word/2006/wordml" xmlns:wps="http://schemas.microsoft.com/office/word/2010/wordprocessingShape" mc:Ignorable="w14 w15 w16se w16cid w16 w16cex w16sdtdh wp14">
+<w:numbering xmlns:wpc="http://schemas.microsoft.com/office/word/2010/wordprocessingCanvas" xmlns:cx="http://schemas.microsoft.com/office/drawing/2014/chartex" xmlns:cx1="http://schemas.microsoft.com/office/drawing/2015/9/8/chartex" xmlns:cx2="http://schemas.microsoft.com/office/drawing/2015/10/21/chartex" xmlns:cx3="http://schemas.microsoft.com/office/drawing/2016/5/9/chartex" xmlns:cx4="http://schemas.microsoft.com/office/drawing/2016/5/10/chartex" xmlns:cx5="http://schemas.microsoft.com/office/drawing/2016/5/11/chartex" xmlns:cx6="http://schemas.microsoft.com/office/drawing/2016/5/12/chartex" xmlns:cx7="http://schemas.microsoft.com/office/drawing/2016/5/13/chartex" xmlns:cx8="http://schemas.microsoft.com/office/drawing/2016/5/14/chartex" xmlns:mc="http://schemas.openxmlformats.org/markup-compatibility/2006" xmlns:aink="http://schemas.microsoft.com/office/drawing/2016/ink" xmlns:am3d="http://schemas.microsoft.com/office/drawing/2017/model3d" xmlns:o="urn:schemas-microsoft-com:office:office" xmlns:oel="http://schemas.microsoft.com/office/2019/extlst" xmlns:r="http://schemas.openxmlformats.org/officeDocument/2006/relationships" xmlns:m="http://schemas.openxmlformats.org/officeDocument/2006/math" xmlns:v="urn:schemas-microsoft-com:vml" xmlns:wp14="http://schemas.microsoft.com/office/word/2010/wordprocessingDrawing" xmlns:wp="http://schemas.openxmlformats.org/drawingml/2006/wordprocessingDrawing" xmlns:w10="urn:schemas-microsoft-com:office:word" xmlns:w="http://schemas.openxmlformats.org/wordprocessingml/2006/main" xmlns:w14="http://schemas.microsoft.com/office/word/2010/wordml" xmlns:w15="http://schemas.microsoft.com/office/word/2012/wordml" xmlns:w16cex="http://schemas.microsoft.com/office/word/2018/wordml/cex" xmlns:w16cid="http://schemas.microsoft.com/office/word/2016/wordml/cid" xmlns:w16="http://schemas.microsoft.com/office/word/2018/wordml" xmlns:w16du="http://schemas.microsoft.com/office/word/2023/wordml/word16du" xmlns:w16sdtdh="http://schemas.microsoft.com/office/word/2020/wordml/sdtdatahash" xmlns:w16sdtfl="http://schemas.microsoft.com/office/word/2024/wordml/sdtformatlock" xmlns:w16se="http://schemas.microsoft.com/office/word/2015/wordml/symex" xmlns:wpg="http://schemas.microsoft.com/office/word/2010/wordprocessingGroup" xmlns:wpi="http://schemas.microsoft.com/office/word/2010/wordprocessingInk" xmlns:wne="http://schemas.microsoft.com/office/word/2006/wordml" xmlns:wps="http://schemas.microsoft.com/office/word/2010/wordprocessingShape" mc:Ignorable="w14 w15 w16se w16cid w16 w16cex w16sdtdh w16sdtfl w16du wp14">
   <w:abstractNum w:abstractNumId="0" w15:restartNumberingAfterBreak="0">
     <w:nsid w:val="FFFFFF7C"/>
     <w:multiLevelType w:val="singleLevel"/>
@@ -2165,7 +2445,7 @@
     <w:lvl w:ilvl="0">
       <w:start w:val="1"/>
       <w:numFmt w:val="decimal"/>
-      <w:pStyle w:val="Heading1"/>
+      <w:pStyle w:val="Kop1"/>
       <w:lvlText w:val="%1"/>
       <w:lvlJc w:val="left"/>
       <w:pPr>
@@ -2175,7 +2455,7 @@
     <w:lvl w:ilvl="1">
       <w:start w:val="1"/>
       <w:numFmt w:val="decimal"/>
-      <w:pStyle w:val="Heading2"/>
+      <w:pStyle w:val="Kop2"/>
       <w:lvlText w:val="%1.%2"/>
       <w:lvlJc w:val="left"/>
       <w:pPr>
@@ -2185,7 +2465,7 @@
     <w:lvl w:ilvl="2">
       <w:start w:val="1"/>
       <w:numFmt w:val="decimal"/>
-      <w:pStyle w:val="Heading3"/>
+      <w:pStyle w:val="Kop3"/>
       <w:lvlText w:val="%1.%2.%3"/>
       <w:lvlJc w:val="left"/>
       <w:pPr>
@@ -2204,7 +2484,7 @@
     <w:lvl w:ilvl="4">
       <w:start w:val="1"/>
       <w:numFmt w:val="decimal"/>
-      <w:pStyle w:val="Heading5"/>
+      <w:pStyle w:val="Kop5"/>
       <w:lvlText w:val="%1.%2.%3.%4.%5"/>
       <w:lvlJc w:val="left"/>
       <w:pPr>
@@ -2214,7 +2494,7 @@
     <w:lvl w:ilvl="5">
       <w:start w:val="1"/>
       <w:numFmt w:val="decimal"/>
-      <w:pStyle w:val="Heading6"/>
+      <w:pStyle w:val="Kop6"/>
       <w:lvlText w:val="%1.%2.%3.%4.%5.%6"/>
       <w:lvlJc w:val="left"/>
       <w:pPr>
@@ -2224,7 +2504,7 @@
     <w:lvl w:ilvl="6">
       <w:start w:val="1"/>
       <w:numFmt w:val="decimal"/>
-      <w:pStyle w:val="Heading7"/>
+      <w:pStyle w:val="Kop7"/>
       <w:lvlText w:val="%1.%2.%3.%4.%5.%6.%7"/>
       <w:lvlJc w:val="left"/>
       <w:pPr>
@@ -2234,7 +2514,7 @@
     <w:lvl w:ilvl="7">
       <w:start w:val="1"/>
       <w:numFmt w:val="decimal"/>
-      <w:pStyle w:val="Heading8"/>
+      <w:pStyle w:val="Kop8"/>
       <w:lvlText w:val="%1.%2.%3.%4.%5.%6.%7.%8"/>
       <w:lvlJc w:val="left"/>
       <w:pPr>
@@ -2244,7 +2524,7 @@
     <w:lvl w:ilvl="8">
       <w:start w:val="1"/>
       <w:numFmt w:val="decimal"/>
-      <w:pStyle w:val="Heading9"/>
+      <w:pStyle w:val="Kop9"/>
       <w:lvlText w:val="%1.%2.%3.%4.%5.%6.%7.%8.%9"/>
       <w:lvlJc w:val="left"/>
       <w:pPr>
@@ -2451,49 +2731,49 @@
       </w:pPr>
     </w:lvl>
   </w:abstractNum>
-  <w:num w:numId="1">
+  <w:num w:numId="1" w16cid:durableId="692651746">
     <w:abstractNumId w:val="14"/>
   </w:num>
-  <w:num w:numId="2">
+  <w:num w:numId="2" w16cid:durableId="1363898450">
     <w:abstractNumId w:val="11"/>
   </w:num>
-  <w:num w:numId="3">
+  <w:num w:numId="3" w16cid:durableId="1955405936">
     <w:abstractNumId w:val="13"/>
   </w:num>
-  <w:num w:numId="4">
+  <w:num w:numId="4" w16cid:durableId="216203281">
     <w:abstractNumId w:val="12"/>
   </w:num>
-  <w:num w:numId="5">
+  <w:num w:numId="5" w16cid:durableId="1108812684">
     <w:abstractNumId w:val="1"/>
   </w:num>
-  <w:num w:numId="6">
+  <w:num w:numId="6" w16cid:durableId="1940405586">
     <w:abstractNumId w:val="0"/>
   </w:num>
-  <w:num w:numId="7">
+  <w:num w:numId="7" w16cid:durableId="1953052158">
     <w:abstractNumId w:val="3"/>
   </w:num>
-  <w:num w:numId="8">
+  <w:num w:numId="8" w16cid:durableId="590360345">
     <w:abstractNumId w:val="2"/>
   </w:num>
-  <w:num w:numId="9">
+  <w:num w:numId="9" w16cid:durableId="640310843">
     <w:abstractNumId w:val="4"/>
   </w:num>
-  <w:num w:numId="10">
+  <w:num w:numId="10" w16cid:durableId="1629317947">
     <w:abstractNumId w:val="8"/>
   </w:num>
-  <w:num w:numId="11">
+  <w:num w:numId="11" w16cid:durableId="1466040503">
     <w:abstractNumId w:val="9"/>
   </w:num>
-  <w:num w:numId="12">
+  <w:num w:numId="12" w16cid:durableId="10960467">
     <w:abstractNumId w:val="7"/>
   </w:num>
-  <w:num w:numId="13">
+  <w:num w:numId="13" w16cid:durableId="1531260775">
     <w:abstractNumId w:val="6"/>
   </w:num>
-  <w:num w:numId="14">
+  <w:num w:numId="14" w16cid:durableId="1157843095">
     <w:abstractNumId w:val="5"/>
   </w:num>
-  <w:num w:numId="15">
+  <w:num w:numId="15" w16cid:durableId="1033848907">
     <w:abstractNumId w:val="10"/>
   </w:num>
   <w:numIdMacAtCleanup w:val="4"/>
@@ -2501,7 +2781,7 @@
 </file>
 
 <file path=word/styles.xml><?xml version="1.0" encoding="utf-8"?>
-<w:styles xmlns:mc="http://schemas.openxmlformats.org/markup-compatibility/2006" xmlns:r="http://schemas.openxmlformats.org/officeDocument/2006/relationships" xmlns:w="http://schemas.openxmlformats.org/wordprocessingml/2006/main" xmlns:w14="http://schemas.microsoft.com/office/word/2010/wordml" xmlns:w15="http://schemas.microsoft.com/office/word/2012/wordml" xmlns:w16cex="http://schemas.microsoft.com/office/word/2018/wordml/cex" xmlns:w16cid="http://schemas.microsoft.com/office/word/2016/wordml/cid" xmlns:w16="http://schemas.microsoft.com/office/word/2018/wordml" xmlns:w16sdtdh="http://schemas.microsoft.com/office/word/2020/wordml/sdtdatahash" xmlns:w16se="http://schemas.microsoft.com/office/word/2015/wordml/symex" mc:Ignorable="w14 w15 w16se w16cid w16 w16cex w16sdtdh">
+<w:styles xmlns:mc="http://schemas.openxmlformats.org/markup-compatibility/2006" xmlns:r="http://schemas.openxmlformats.org/officeDocument/2006/relationships" xmlns:w="http://schemas.openxmlformats.org/wordprocessingml/2006/main" xmlns:w14="http://schemas.microsoft.com/office/word/2010/wordml" xmlns:w15="http://schemas.microsoft.com/office/word/2012/wordml" xmlns:w16cex="http://schemas.microsoft.com/office/word/2018/wordml/cex" xmlns:w16cid="http://schemas.microsoft.com/office/word/2016/wordml/cid" xmlns:w16="http://schemas.microsoft.com/office/word/2018/wordml" xmlns:w16du="http://schemas.microsoft.com/office/word/2023/wordml/word16du" xmlns:w16sdtdh="http://schemas.microsoft.com/office/word/2020/wordml/sdtdatahash" xmlns:w16sdtfl="http://schemas.microsoft.com/office/word/2024/wordml/sdtformatlock" xmlns:w16se="http://schemas.microsoft.com/office/word/2015/wordml/symex" mc:Ignorable="w14 w15 w16se w16cid w16 w16cex w16sdtdh w16sdtfl w16du">
   <w:docDefaults>
     <w:rPrDefault>
       <w:rPr>
@@ -2623,6 +2903,7 @@
     <w:lsdException w:name="HTML Sample" w:semiHidden="1" w:unhideWhenUsed="1"/>
     <w:lsdException w:name="HTML Typewriter" w:semiHidden="1" w:unhideWhenUsed="1"/>
     <w:lsdException w:name="HTML Variable" w:semiHidden="1" w:unhideWhenUsed="1"/>
+    <w:lsdException w:name="Normal Table" w:semiHidden="1" w:unhideWhenUsed="1"/>
     <w:lsdException w:name="annotation subject" w:semiHidden="1" w:unhideWhenUsed="1"/>
     <w:lsdException w:name="No List" w:semiHidden="1" w:unhideWhenUsed="1"/>
     <w:lsdException w:name="Outline List 1" w:semiHidden="1" w:unhideWhenUsed="1"/>
@@ -2665,8 +2946,11 @@
     <w:lsdException w:name="Table Contemporary" w:semiHidden="1" w:unhideWhenUsed="1"/>
     <w:lsdException w:name="Table Elegant" w:semiHidden="1" w:unhideWhenUsed="1"/>
     <w:lsdException w:name="Table Professional" w:semiHidden="1" w:unhideWhenUsed="1"/>
+    <w:lsdException w:name="Table Subtle 1" w:semiHidden="1" w:unhideWhenUsed="1"/>
     <w:lsdException w:name="Table Subtle 2" w:semiHidden="1" w:unhideWhenUsed="1"/>
     <w:lsdException w:name="Table Web 1" w:semiHidden="1" w:unhideWhenUsed="1"/>
+    <w:lsdException w:name="Table Web 2" w:semiHidden="1" w:unhideWhenUsed="1"/>
+    <w:lsdException w:name="Table Web 3" w:semiHidden="1" w:unhideWhenUsed="1"/>
     <w:lsdException w:name="Balloon Text" w:semiHidden="1" w:unhideWhenUsed="1"/>
     <w:lsdException w:name="Table Grid" w:uiPriority="0"/>
     <w:lsdException w:name="Table Theme" w:semiHidden="1" w:unhideWhenUsed="1"/>
@@ -2891,7 +3175,7 @@
     <w:lsdException w:name="Unresolved Mention" w:semiHidden="1" w:unhideWhenUsed="1"/>
     <w:lsdException w:name="Smart Link" w:semiHidden="1" w:unhideWhenUsed="1"/>
   </w:latentStyles>
-  <w:style w:type="paragraph" w:default="1" w:styleId="Normal">
+  <w:style w:type="paragraph" w:default="1" w:styleId="Standaard">
     <w:name w:val="Normal"/>
     <w:qFormat/>
     <w:rsid w:val="00753826"/>
@@ -2901,10 +3185,10 @@
       <w:sz w:val="20"/>
     </w:rPr>
   </w:style>
-  <w:style w:type="paragraph" w:styleId="Heading1">
+  <w:style w:type="paragraph" w:styleId="Kop1">
     <w:name w:val="heading 1"/>
-    <w:next w:val="Normal"/>
-    <w:link w:val="Heading1Char"/>
+    <w:next w:val="Standaard"/>
+    <w:link w:val="Kop1Char"/>
     <w:uiPriority w:val="9"/>
     <w:unhideWhenUsed/>
     <w:qFormat/>
@@ -2927,10 +3211,10 @@
       <w:sz w:val="28"/>
     </w:rPr>
   </w:style>
-  <w:style w:type="paragraph" w:styleId="Heading2">
+  <w:style w:type="paragraph" w:styleId="Kop2">
     <w:name w:val="heading 2"/>
-    <w:next w:val="Normal"/>
-    <w:link w:val="Heading2Char"/>
+    <w:next w:val="Standaard"/>
+    <w:link w:val="Kop2Char"/>
     <w:uiPriority w:val="9"/>
     <w:unhideWhenUsed/>
     <w:qFormat/>
@@ -2952,10 +3236,10 @@
       <w:sz w:val="24"/>
     </w:rPr>
   </w:style>
-  <w:style w:type="paragraph" w:styleId="Heading3">
+  <w:style w:type="paragraph" w:styleId="Kop3">
     <w:name w:val="heading 3"/>
-    <w:next w:val="Normal"/>
-    <w:link w:val="Heading3Char"/>
+    <w:next w:val="Standaard"/>
+    <w:link w:val="Kop3Char"/>
     <w:uiPriority w:val="9"/>
     <w:unhideWhenUsed/>
     <w:qFormat/>
@@ -2976,11 +3260,11 @@
       <w:color w:val="000000"/>
     </w:rPr>
   </w:style>
-  <w:style w:type="paragraph" w:styleId="Heading4">
+  <w:style w:type="paragraph" w:styleId="Kop4">
     <w:name w:val="heading 4"/>
-    <w:basedOn w:val="Normal"/>
-    <w:next w:val="Normal"/>
-    <w:link w:val="Heading4Char"/>
+    <w:basedOn w:val="Standaard"/>
+    <w:next w:val="Standaard"/>
+    <w:link w:val="Kop4Char"/>
     <w:uiPriority w:val="9"/>
     <w:unhideWhenUsed/>
     <w:qFormat/>
@@ -2994,11 +3278,11 @@
       <w:u w:val="single"/>
     </w:rPr>
   </w:style>
-  <w:style w:type="paragraph" w:styleId="Heading5">
+  <w:style w:type="paragraph" w:styleId="Kop5">
     <w:name w:val="heading 5"/>
-    <w:basedOn w:val="Normal"/>
-    <w:next w:val="Normal"/>
-    <w:link w:val="Heading5Char"/>
+    <w:basedOn w:val="Standaard"/>
+    <w:next w:val="Standaard"/>
+    <w:link w:val="Kop5Char"/>
     <w:uiPriority w:val="9"/>
     <w:semiHidden/>
     <w:unhideWhenUsed/>
@@ -3019,11 +3303,11 @@
       <w:color w:val="000000" w:themeColor="accent1" w:themeShade="BF"/>
     </w:rPr>
   </w:style>
-  <w:style w:type="paragraph" w:styleId="Heading6">
+  <w:style w:type="paragraph" w:styleId="Kop6">
     <w:name w:val="heading 6"/>
-    <w:basedOn w:val="Normal"/>
-    <w:next w:val="Normal"/>
-    <w:link w:val="Heading6Char"/>
+    <w:basedOn w:val="Standaard"/>
+    <w:next w:val="Standaard"/>
+    <w:link w:val="Kop6Char"/>
     <w:uiPriority w:val="9"/>
     <w:semiHidden/>
     <w:unhideWhenUsed/>
@@ -3044,11 +3328,11 @@
       <w:color w:val="000000" w:themeColor="accent1" w:themeShade="7F"/>
     </w:rPr>
   </w:style>
-  <w:style w:type="paragraph" w:styleId="Heading7">
+  <w:style w:type="paragraph" w:styleId="Kop7">
     <w:name w:val="heading 7"/>
-    <w:basedOn w:val="Normal"/>
-    <w:next w:val="Normal"/>
-    <w:link w:val="Heading7Char"/>
+    <w:basedOn w:val="Standaard"/>
+    <w:next w:val="Standaard"/>
+    <w:link w:val="Kop7Char"/>
     <w:uiPriority w:val="9"/>
     <w:semiHidden/>
     <w:unhideWhenUsed/>
@@ -3071,11 +3355,11 @@
       <w:color w:val="000000" w:themeColor="accent1" w:themeShade="7F"/>
     </w:rPr>
   </w:style>
-  <w:style w:type="paragraph" w:styleId="Heading8">
+  <w:style w:type="paragraph" w:styleId="Kop8">
     <w:name w:val="heading 8"/>
-    <w:basedOn w:val="Normal"/>
-    <w:next w:val="Normal"/>
-    <w:link w:val="Heading8Char"/>
+    <w:basedOn w:val="Standaard"/>
+    <w:next w:val="Standaard"/>
+    <w:link w:val="Kop8Char"/>
     <w:uiPriority w:val="9"/>
     <w:semiHidden/>
     <w:unhideWhenUsed/>
@@ -3098,11 +3382,11 @@
       <w:szCs w:val="21"/>
     </w:rPr>
   </w:style>
-  <w:style w:type="paragraph" w:styleId="Heading9">
+  <w:style w:type="paragraph" w:styleId="Kop9">
     <w:name w:val="heading 9"/>
-    <w:basedOn w:val="Normal"/>
-    <w:next w:val="Normal"/>
-    <w:link w:val="Heading9Char"/>
+    <w:basedOn w:val="Standaard"/>
+    <w:next w:val="Standaard"/>
+    <w:link w:val="Kop9Char"/>
     <w:uiPriority w:val="9"/>
     <w:semiHidden/>
     <w:unhideWhenUsed/>
@@ -3127,13 +3411,12 @@
       <w:szCs w:val="21"/>
     </w:rPr>
   </w:style>
-  <w:style w:type="character" w:default="1" w:styleId="DefaultParagraphFont">
+  <w:style w:type="character" w:default="1" w:styleId="Standaardalinea-lettertype">
     <w:name w:val="Default Paragraph Font"/>
     <w:uiPriority w:val="1"/>
-    <w:semiHidden/>
     <w:unhideWhenUsed/>
   </w:style>
-  <w:style w:type="table" w:default="1" w:styleId="TableNormal">
+  <w:style w:type="table" w:default="1" w:styleId="Standaardtabel">
     <w:name w:val="Normal Table"/>
     <w:uiPriority w:val="99"/>
     <w:semiHidden/>
@@ -3148,15 +3431,15 @@
       </w:tblCellMar>
     </w:tblPr>
   </w:style>
-  <w:style w:type="numbering" w:default="1" w:styleId="NoList">
+  <w:style w:type="numbering" w:default="1" w:styleId="Geenlijst">
     <w:name w:val="No List"/>
     <w:uiPriority w:val="99"/>
     <w:semiHidden/>
     <w:unhideWhenUsed/>
   </w:style>
-  <w:style w:type="character" w:customStyle="1" w:styleId="Heading2Char">
-    <w:name w:val="Heading 2 Char"/>
-    <w:link w:val="Heading2"/>
+  <w:style w:type="character" w:customStyle="1" w:styleId="Kop2Char">
+    <w:name w:val="Kop 2 Char"/>
+    <w:link w:val="Kop2"/>
     <w:uiPriority w:val="9"/>
     <w:rsid w:val="00254AF4"/>
     <w:rPr>
@@ -3166,9 +3449,9 @@
       <w:sz w:val="24"/>
     </w:rPr>
   </w:style>
-  <w:style w:type="character" w:customStyle="1" w:styleId="Heading1Char">
-    <w:name w:val="Heading 1 Char"/>
-    <w:link w:val="Heading1"/>
+  <w:style w:type="character" w:customStyle="1" w:styleId="Kop1Char">
+    <w:name w:val="Kop 1 Char"/>
+    <w:link w:val="Kop1"/>
     <w:uiPriority w:val="9"/>
     <w:rsid w:val="00842611"/>
     <w:rPr>
@@ -3179,9 +3462,9 @@
       <w:sz w:val="28"/>
     </w:rPr>
   </w:style>
-  <w:style w:type="character" w:customStyle="1" w:styleId="Heading3Char">
-    <w:name w:val="Heading 3 Char"/>
-    <w:link w:val="Heading3"/>
+  <w:style w:type="character" w:customStyle="1" w:styleId="Kop3Char">
+    <w:name w:val="Kop 3 Char"/>
+    <w:link w:val="Kop3"/>
     <w:uiPriority w:val="9"/>
     <w:rsid w:val="00753826"/>
     <w:rPr>
@@ -3204,9 +3487,9 @@
       </w:tblCellMar>
     </w:tblPr>
   </w:style>
-  <w:style w:type="table" w:styleId="TableGrid0">
+  <w:style w:type="table" w:styleId="Tabelraster">
     <w:name w:val="Table Grid"/>
-    <w:basedOn w:val="TableNormal"/>
+    <w:basedOn w:val="Standaardtabel"/>
     <w:rsid w:val="0020758F"/>
     <w:pPr>
       <w:spacing w:line="240" w:lineRule="auto"/>
@@ -3222,10 +3505,10 @@
       </w:tblBorders>
     </w:tblPr>
   </w:style>
-  <w:style w:type="paragraph" w:styleId="ListParagraph">
+  <w:style w:type="paragraph" w:styleId="Lijstalinea">
     <w:name w:val="List Paragraph"/>
-    <w:basedOn w:val="Normal"/>
-    <w:link w:val="ListParagraphChar"/>
+    <w:basedOn w:val="Standaard"/>
+    <w:link w:val="LijstalineaChar"/>
     <w:uiPriority w:val="34"/>
     <w:qFormat/>
     <w:rsid w:val="003133C9"/>
@@ -3234,10 +3517,10 @@
       <w:contextualSpacing/>
     </w:pPr>
   </w:style>
-  <w:style w:type="paragraph" w:styleId="BalloonText">
+  <w:style w:type="paragraph" w:styleId="Ballontekst">
     <w:name w:val="Balloon Text"/>
-    <w:basedOn w:val="Normal"/>
-    <w:link w:val="BalloonTextChar"/>
+    <w:basedOn w:val="Standaard"/>
+    <w:link w:val="BallontekstChar"/>
     <w:uiPriority w:val="99"/>
     <w:semiHidden/>
     <w:unhideWhenUsed/>
@@ -3251,10 +3534,10 @@
       <w:szCs w:val="18"/>
     </w:rPr>
   </w:style>
-  <w:style w:type="character" w:customStyle="1" w:styleId="BalloonTextChar">
-    <w:name w:val="Balloon Text Char"/>
-    <w:basedOn w:val="DefaultParagraphFont"/>
-    <w:link w:val="BalloonText"/>
+  <w:style w:type="character" w:customStyle="1" w:styleId="BallontekstChar">
+    <w:name w:val="Ballontekst Char"/>
+    <w:basedOn w:val="Standaardalinea-lettertype"/>
+    <w:link w:val="Ballontekst"/>
     <w:uiPriority w:val="99"/>
     <w:semiHidden/>
     <w:rsid w:val="004870F8"/>
@@ -3265,9 +3548,9 @@
       <w:szCs w:val="18"/>
     </w:rPr>
   </w:style>
-  <w:style w:type="character" w:styleId="CommentReference">
+  <w:style w:type="character" w:styleId="Verwijzingopmerking">
     <w:name w:val="annotation reference"/>
-    <w:basedOn w:val="DefaultParagraphFont"/>
+    <w:basedOn w:val="Standaardalinea-lettertype"/>
     <w:uiPriority w:val="99"/>
     <w:semiHidden/>
     <w:unhideWhenUsed/>
@@ -3277,10 +3560,10 @@
       <w:szCs w:val="16"/>
     </w:rPr>
   </w:style>
-  <w:style w:type="paragraph" w:styleId="CommentText">
+  <w:style w:type="paragraph" w:styleId="Tekstopmerking">
     <w:name w:val="annotation text"/>
-    <w:basedOn w:val="Normal"/>
-    <w:link w:val="CommentTextChar"/>
+    <w:basedOn w:val="Standaard"/>
+    <w:link w:val="TekstopmerkingChar"/>
     <w:uiPriority w:val="99"/>
     <w:semiHidden/>
     <w:unhideWhenUsed/>
@@ -3292,10 +3575,10 @@
       <w:szCs w:val="20"/>
     </w:rPr>
   </w:style>
-  <w:style w:type="character" w:customStyle="1" w:styleId="CommentTextChar">
-    <w:name w:val="Comment Text Char"/>
-    <w:basedOn w:val="DefaultParagraphFont"/>
-    <w:link w:val="CommentText"/>
+  <w:style w:type="character" w:customStyle="1" w:styleId="TekstopmerkingChar">
+    <w:name w:val="Tekst opmerking Char"/>
+    <w:basedOn w:val="Standaardalinea-lettertype"/>
+    <w:link w:val="Tekstopmerking"/>
     <w:uiPriority w:val="99"/>
     <w:semiHidden/>
     <w:rsid w:val="006734C3"/>
@@ -3306,11 +3589,11 @@
       <w:szCs w:val="20"/>
     </w:rPr>
   </w:style>
-  <w:style w:type="paragraph" w:styleId="CommentSubject">
+  <w:style w:type="paragraph" w:styleId="Onderwerpvanopmerking">
     <w:name w:val="annotation subject"/>
-    <w:basedOn w:val="CommentText"/>
-    <w:next w:val="CommentText"/>
-    <w:link w:val="CommentSubjectChar"/>
+    <w:basedOn w:val="Tekstopmerking"/>
+    <w:next w:val="Tekstopmerking"/>
+    <w:link w:val="OnderwerpvanopmerkingChar"/>
     <w:uiPriority w:val="99"/>
     <w:semiHidden/>
     <w:unhideWhenUsed/>
@@ -3320,10 +3603,10 @@
       <w:bCs/>
     </w:rPr>
   </w:style>
-  <w:style w:type="character" w:customStyle="1" w:styleId="CommentSubjectChar">
-    <w:name w:val="Comment Subject Char"/>
-    <w:basedOn w:val="CommentTextChar"/>
-    <w:link w:val="CommentSubject"/>
+  <w:style w:type="character" w:customStyle="1" w:styleId="OnderwerpvanopmerkingChar">
+    <w:name w:val="Onderwerp van opmerking Char"/>
+    <w:basedOn w:val="TekstopmerkingChar"/>
+    <w:link w:val="Onderwerpvanopmerking"/>
     <w:uiPriority w:val="99"/>
     <w:semiHidden/>
     <w:rsid w:val="006734C3"/>
@@ -3338,7 +3621,7 @@
   </w:style>
   <w:style w:type="character" w:styleId="Hyperlink">
     <w:name w:val="Hyperlink"/>
-    <w:basedOn w:val="DefaultParagraphFont"/>
+    <w:basedOn w:val="Standaardalinea-lettertype"/>
     <w:uiPriority w:val="99"/>
     <w:unhideWhenUsed/>
     <w:rsid w:val="00004A9E"/>
@@ -3347,9 +3630,9 @@
       <w:u w:val="single"/>
     </w:rPr>
   </w:style>
-  <w:style w:type="paragraph" w:styleId="NormalWeb">
+  <w:style w:type="paragraph" w:styleId="Normaalweb">
     <w:name w:val="Normal (Web)"/>
-    <w:basedOn w:val="Normal"/>
+    <w:basedOn w:val="Standaard"/>
     <w:uiPriority w:val="99"/>
     <w:unhideWhenUsed/>
     <w:rsid w:val="004569F0"/>
@@ -3363,10 +3646,10 @@
       <w:szCs w:val="24"/>
     </w:rPr>
   </w:style>
-  <w:style w:type="paragraph" w:styleId="FootnoteText">
+  <w:style w:type="paragraph" w:styleId="Voetnoottekst">
     <w:name w:val="footnote text"/>
-    <w:basedOn w:val="Normal"/>
-    <w:link w:val="FootnoteTextChar"/>
+    <w:basedOn w:val="Standaard"/>
+    <w:link w:val="VoetnoottekstChar"/>
     <w:uiPriority w:val="99"/>
     <w:semiHidden/>
     <w:unhideWhenUsed/>
@@ -3378,10 +3661,10 @@
       <w:szCs w:val="20"/>
     </w:rPr>
   </w:style>
-  <w:style w:type="character" w:customStyle="1" w:styleId="FootnoteTextChar">
-    <w:name w:val="Footnote Text Char"/>
-    <w:basedOn w:val="DefaultParagraphFont"/>
-    <w:link w:val="FootnoteText"/>
+  <w:style w:type="character" w:customStyle="1" w:styleId="VoetnoottekstChar">
+    <w:name w:val="Voetnoottekst Char"/>
+    <w:basedOn w:val="Standaardalinea-lettertype"/>
+    <w:link w:val="Voetnoottekst"/>
     <w:uiPriority w:val="99"/>
     <w:semiHidden/>
     <w:rsid w:val="009C7059"/>
@@ -3392,9 +3675,9 @@
       <w:szCs w:val="20"/>
     </w:rPr>
   </w:style>
-  <w:style w:type="character" w:styleId="FootnoteReference">
+  <w:style w:type="character" w:styleId="Voetnootmarkering">
     <w:name w:val="footnote reference"/>
-    <w:basedOn w:val="DefaultParagraphFont"/>
+    <w:basedOn w:val="Standaardalinea-lettertype"/>
     <w:uiPriority w:val="99"/>
     <w:unhideWhenUsed/>
     <w:rsid w:val="009C7059"/>
@@ -3402,10 +3685,10 @@
       <w:vertAlign w:val="superscript"/>
     </w:rPr>
   </w:style>
-  <w:style w:type="paragraph" w:styleId="TOCHeading">
+  <w:style w:type="paragraph" w:styleId="Kopvaninhoudsopgave">
     <w:name w:val="TOC Heading"/>
-    <w:basedOn w:val="Heading1"/>
-    <w:next w:val="Normal"/>
+    <w:basedOn w:val="Kop1"/>
+    <w:next w:val="Standaard"/>
     <w:uiPriority w:val="39"/>
     <w:unhideWhenUsed/>
     <w:rsid w:val="004C20F1"/>
@@ -3422,10 +3705,10 @@
       <w:lang w:val="en-US" w:eastAsia="en-US"/>
     </w:rPr>
   </w:style>
-  <w:style w:type="paragraph" w:styleId="TOC2">
+  <w:style w:type="paragraph" w:styleId="Inhopg2">
     <w:name w:val="toc 2"/>
-    <w:basedOn w:val="Normal"/>
-    <w:next w:val="Normal"/>
+    <w:basedOn w:val="Standaard"/>
+    <w:next w:val="Standaard"/>
     <w:autoRedefine/>
     <w:uiPriority w:val="39"/>
     <w:unhideWhenUsed/>
@@ -3441,10 +3724,10 @@
       <w:noProof/>
     </w:rPr>
   </w:style>
-  <w:style w:type="paragraph" w:styleId="TOC1">
+  <w:style w:type="paragraph" w:styleId="Inhopg1">
     <w:name w:val="toc 1"/>
-    <w:basedOn w:val="Normal"/>
-    <w:next w:val="Normal"/>
+    <w:basedOn w:val="Standaard"/>
+    <w:next w:val="Standaard"/>
     <w:autoRedefine/>
     <w:uiPriority w:val="39"/>
     <w:unhideWhenUsed/>
@@ -3463,10 +3746,10 @@
       <w:color w:val="000000" w:themeColor="text1"/>
     </w:rPr>
   </w:style>
-  <w:style w:type="paragraph" w:styleId="TOC3">
+  <w:style w:type="paragraph" w:styleId="Inhopg3">
     <w:name w:val="toc 3"/>
-    <w:basedOn w:val="Normal"/>
-    <w:next w:val="Normal"/>
+    <w:basedOn w:val="Standaard"/>
+    <w:next w:val="Standaard"/>
     <w:autoRedefine/>
     <w:uiPriority w:val="39"/>
     <w:unhideWhenUsed/>
@@ -3480,10 +3763,10 @@
       <w:ind w:left="567"/>
     </w:pPr>
   </w:style>
-  <w:style w:type="character" w:customStyle="1" w:styleId="ListParagraphChar">
-    <w:name w:val="List Paragraph Char"/>
-    <w:basedOn w:val="DefaultParagraphFont"/>
-    <w:link w:val="ListParagraph"/>
+  <w:style w:type="character" w:customStyle="1" w:styleId="LijstalineaChar">
+    <w:name w:val="Lijstalinea Char"/>
+    <w:basedOn w:val="Standaardalinea-lettertype"/>
+    <w:link w:val="Lijstalinea"/>
     <w:uiPriority w:val="34"/>
     <w:rsid w:val="00844E0A"/>
     <w:rPr>
@@ -3492,7 +3775,7 @@
       <w:sz w:val="20"/>
     </w:rPr>
   </w:style>
-  <w:style w:type="paragraph" w:styleId="NoSpacing">
+  <w:style w:type="paragraph" w:styleId="Geenafstand">
     <w:name w:val="No Spacing"/>
     <w:uiPriority w:val="1"/>
     <w:rsid w:val="00ED3C2E"/>
@@ -3506,9 +3789,9 @@
       <w:sz w:val="20"/>
     </w:rPr>
   </w:style>
-  <w:style w:type="character" w:styleId="FollowedHyperlink">
+  <w:style w:type="character" w:styleId="GevolgdeHyperlink">
     <w:name w:val="FollowedHyperlink"/>
-    <w:basedOn w:val="DefaultParagraphFont"/>
+    <w:basedOn w:val="Standaardalinea-lettertype"/>
     <w:uiPriority w:val="99"/>
     <w:semiHidden/>
     <w:unhideWhenUsed/>
@@ -3518,10 +3801,10 @@
       <w:u w:val="single"/>
     </w:rPr>
   </w:style>
-  <w:style w:type="paragraph" w:styleId="Footer">
+  <w:style w:type="paragraph" w:styleId="Voettekst">
     <w:name w:val="footer"/>
-    <w:basedOn w:val="Normal"/>
-    <w:link w:val="FooterChar"/>
+    <w:basedOn w:val="Standaard"/>
+    <w:link w:val="VoettekstChar"/>
     <w:uiPriority w:val="99"/>
     <w:unhideWhenUsed/>
     <w:rsid w:val="00B25FE7"/>
@@ -3537,10 +3820,10 @@
       <w:sz w:val="16"/>
     </w:rPr>
   </w:style>
-  <w:style w:type="character" w:customStyle="1" w:styleId="FooterChar">
-    <w:name w:val="Footer Char"/>
-    <w:basedOn w:val="DefaultParagraphFont"/>
-    <w:link w:val="Footer"/>
+  <w:style w:type="character" w:customStyle="1" w:styleId="VoettekstChar">
+    <w:name w:val="Voettekst Char"/>
+    <w:basedOn w:val="Standaardalinea-lettertype"/>
+    <w:link w:val="Voettekst"/>
     <w:uiPriority w:val="99"/>
     <w:rsid w:val="00B25FE7"/>
     <w:rPr>
@@ -3548,9 +3831,9 @@
       <w:sz w:val="16"/>
     </w:rPr>
   </w:style>
-  <w:style w:type="character" w:styleId="Emphasis">
+  <w:style w:type="character" w:styleId="Nadruk">
     <w:name w:val="Emphasis"/>
-    <w:basedOn w:val="DefaultParagraphFont"/>
+    <w:basedOn w:val="Standaardalinea-lettertype"/>
     <w:uiPriority w:val="20"/>
     <w:rsid w:val="00546D19"/>
     <w:rPr>
@@ -3558,10 +3841,10 @@
       <w:iCs/>
     </w:rPr>
   </w:style>
-  <w:style w:type="paragraph" w:styleId="PlainText">
+  <w:style w:type="paragraph" w:styleId="Tekstzonderopmaak">
     <w:name w:val="Plain Text"/>
-    <w:basedOn w:val="Normal"/>
-    <w:link w:val="PlainTextChar"/>
+    <w:basedOn w:val="Standaard"/>
+    <w:link w:val="TekstzonderopmaakChar"/>
     <w:uiPriority w:val="99"/>
     <w:semiHidden/>
     <w:unhideWhenUsed/>
@@ -3577,10 +3860,10 @@
       <w:lang w:eastAsia="en-US"/>
     </w:rPr>
   </w:style>
-  <w:style w:type="character" w:customStyle="1" w:styleId="PlainTextChar">
-    <w:name w:val="Plain Text Char"/>
-    <w:basedOn w:val="DefaultParagraphFont"/>
-    <w:link w:val="PlainText"/>
+  <w:style w:type="character" w:customStyle="1" w:styleId="TekstzonderopmaakChar">
+    <w:name w:val="Tekst zonder opmaak Char"/>
+    <w:basedOn w:val="Standaardalinea-lettertype"/>
+    <w:link w:val="Tekstzonderopmaak"/>
     <w:uiPriority w:val="99"/>
     <w:semiHidden/>
     <w:rsid w:val="00A1042F"/>
@@ -3592,8 +3875,8 @@
   </w:style>
   <w:style w:type="paragraph" w:customStyle="1" w:styleId="Kop1-geennr">
     <w:name w:val="Kop 1 - geen nr"/>
-    <w:basedOn w:val="Normal"/>
-    <w:next w:val="Normal"/>
+    <w:basedOn w:val="Standaard"/>
+    <w:next w:val="Standaard"/>
     <w:uiPriority w:val="8"/>
     <w:qFormat/>
     <w:rsid w:val="00842611"/>
@@ -3608,10 +3891,10 @@
       <w:szCs w:val="32"/>
     </w:rPr>
   </w:style>
-  <w:style w:type="character" w:customStyle="1" w:styleId="Heading4Char">
-    <w:name w:val="Heading 4 Char"/>
-    <w:basedOn w:val="DefaultParagraphFont"/>
-    <w:link w:val="Heading4"/>
+  <w:style w:type="character" w:customStyle="1" w:styleId="Kop4Char">
+    <w:name w:val="Kop 4 Char"/>
+    <w:basedOn w:val="Standaardalinea-lettertype"/>
+    <w:link w:val="Kop4"/>
     <w:uiPriority w:val="9"/>
     <w:rsid w:val="003E475C"/>
     <w:rPr>
@@ -3621,10 +3904,10 @@
       <w:u w:val="single"/>
     </w:rPr>
   </w:style>
-  <w:style w:type="character" w:customStyle="1" w:styleId="Heading5Char">
-    <w:name w:val="Heading 5 Char"/>
-    <w:basedOn w:val="DefaultParagraphFont"/>
-    <w:link w:val="Heading5"/>
+  <w:style w:type="character" w:customStyle="1" w:styleId="Kop5Char">
+    <w:name w:val="Kop 5 Char"/>
+    <w:basedOn w:val="Standaardalinea-lettertype"/>
+    <w:link w:val="Kop5"/>
     <w:uiPriority w:val="9"/>
     <w:semiHidden/>
     <w:rsid w:val="00254AF4"/>
@@ -3634,10 +3917,10 @@
       <w:sz w:val="20"/>
     </w:rPr>
   </w:style>
-  <w:style w:type="character" w:customStyle="1" w:styleId="Heading6Char">
-    <w:name w:val="Heading 6 Char"/>
-    <w:basedOn w:val="DefaultParagraphFont"/>
-    <w:link w:val="Heading6"/>
+  <w:style w:type="character" w:customStyle="1" w:styleId="Kop6Char">
+    <w:name w:val="Kop 6 Char"/>
+    <w:basedOn w:val="Standaardalinea-lettertype"/>
+    <w:link w:val="Kop6"/>
     <w:uiPriority w:val="9"/>
     <w:semiHidden/>
     <w:rsid w:val="00254AF4"/>
@@ -3647,10 +3930,10 @@
       <w:sz w:val="20"/>
     </w:rPr>
   </w:style>
-  <w:style w:type="character" w:customStyle="1" w:styleId="Heading7Char">
-    <w:name w:val="Heading 7 Char"/>
-    <w:basedOn w:val="DefaultParagraphFont"/>
-    <w:link w:val="Heading7"/>
+  <w:style w:type="character" w:customStyle="1" w:styleId="Kop7Char">
+    <w:name w:val="Kop 7 Char"/>
+    <w:basedOn w:val="Standaardalinea-lettertype"/>
+    <w:link w:val="Kop7"/>
     <w:uiPriority w:val="9"/>
     <w:semiHidden/>
     <w:rsid w:val="00254AF4"/>
@@ -3662,10 +3945,10 @@
       <w:sz w:val="20"/>
     </w:rPr>
   </w:style>
-  <w:style w:type="character" w:customStyle="1" w:styleId="Heading8Char">
-    <w:name w:val="Heading 8 Char"/>
-    <w:basedOn w:val="DefaultParagraphFont"/>
-    <w:link w:val="Heading8"/>
+  <w:style w:type="character" w:customStyle="1" w:styleId="Kop8Char">
+    <w:name w:val="Kop 8 Char"/>
+    <w:basedOn w:val="Standaardalinea-lettertype"/>
+    <w:link w:val="Kop8"/>
     <w:uiPriority w:val="9"/>
     <w:semiHidden/>
     <w:rsid w:val="00254AF4"/>
@@ -3676,10 +3959,10 @@
       <w:szCs w:val="21"/>
     </w:rPr>
   </w:style>
-  <w:style w:type="character" w:customStyle="1" w:styleId="Heading9Char">
-    <w:name w:val="Heading 9 Char"/>
-    <w:basedOn w:val="DefaultParagraphFont"/>
-    <w:link w:val="Heading9"/>
+  <w:style w:type="character" w:customStyle="1" w:styleId="Kop9Char">
+    <w:name w:val="Kop 9 Char"/>
+    <w:basedOn w:val="Standaardalinea-lettertype"/>
+    <w:link w:val="Kop9"/>
     <w:uiPriority w:val="9"/>
     <w:semiHidden/>
     <w:rsid w:val="00254AF4"/>
@@ -3694,7 +3977,7 @@
   </w:style>
   <w:style w:type="table" w:customStyle="1" w:styleId="MijnTabel">
     <w:name w:val="Mijn Tabel"/>
-    <w:basedOn w:val="TableNormal"/>
+    <w:basedOn w:val="Standaardtabel"/>
     <w:uiPriority w:val="99"/>
     <w:rsid w:val="0032742D"/>
     <w:pPr>
@@ -3733,10 +4016,10 @@
       </w:tcPr>
     </w:tblStylePr>
   </w:style>
-  <w:style w:type="paragraph" w:styleId="Title">
+  <w:style w:type="paragraph" w:styleId="Titel">
     <w:name w:val="Title"/>
-    <w:basedOn w:val="Normal"/>
-    <w:link w:val="TitleChar"/>
+    <w:basedOn w:val="Standaard"/>
+    <w:link w:val="TitelChar"/>
     <w:uiPriority w:val="10"/>
     <w:qFormat/>
     <w:rsid w:val="00753826"/>
@@ -3751,10 +4034,10 @@
       <w:szCs w:val="40"/>
     </w:rPr>
   </w:style>
-  <w:style w:type="character" w:customStyle="1" w:styleId="TitleChar">
-    <w:name w:val="Title Char"/>
-    <w:basedOn w:val="DefaultParagraphFont"/>
-    <w:link w:val="Title"/>
+  <w:style w:type="character" w:customStyle="1" w:styleId="TitelChar">
+    <w:name w:val="Titel Char"/>
+    <w:basedOn w:val="Standaardalinea-lettertype"/>
+    <w:link w:val="Titel"/>
     <w:uiPriority w:val="10"/>
     <w:rsid w:val="00753826"/>
     <w:rPr>
@@ -3768,8 +4051,8 @@
   </w:style>
   <w:style w:type="paragraph" w:customStyle="1" w:styleId="Bijlage">
     <w:name w:val="Bijlage"/>
-    <w:basedOn w:val="Normal"/>
-    <w:next w:val="Normal"/>
+    <w:basedOn w:val="Standaard"/>
+    <w:next w:val="Standaard"/>
     <w:uiPriority w:val="10"/>
     <w:qFormat/>
     <w:rsid w:val="004C20F1"/>
@@ -3787,10 +4070,10 @@
       <w:sz w:val="32"/>
     </w:rPr>
   </w:style>
-  <w:style w:type="paragraph" w:styleId="Subtitle">
+  <w:style w:type="paragraph" w:styleId="Ondertitel">
     <w:name w:val="Subtitle"/>
-    <w:basedOn w:val="Normal"/>
-    <w:link w:val="SubtitleChar"/>
+    <w:basedOn w:val="Standaard"/>
+    <w:link w:val="OndertitelChar"/>
     <w:uiPriority w:val="11"/>
     <w:qFormat/>
     <w:rsid w:val="00753826"/>
@@ -3802,10 +4085,10 @@
       <w:szCs w:val="32"/>
     </w:rPr>
   </w:style>
-  <w:style w:type="character" w:customStyle="1" w:styleId="SubtitleChar">
-    <w:name w:val="Subtitle Char"/>
-    <w:basedOn w:val="DefaultParagraphFont"/>
-    <w:link w:val="Subtitle"/>
+  <w:style w:type="character" w:customStyle="1" w:styleId="OndertitelChar">
+    <w:name w:val="Ondertitel Char"/>
+    <w:basedOn w:val="Standaardalinea-lettertype"/>
+    <w:link w:val="Ondertitel"/>
     <w:uiPriority w:val="11"/>
     <w:rsid w:val="00753826"/>
     <w:rPr>
@@ -3815,10 +4098,10 @@
       <w:szCs w:val="32"/>
     </w:rPr>
   </w:style>
-  <w:style w:type="paragraph" w:styleId="Header">
+  <w:style w:type="paragraph" w:styleId="Koptekst">
     <w:name w:val="header"/>
-    <w:basedOn w:val="Normal"/>
-    <w:link w:val="HeaderChar"/>
+    <w:basedOn w:val="Standaard"/>
+    <w:link w:val="KoptekstChar"/>
     <w:uiPriority w:val="99"/>
     <w:unhideWhenUsed/>
     <w:rsid w:val="005326EA"/>
@@ -3830,10 +4113,10 @@
       <w:spacing w:line="240" w:lineRule="auto"/>
     </w:pPr>
   </w:style>
-  <w:style w:type="character" w:customStyle="1" w:styleId="HeaderChar">
-    <w:name w:val="Header Char"/>
-    <w:basedOn w:val="DefaultParagraphFont"/>
-    <w:link w:val="Header"/>
+  <w:style w:type="character" w:customStyle="1" w:styleId="KoptekstChar">
+    <w:name w:val="Koptekst Char"/>
+    <w:basedOn w:val="Standaardalinea-lettertype"/>
+    <w:link w:val="Koptekst"/>
     <w:uiPriority w:val="99"/>
     <w:rsid w:val="005326EA"/>
     <w:rPr>
@@ -3842,9 +4125,9 @@
       <w:sz w:val="20"/>
     </w:rPr>
   </w:style>
-  <w:style w:type="character" w:styleId="PlaceholderText">
+  <w:style w:type="character" w:styleId="Tekstvantijdelijkeaanduiding">
     <w:name w:val="Placeholder Text"/>
-    <w:basedOn w:val="DefaultParagraphFont"/>
+    <w:basedOn w:val="Standaardalinea-lettertype"/>
     <w:uiPriority w:val="99"/>
     <w:semiHidden/>
     <w:rsid w:val="005326EA"/>
@@ -3854,7 +4137,7 @@
   </w:style>
   <w:style w:type="paragraph" w:customStyle="1" w:styleId="Auteur">
     <w:name w:val="Auteur"/>
-    <w:basedOn w:val="Normal"/>
+    <w:basedOn w:val="Standaard"/>
     <w:uiPriority w:val="12"/>
     <w:qFormat/>
     <w:rsid w:val="005326EA"/>
@@ -3868,7 +4151,7 @@
 </file>
 
 <file path=word/glossary/document.xml><?xml version="1.0" encoding="utf-8"?>
-<w:glossaryDocument xmlns:wpc="http://schemas.microsoft.com/office/word/2010/wordprocessingCanvas" xmlns:cx="http://schemas.microsoft.com/office/drawing/2014/chartex" xmlns:cx1="http://schemas.microsoft.com/office/drawing/2015/9/8/chartex" xmlns:cx2="http://schemas.microsoft.com/office/drawing/2015/10/21/chartex" xmlns:cx3="http://schemas.microsoft.com/office/drawing/2016/5/9/chartex" xmlns:cx4="http://schemas.microsoft.com/office/drawing/2016/5/10/chartex" xmlns:cx5="http://schemas.microsoft.com/office/drawing/2016/5/11/chartex" xmlns:cx6="http://schemas.microsoft.com/office/drawing/2016/5/12/chartex" xmlns:cx7="http://schemas.microsoft.com/office/drawing/2016/5/13/chartex" xmlns:cx8="http://schemas.microsoft.com/office/drawing/2016/5/14/chartex" xmlns:mc="http://schemas.openxmlformats.org/markup-compatibility/2006" xmlns:aink="http://schemas.microsoft.com/office/drawing/2016/ink" xmlns:am3d="http://schemas.microsoft.com/office/drawing/2017/model3d" xmlns:o="urn:schemas-microsoft-com:office:office" xmlns:r="http://schemas.openxmlformats.org/officeDocument/2006/relationships" xmlns:m="http://schemas.openxmlformats.org/officeDocument/2006/math" xmlns:v="urn:schemas-microsoft-com:vml" xmlns:wp14="http://schemas.microsoft.com/office/word/2010/wordprocessingDrawing" xmlns:wp="http://schemas.openxmlformats.org/drawingml/2006/wordprocessingDrawing" xmlns:w10="urn:schemas-microsoft-com:office:word" xmlns:w="http://schemas.openxmlformats.org/wordprocessingml/2006/main" xmlns:w14="http://schemas.microsoft.com/office/word/2010/wordml" xmlns:w15="http://schemas.microsoft.com/office/word/2012/wordml" xmlns:w16cex="http://schemas.microsoft.com/office/word/2018/wordml/cex" xmlns:w16cid="http://schemas.microsoft.com/office/word/2016/wordml/cid" xmlns:w16="http://schemas.microsoft.com/office/word/2018/wordml" xmlns:w16sdtdh="http://schemas.microsoft.com/office/word/2020/wordml/sdtdatahash" xmlns:w16se="http://schemas.microsoft.com/office/word/2015/wordml/symex" xmlns:wpg="http://schemas.microsoft.com/office/word/2010/wordprocessingGroup" xmlns:wpi="http://schemas.microsoft.com/office/word/2010/wordprocessingInk" xmlns:wne="http://schemas.microsoft.com/office/word/2006/wordml" xmlns:wps="http://schemas.microsoft.com/office/word/2010/wordprocessingShape" mc:Ignorable="w14 w15 w16se w16cid w16 w16cex w16sdtdh wp14">
+<w:glossaryDocument xmlns:wpc="http://schemas.microsoft.com/office/word/2010/wordprocessingCanvas" xmlns:cx="http://schemas.microsoft.com/office/drawing/2014/chartex" xmlns:cx1="http://schemas.microsoft.com/office/drawing/2015/9/8/chartex" xmlns:cx2="http://schemas.microsoft.com/office/drawing/2015/10/21/chartex" xmlns:cx3="http://schemas.microsoft.com/office/drawing/2016/5/9/chartex" xmlns:cx4="http://schemas.microsoft.com/office/drawing/2016/5/10/chartex" xmlns:cx5="http://schemas.microsoft.com/office/drawing/2016/5/11/chartex" xmlns:cx6="http://schemas.microsoft.com/office/drawing/2016/5/12/chartex" xmlns:cx7="http://schemas.microsoft.com/office/drawing/2016/5/13/chartex" xmlns:cx8="http://schemas.microsoft.com/office/drawing/2016/5/14/chartex" xmlns:mc="http://schemas.openxmlformats.org/markup-compatibility/2006" xmlns:aink="http://schemas.microsoft.com/office/drawing/2016/ink" xmlns:am3d="http://schemas.microsoft.com/office/drawing/2017/model3d" xmlns:o="urn:schemas-microsoft-com:office:office" xmlns:oel="http://schemas.microsoft.com/office/2019/extlst" xmlns:r="http://schemas.openxmlformats.org/officeDocument/2006/relationships" xmlns:m="http://schemas.openxmlformats.org/officeDocument/2006/math" xmlns:v="urn:schemas-microsoft-com:vml" xmlns:wp14="http://schemas.microsoft.com/office/word/2010/wordprocessingDrawing" xmlns:wp="http://schemas.openxmlformats.org/drawingml/2006/wordprocessingDrawing" xmlns:w10="urn:schemas-microsoft-com:office:word" xmlns:w="http://schemas.openxmlformats.org/wordprocessingml/2006/main" xmlns:w14="http://schemas.microsoft.com/office/word/2010/wordml" xmlns:w15="http://schemas.microsoft.com/office/word/2012/wordml" xmlns:w16cex="http://schemas.microsoft.com/office/word/2018/wordml/cex" xmlns:w16cid="http://schemas.microsoft.com/office/word/2016/wordml/cid" xmlns:w16="http://schemas.microsoft.com/office/word/2018/wordml" xmlns:w16du="http://schemas.microsoft.com/office/word/2023/wordml/word16du" xmlns:w16sdtdh="http://schemas.microsoft.com/office/word/2020/wordml/sdtdatahash" xmlns:w16sdtfl="http://schemas.microsoft.com/office/word/2024/wordml/sdtformatlock" xmlns:w16se="http://schemas.microsoft.com/office/word/2015/wordml/symex" xmlns:wpg="http://schemas.microsoft.com/office/word/2010/wordprocessingGroup" xmlns:wpi="http://schemas.microsoft.com/office/word/2010/wordprocessingInk" xmlns:wne="http://schemas.microsoft.com/office/word/2006/wordml" xmlns:wps="http://schemas.microsoft.com/office/word/2010/wordprocessingShape" mc:Ignorable="w14 w15 w16se w16cid w16 w16cex w16sdtdh w16sdtfl w16du wp14">
   <w:docParts>
     <w:docPart>
       <w:docPartPr>
@@ -3889,91 +4172,9 @@
         <w:p>
           <w:r>
             <w:rPr>
-              <w:rStyle w:val="PlaceholderText"/>
+              <w:rStyle w:val="Tekstvantijdelijkeaanduiding"/>
             </w:rPr>
             <w:t>[Onderwerp]</w:t>
-          </w:r>
-        </w:p>
-      </w:docPartBody>
-    </w:docPart>
-    <w:docPart>
-      <w:docPartPr>
-        <w:name w:val="1A68DFEB80AE484CB30C897E5AFE95E1"/>
-        <w:category>
-          <w:name w:val="Algemeen"/>
-          <w:gallery w:val="placeholder"/>
-        </w:category>
-        <w:types>
-          <w:type w:val="bbPlcHdr"/>
-        </w:types>
-        <w:behaviors>
-          <w:behavior w:val="content"/>
-        </w:behaviors>
-        <w:guid w:val="{6BF9BE90-0662-46E5-A3D5-D7A5A0606798}"/>
-      </w:docPartPr>
-      <w:docPartBody>
-        <w:p>
-          <w:pPr>
-            <w:pStyle w:val="1A68DFEB80AE484CB30C897E5AFE95E15"/>
-          </w:pPr>
-          <w:r>
-            <w:rPr>
-              <w:rStyle w:val="PlaceholderText"/>
-            </w:rPr>
-            <w:t>[</w:t>
-          </w:r>
-          <w:r>
-            <w:rPr>
-              <w:rStyle w:val="PlaceholderText"/>
-            </w:rPr>
-            <w:t>ondertitel</w:t>
-          </w:r>
-          <w:r>
-            <w:rPr>
-              <w:rStyle w:val="PlaceholderText"/>
-            </w:rPr>
-            <w:t>]</w:t>
-          </w:r>
-        </w:p>
-      </w:docPartBody>
-    </w:docPart>
-    <w:docPart>
-      <w:docPartPr>
-        <w:name w:val="A7076FB95A574DBDAAFADC8377B4AE6F"/>
-        <w:category>
-          <w:name w:val="Algemeen"/>
-          <w:gallery w:val="placeholder"/>
-        </w:category>
-        <w:types>
-          <w:type w:val="bbPlcHdr"/>
-        </w:types>
-        <w:behaviors>
-          <w:behavior w:val="content"/>
-        </w:behaviors>
-        <w:guid w:val="{5A9605AB-A0A1-41FC-929E-6EF470EB323D}"/>
-      </w:docPartPr>
-      <w:docPartBody>
-        <w:p>
-          <w:pPr>
-            <w:pStyle w:val="A7076FB95A574DBDAAFADC8377B4AE6F3"/>
-          </w:pPr>
-          <w:r>
-            <w:rPr>
-              <w:rStyle w:val="PlaceholderText"/>
-            </w:rPr>
-            <w:t>[</w:t>
-          </w:r>
-          <w:r>
-            <w:rPr>
-              <w:rStyle w:val="PlaceholderText"/>
-            </w:rPr>
-            <w:t>auteur(s)</w:t>
-          </w:r>
-          <w:r>
-            <w:rPr>
-              <w:rStyle w:val="PlaceholderText"/>
-            </w:rPr>
-            <w:t>]</w:t>
           </w:r>
         </w:p>
       </w:docPartBody>
@@ -4000,19 +4201,19 @@
           </w:pPr>
           <w:r>
             <w:rPr>
-              <w:rStyle w:val="PlaceholderText"/>
+              <w:rStyle w:val="Tekstvantijdelijkeaanduiding"/>
             </w:rPr>
             <w:t xml:space="preserve">[kies een </w:t>
           </w:r>
           <w:r>
             <w:rPr>
-              <w:rStyle w:val="PlaceholderText"/>
+              <w:rStyle w:val="Tekstvantijdelijkeaanduiding"/>
             </w:rPr>
             <w:t>datum</w:t>
           </w:r>
           <w:r>
             <w:rPr>
-              <w:rStyle w:val="PlaceholderText"/>
+              <w:rStyle w:val="Tekstvantijdelijkeaanduiding"/>
             </w:rPr>
             <w:t>]</w:t>
           </w:r>
@@ -4041,7 +4242,7 @@
           </w:pPr>
           <w:r>
             <w:rPr>
-              <w:rStyle w:val="PlaceholderText"/>
+              <w:rStyle w:val="Tekstvantijdelijkeaanduiding"/>
             </w:rPr>
             <w:t>[Klik hier als je tekst wilt invoeren, maak gebruik van de stijlen op de tab MIJN DOCUMENT voor het typen van (genummerde) koppen.]</w:t>
           </w:r>
@@ -4070,38 +4271,9 @@
           </w:pPr>
           <w:r>
             <w:rPr>
-              <w:rStyle w:val="PlaceholderText"/>
+              <w:rStyle w:val="Tekstvantijdelijkeaanduiding"/>
             </w:rPr>
             <w:t>[Klik hier als je tekst wilt invoeren.]</w:t>
-          </w:r>
-        </w:p>
-      </w:docPartBody>
-    </w:docPart>
-    <w:docPart>
-      <w:docPartPr>
-        <w:name w:val="71027C4CD6AD4262B8C97B5234E60A56"/>
-        <w:category>
-          <w:name w:val="Algemeen"/>
-          <w:gallery w:val="placeholder"/>
-        </w:category>
-        <w:types>
-          <w:type w:val="bbPlcHdr"/>
-        </w:types>
-        <w:behaviors>
-          <w:behavior w:val="content"/>
-        </w:behaviors>
-        <w:guid w:val="{0F5289DB-51A2-401D-836D-24A088DF73E7}"/>
-      </w:docPartPr>
-      <w:docPartBody>
-        <w:p>
-          <w:pPr>
-            <w:pStyle w:val="71027C4CD6AD4262B8C97B5234E60A562"/>
-          </w:pPr>
-          <w:r>
-            <w:rPr>
-              <w:rStyle w:val="PlaceholderText"/>
-            </w:rPr>
-            <w:t>[hoofdstuktitel]</w:t>
           </w:r>
         </w:p>
       </w:docPartBody>
@@ -4128,38 +4300,9 @@
           </w:pPr>
           <w:r>
             <w:rPr>
-              <w:rStyle w:val="PlaceholderText"/>
+              <w:rStyle w:val="Tekstvantijdelijkeaanduiding"/>
             </w:rPr>
             <w:t>[Paragraaftitel]</w:t>
-          </w:r>
-        </w:p>
-      </w:docPartBody>
-    </w:docPart>
-    <w:docPart>
-      <w:docPartPr>
-        <w:name w:val="49AD912F06B34D36BCD3F2F78C167564"/>
-        <w:category>
-          <w:name w:val="Algemeen"/>
-          <w:gallery w:val="placeholder"/>
-        </w:category>
-        <w:types>
-          <w:type w:val="bbPlcHdr"/>
-        </w:types>
-        <w:behaviors>
-          <w:behavior w:val="content"/>
-        </w:behaviors>
-        <w:guid w:val="{882A0D0B-9663-4841-8766-A2D6CD06F3F2}"/>
-      </w:docPartPr>
-      <w:docPartBody>
-        <w:p>
-          <w:pPr>
-            <w:pStyle w:val="49AD912F06B34D36BCD3F2F78C1675642"/>
-          </w:pPr>
-          <w:r>
-            <w:rPr>
-              <w:rStyle w:val="PlaceholderText"/>
-            </w:rPr>
-            <w:t>[Klik hier als je tekst wilt invoeren.]</w:t>
           </w:r>
         </w:p>
       </w:docPartBody>
@@ -4186,7 +4329,7 @@
           </w:pPr>
           <w:r>
             <w:rPr>
-              <w:rStyle w:val="PlaceholderText"/>
+              <w:rStyle w:val="Tekstvantijdelijkeaanduiding"/>
             </w:rPr>
             <w:t>[Onderwerp]</w:t>
           </w:r>
@@ -4198,7 +4341,7 @@
 </file>
 
 <file path=word/glossary/fontTable.xml><?xml version="1.0" encoding="utf-8"?>
-<w:fonts xmlns:mc="http://schemas.openxmlformats.org/markup-compatibility/2006" xmlns:r="http://schemas.openxmlformats.org/officeDocument/2006/relationships" xmlns:w="http://schemas.openxmlformats.org/wordprocessingml/2006/main" xmlns:w14="http://schemas.microsoft.com/office/word/2010/wordml" xmlns:w15="http://schemas.microsoft.com/office/word/2012/wordml" xmlns:w16cex="http://schemas.microsoft.com/office/word/2018/wordml/cex" xmlns:w16cid="http://schemas.microsoft.com/office/word/2016/wordml/cid" xmlns:w16="http://schemas.microsoft.com/office/word/2018/wordml" xmlns:w16sdtdh="http://schemas.microsoft.com/office/word/2020/wordml/sdtdatahash" xmlns:w16se="http://schemas.microsoft.com/office/word/2015/wordml/symex" mc:Ignorable="w14 w15 w16se w16cid w16 w16cex w16sdtdh">
+<w:fonts xmlns:mc="http://schemas.openxmlformats.org/markup-compatibility/2006" xmlns:r="http://schemas.openxmlformats.org/officeDocument/2006/relationships" xmlns:w="http://schemas.openxmlformats.org/wordprocessingml/2006/main" xmlns:w14="http://schemas.microsoft.com/office/word/2010/wordml" xmlns:w15="http://schemas.microsoft.com/office/word/2012/wordml" xmlns:w16cex="http://schemas.microsoft.com/office/word/2018/wordml/cex" xmlns:w16cid="http://schemas.microsoft.com/office/word/2016/wordml/cid" xmlns:w16="http://schemas.microsoft.com/office/word/2018/wordml" xmlns:w16du="http://schemas.microsoft.com/office/word/2023/wordml/word16du" xmlns:w16sdtdh="http://schemas.microsoft.com/office/word/2020/wordml/sdtdatahash" xmlns:w16sdtfl="http://schemas.microsoft.com/office/word/2024/wordml/sdtformatlock" xmlns:w16se="http://schemas.microsoft.com/office/word/2015/wordml/symex" mc:Ignorable="w14 w15 w16se w16cid w16 w16cex w16sdtdh w16sdtfl w16du">
   <w:font w:name="Symbol">
     <w:panose1 w:val="05050102010706020507"/>
     <w:charset w:val="02"/>
@@ -4253,7 +4396,7 @@
     <w:charset w:val="00"/>
     <w:family w:val="swiss"/>
     <w:pitch w:val="variable"/>
-    <w:sig w:usb0="E4002EFF" w:usb1="C000247B" w:usb2="00000009" w:usb3="00000000" w:csb0="000001FF" w:csb1="00000000"/>
+    <w:sig w:usb0="E4002EFF" w:usb1="C200247B" w:usb2="00000009" w:usb3="00000000" w:csb0="000001FF" w:csb1="00000000"/>
   </w:font>
   <w:font w:name="Arial Unicode MS">
     <w:panose1 w:val="020B0604020202020204"/>
@@ -4262,18 +4405,23 @@
     <w:pitch w:val="variable"/>
     <w:sig w:usb0="F7FFAFFF" w:usb1="E9DFFFFF" w:usb2="0000003F" w:usb3="00000000" w:csb0="003F01FF" w:csb1="00000000"/>
   </w:font>
-  <w:font w:name="Calibri Light">
-    <w:panose1 w:val="020F0302020204030204"/>
+  <w:font w:name="Aptos">
     <w:charset w:val="00"/>
     <w:family w:val="swiss"/>
     <w:pitch w:val="variable"/>
-    <w:sig w:usb0="E4002EFF" w:usb1="C000247B" w:usb2="00000009" w:usb3="00000000" w:csb0="000001FF" w:csb1="00000000"/>
+    <w:sig w:usb0="20000287" w:usb1="00000003" w:usb2="00000000" w:usb3="00000000" w:csb0="0000019F" w:csb1="00000000"/>
+  </w:font>
+  <w:font w:name="Aptos Display">
+    <w:charset w:val="00"/>
+    <w:family w:val="swiss"/>
+    <w:pitch w:val="variable"/>
+    <w:sig w:usb0="20000287" w:usb1="00000003" w:usb2="00000000" w:usb3="00000000" w:csb0="0000019F" w:csb1="00000000"/>
   </w:font>
 </w:fonts>
 </file>
 
 <file path=word/glossary/numbering.xml><?xml version="1.0" encoding="utf-8"?>
-<w:numbering xmlns:wpc="http://schemas.microsoft.com/office/word/2010/wordprocessingCanvas" xmlns:cx="http://schemas.microsoft.com/office/drawing/2014/chartex" xmlns:cx1="http://schemas.microsoft.com/office/drawing/2015/9/8/chartex" xmlns:cx2="http://schemas.microsoft.com/office/drawing/2015/10/21/chartex" xmlns:cx3="http://schemas.microsoft.com/office/drawing/2016/5/9/chartex" xmlns:cx4="http://schemas.microsoft.com/office/drawing/2016/5/10/chartex" xmlns:cx5="http://schemas.microsoft.com/office/drawing/2016/5/11/chartex" xmlns:cx6="http://schemas.microsoft.com/office/drawing/2016/5/12/chartex" xmlns:cx7="http://schemas.microsoft.com/office/drawing/2016/5/13/chartex" xmlns:cx8="http://schemas.microsoft.com/office/drawing/2016/5/14/chartex" xmlns:mc="http://schemas.openxmlformats.org/markup-compatibility/2006" xmlns:aink="http://schemas.microsoft.com/office/drawing/2016/ink" xmlns:am3d="http://schemas.microsoft.com/office/drawing/2017/model3d" xmlns:o="urn:schemas-microsoft-com:office:office" xmlns:r="http://schemas.openxmlformats.org/officeDocument/2006/relationships" xmlns:m="http://schemas.openxmlformats.org/officeDocument/2006/math" xmlns:v="urn:schemas-microsoft-com:vml" xmlns:wp14="http://schemas.microsoft.com/office/word/2010/wordprocessingDrawing" xmlns:wp="http://schemas.openxmlformats.org/drawingml/2006/wordprocessingDrawing" xmlns:w10="urn:schemas-microsoft-com:office:word" xmlns:w="http://schemas.openxmlformats.org/wordprocessingml/2006/main" xmlns:w14="http://schemas.microsoft.com/office/word/2010/wordml" xmlns:w15="http://schemas.microsoft.com/office/word/2012/wordml" xmlns:w16cex="http://schemas.microsoft.com/office/word/2018/wordml/cex" xmlns:w16cid="http://schemas.microsoft.com/office/word/2016/wordml/cid" xmlns:w16="http://schemas.microsoft.com/office/word/2018/wordml" xmlns:w16sdtdh="http://schemas.microsoft.com/office/word/2020/wordml/sdtdatahash" xmlns:w16se="http://schemas.microsoft.com/office/word/2015/wordml/symex" xmlns:wpg="http://schemas.microsoft.com/office/word/2010/wordprocessingGroup" xmlns:wpi="http://schemas.microsoft.com/office/word/2010/wordprocessingInk" xmlns:wne="http://schemas.microsoft.com/office/word/2006/wordml" xmlns:wps="http://schemas.microsoft.com/office/word/2010/wordprocessingShape" mc:Ignorable="w14 w15 w16se w16cid w16 w16cex w16sdtdh wp14">
+<w:numbering xmlns:wpc="http://schemas.microsoft.com/office/word/2010/wordprocessingCanvas" xmlns:cx="http://schemas.microsoft.com/office/drawing/2014/chartex" xmlns:cx1="http://schemas.microsoft.com/office/drawing/2015/9/8/chartex" xmlns:cx2="http://schemas.microsoft.com/office/drawing/2015/10/21/chartex" xmlns:cx3="http://schemas.microsoft.com/office/drawing/2016/5/9/chartex" xmlns:cx4="http://schemas.microsoft.com/office/drawing/2016/5/10/chartex" xmlns:cx5="http://schemas.microsoft.com/office/drawing/2016/5/11/chartex" xmlns:cx6="http://schemas.microsoft.com/office/drawing/2016/5/12/chartex" xmlns:cx7="http://schemas.microsoft.com/office/drawing/2016/5/13/chartex" xmlns:cx8="http://schemas.microsoft.com/office/drawing/2016/5/14/chartex" xmlns:mc="http://schemas.openxmlformats.org/markup-compatibility/2006" xmlns:aink="http://schemas.microsoft.com/office/drawing/2016/ink" xmlns:am3d="http://schemas.microsoft.com/office/drawing/2017/model3d" xmlns:o="urn:schemas-microsoft-com:office:office" xmlns:oel="http://schemas.microsoft.com/office/2019/extlst" xmlns:r="http://schemas.openxmlformats.org/officeDocument/2006/relationships" xmlns:m="http://schemas.openxmlformats.org/officeDocument/2006/math" xmlns:v="urn:schemas-microsoft-com:vml" xmlns:wp14="http://schemas.microsoft.com/office/word/2010/wordprocessingDrawing" xmlns:wp="http://schemas.openxmlformats.org/drawingml/2006/wordprocessingDrawing" xmlns:w10="urn:schemas-microsoft-com:office:word" xmlns:w="http://schemas.openxmlformats.org/wordprocessingml/2006/main" xmlns:w14="http://schemas.microsoft.com/office/word/2010/wordml" xmlns:w15="http://schemas.microsoft.com/office/word/2012/wordml" xmlns:w16cex="http://schemas.microsoft.com/office/word/2018/wordml/cex" xmlns:w16cid="http://schemas.microsoft.com/office/word/2016/wordml/cid" xmlns:w16="http://schemas.microsoft.com/office/word/2018/wordml" xmlns:w16du="http://schemas.microsoft.com/office/word/2023/wordml/word16du" xmlns:w16sdtdh="http://schemas.microsoft.com/office/word/2020/wordml/sdtdatahash" xmlns:w16sdtfl="http://schemas.microsoft.com/office/word/2024/wordml/sdtformatlock" xmlns:w16se="http://schemas.microsoft.com/office/word/2015/wordml/symex" xmlns:wpg="http://schemas.microsoft.com/office/word/2010/wordprocessingGroup" xmlns:wpi="http://schemas.microsoft.com/office/word/2010/wordprocessingInk" xmlns:wne="http://schemas.microsoft.com/office/word/2006/wordml" xmlns:wps="http://schemas.microsoft.com/office/word/2010/wordprocessingShape" mc:Ignorable="w14 w15 w16se w16cid w16 w16cex w16sdtdh w16sdtfl w16du wp14">
   <w:abstractNum w:abstractNumId="0" w15:restartNumberingAfterBreak="0">
     <w:nsid w:val="1DDD6310"/>
     <w:multiLevelType w:val="multilevel"/>
@@ -4387,14 +4535,14 @@
       </w:pPr>
     </w:lvl>
   </w:abstractNum>
-  <w:num w:numId="1">
+  <w:num w:numId="1" w16cid:durableId="920870045">
     <w:abstractNumId w:val="0"/>
   </w:num>
 </w:numbering>
 </file>
 
 <file path=word/glossary/settings.xml><?xml version="1.0" encoding="utf-8"?>
-<w:settings xmlns:mc="http://schemas.openxmlformats.org/markup-compatibility/2006" xmlns:o="urn:schemas-microsoft-com:office:office" xmlns:r="http://schemas.openxmlformats.org/officeDocument/2006/relationships" xmlns:m="http://schemas.openxmlformats.org/officeDocument/2006/math" xmlns:v="urn:schemas-microsoft-com:vml" xmlns:w10="urn:schemas-microsoft-com:office:word" xmlns:w="http://schemas.openxmlformats.org/wordprocessingml/2006/main" xmlns:w14="http://schemas.microsoft.com/office/word/2010/wordml" xmlns:w15="http://schemas.microsoft.com/office/word/2012/wordml" xmlns:w16cex="http://schemas.microsoft.com/office/word/2018/wordml/cex" xmlns:w16cid="http://schemas.microsoft.com/office/word/2016/wordml/cid" xmlns:w16="http://schemas.microsoft.com/office/word/2018/wordml" xmlns:w16sdtdh="http://schemas.microsoft.com/office/word/2020/wordml/sdtdatahash" xmlns:w16se="http://schemas.microsoft.com/office/word/2015/wordml/symex" xmlns:sl="http://schemas.openxmlformats.org/schemaLibrary/2006/main" mc:Ignorable="w14 w15 w16se w16cid w16 w16cex w16sdtdh">
+<w:settings xmlns:mc="http://schemas.openxmlformats.org/markup-compatibility/2006" xmlns:o="urn:schemas-microsoft-com:office:office" xmlns:r="http://schemas.openxmlformats.org/officeDocument/2006/relationships" xmlns:m="http://schemas.openxmlformats.org/officeDocument/2006/math" xmlns:v="urn:schemas-microsoft-com:vml" xmlns:w10="urn:schemas-microsoft-com:office:word" xmlns:w="http://schemas.openxmlformats.org/wordprocessingml/2006/main" xmlns:w14="http://schemas.microsoft.com/office/word/2010/wordml" xmlns:w15="http://schemas.microsoft.com/office/word/2012/wordml" xmlns:w16cex="http://schemas.microsoft.com/office/word/2018/wordml/cex" xmlns:w16cid="http://schemas.microsoft.com/office/word/2016/wordml/cid" xmlns:w16="http://schemas.microsoft.com/office/word/2018/wordml" xmlns:w16du="http://schemas.microsoft.com/office/word/2023/wordml/word16du" xmlns:w16sdtdh="http://schemas.microsoft.com/office/word/2020/wordml/sdtdatahash" xmlns:w16sdtfl="http://schemas.microsoft.com/office/word/2024/wordml/sdtformatlock" xmlns:w16se="http://schemas.microsoft.com/office/word/2015/wordml/symex" xmlns:sl="http://schemas.openxmlformats.org/schemaLibrary/2006/main" mc:Ignorable="w14 w15 w16se w16cid w16 w16cex w16sdtdh w16sdtfl w16du">
   <w:view w:val="normal"/>
   <w:defaultTabStop w:val="708"/>
   <w:hyphenationZone w:val="425"/>
@@ -4411,7 +4559,9 @@
   <w:rsids>
     <w:rsidRoot w:val="00AC2175"/>
     <w:rsid w:val="0003236B"/>
+    <w:rsid w:val="00447398"/>
     <w:rsid w:val="00936A26"/>
+    <w:rsid w:val="009568D7"/>
     <w:rsid w:val="00AC2175"/>
     <w:rsid w:val="00AF2DB0"/>
     <w:rsid w:val="00BC329E"/>
@@ -4433,14 +4583,14 @@
   </m:mathPr>
   <w:themeFontLang w:val="nl-NL"/>
   <w:clrSchemeMapping w:bg1="light1" w:t1="dark1" w:bg2="light2" w:t2="dark2" w:accent1="accent1" w:accent2="accent2" w:accent3="accent3" w:accent4="accent4" w:accent5="accent5" w:accent6="accent6" w:hyperlink="hyperlink" w:followedHyperlink="followedHyperlink"/>
-  <w:decimalSymbol w:val="."/>
+  <w:decimalSymbol w:val=","/>
   <w:listSeparator w:val=","/>
   <w15:chartTrackingRefBased/>
 </w:settings>
 </file>
 
 <file path=word/glossary/styles.xml><?xml version="1.0" encoding="utf-8"?>
-<w:styles xmlns:mc="http://schemas.openxmlformats.org/markup-compatibility/2006" xmlns:r="http://schemas.openxmlformats.org/officeDocument/2006/relationships" xmlns:w="http://schemas.openxmlformats.org/wordprocessingml/2006/main" xmlns:w14="http://schemas.microsoft.com/office/word/2010/wordml" xmlns:w15="http://schemas.microsoft.com/office/word/2012/wordml" xmlns:w16cex="http://schemas.microsoft.com/office/word/2018/wordml/cex" xmlns:w16cid="http://schemas.microsoft.com/office/word/2016/wordml/cid" xmlns:w16="http://schemas.microsoft.com/office/word/2018/wordml" xmlns:w16sdtdh="http://schemas.microsoft.com/office/word/2020/wordml/sdtdatahash" xmlns:w16se="http://schemas.microsoft.com/office/word/2015/wordml/symex" mc:Ignorable="w14 w15 w16se w16cid w16 w16cex w16sdtdh">
+<w:styles xmlns:mc="http://schemas.openxmlformats.org/markup-compatibility/2006" xmlns:r="http://schemas.openxmlformats.org/officeDocument/2006/relationships" xmlns:w="http://schemas.openxmlformats.org/wordprocessingml/2006/main" xmlns:w14="http://schemas.microsoft.com/office/word/2010/wordml" xmlns:w15="http://schemas.microsoft.com/office/word/2012/wordml" xmlns:w16cex="http://schemas.microsoft.com/office/word/2018/wordml/cex" xmlns:w16cid="http://schemas.microsoft.com/office/word/2016/wordml/cid" xmlns:w16="http://schemas.microsoft.com/office/word/2018/wordml" xmlns:w16du="http://schemas.microsoft.com/office/word/2023/wordml/word16du" xmlns:w16sdtdh="http://schemas.microsoft.com/office/word/2020/wordml/sdtdatahash" xmlns:w16sdtfl="http://schemas.microsoft.com/office/word/2024/wordml/sdtformatlock" xmlns:w16se="http://schemas.microsoft.com/office/word/2015/wordml/symex" mc:Ignorable="w14 w15 w16se w16cid w16 w16cex w16sdtdh w16sdtfl w16du">
   <w:docDefaults>
     <w:rPrDefault>
       <w:rPr>
@@ -4562,6 +4712,7 @@
     <w:lsdException w:name="HTML Sample" w:semiHidden="1" w:unhideWhenUsed="1"/>
     <w:lsdException w:name="HTML Typewriter" w:semiHidden="1" w:unhideWhenUsed="1"/>
     <w:lsdException w:name="HTML Variable" w:semiHidden="1" w:unhideWhenUsed="1"/>
+    <w:lsdException w:name="Normal Table" w:semiHidden="1" w:unhideWhenUsed="1"/>
     <w:lsdException w:name="annotation subject" w:semiHidden="1" w:unhideWhenUsed="1"/>
     <w:lsdException w:name="No List" w:semiHidden="1" w:unhideWhenUsed="1"/>
     <w:lsdException w:name="Outline List 1" w:semiHidden="1" w:unhideWhenUsed="1"/>
@@ -4604,8 +4755,11 @@
     <w:lsdException w:name="Table Contemporary" w:semiHidden="1" w:unhideWhenUsed="1"/>
     <w:lsdException w:name="Table Elegant" w:semiHidden="1" w:unhideWhenUsed="1"/>
     <w:lsdException w:name="Table Professional" w:semiHidden="1" w:unhideWhenUsed="1"/>
+    <w:lsdException w:name="Table Subtle 1" w:semiHidden="1" w:unhideWhenUsed="1"/>
     <w:lsdException w:name="Table Subtle 2" w:semiHidden="1" w:unhideWhenUsed="1"/>
     <w:lsdException w:name="Table Web 1" w:semiHidden="1" w:unhideWhenUsed="1"/>
+    <w:lsdException w:name="Table Web 2" w:semiHidden="1" w:unhideWhenUsed="1"/>
+    <w:lsdException w:name="Table Web 3" w:semiHidden="1" w:unhideWhenUsed="1"/>
     <w:lsdException w:name="Balloon Text" w:semiHidden="1" w:unhideWhenUsed="1"/>
     <w:lsdException w:name="Table Grid" w:uiPriority="39"/>
     <w:lsdException w:name="Table Theme" w:semiHidden="1" w:unhideWhenUsed="1"/>
@@ -4830,17 +4984,17 @@
     <w:lsdException w:name="Unresolved Mention" w:semiHidden="1" w:unhideWhenUsed="1"/>
     <w:lsdException w:name="Smart Link" w:semiHidden="1" w:unhideWhenUsed="1"/>
   </w:latentStyles>
-  <w:style w:type="paragraph" w:default="1" w:styleId="Normal">
+  <w:style w:type="paragraph" w:default="1" w:styleId="Standaard">
     <w:name w:val="Normal"/>
     <w:qFormat/>
   </w:style>
-  <w:style w:type="character" w:default="1" w:styleId="DefaultParagraphFont">
+  <w:style w:type="character" w:default="1" w:styleId="Standaardalinea-lettertype">
     <w:name w:val="Default Paragraph Font"/>
     <w:uiPriority w:val="1"/>
     <w:semiHidden/>
     <w:unhideWhenUsed/>
   </w:style>
-  <w:style w:type="table" w:default="1" w:styleId="TableNormal">
+  <w:style w:type="table" w:default="1" w:styleId="Standaardtabel">
     <w:name w:val="Normal Table"/>
     <w:uiPriority w:val="99"/>
     <w:semiHidden/>
@@ -4855,15 +5009,15 @@
       </w:tblCellMar>
     </w:tblPr>
   </w:style>
-  <w:style w:type="numbering" w:default="1" w:styleId="NoList">
+  <w:style w:type="numbering" w:default="1" w:styleId="Geenlijst">
     <w:name w:val="No List"/>
     <w:uiPriority w:val="99"/>
     <w:semiHidden/>
     <w:unhideWhenUsed/>
   </w:style>
-  <w:style w:type="character" w:styleId="PlaceholderText">
+  <w:style w:type="character" w:styleId="Tekstvantijdelijkeaanduiding">
     <w:name w:val="Placeholder Text"/>
-    <w:basedOn w:val="DefaultParagraphFont"/>
+    <w:basedOn w:val="Standaardalinea-lettertype"/>
     <w:uiPriority w:val="99"/>
     <w:semiHidden/>
     <w:rsid w:val="00E30130"/>
@@ -4973,7 +5127,7 @@
     <w:rPr>
       <w:rFonts w:ascii="Arial" w:eastAsia="Arial" w:hAnsi="Arial" w:cs="Arial"/>
       <w:b/>
-      <w:color w:val="44546A" w:themeColor="text2"/>
+      <w:color w:val="0E2841" w:themeColor="text2"/>
       <w:sz w:val="24"/>
     </w:rPr>
   </w:style>
@@ -4997,7 +5151,7 @@
 </file>
 
 <file path=word/glossary/webSettings.xml><?xml version="1.0" encoding="utf-8"?>
-<w:webSettings xmlns:mc="http://schemas.openxmlformats.org/markup-compatibility/2006" xmlns:r="http://schemas.openxmlformats.org/officeDocument/2006/relationships" xmlns:w="http://schemas.openxmlformats.org/wordprocessingml/2006/main" xmlns:w14="http://schemas.microsoft.com/office/word/2010/wordml" xmlns:w15="http://schemas.microsoft.com/office/word/2012/wordml" xmlns:w16cex="http://schemas.microsoft.com/office/word/2018/wordml/cex" xmlns:w16cid="http://schemas.microsoft.com/office/word/2016/wordml/cid" xmlns:w16="http://schemas.microsoft.com/office/word/2018/wordml" xmlns:w16sdtdh="http://schemas.microsoft.com/office/word/2020/wordml/sdtdatahash" xmlns:w16se="http://schemas.microsoft.com/office/word/2015/wordml/symex" mc:Ignorable="w14 w15 w16se w16cid w16 w16cex w16sdtdh">
+<w:webSettings xmlns:mc="http://schemas.openxmlformats.org/markup-compatibility/2006" xmlns:r="http://schemas.openxmlformats.org/officeDocument/2006/relationships" xmlns:w="http://schemas.openxmlformats.org/wordprocessingml/2006/main" xmlns:w14="http://schemas.microsoft.com/office/word/2010/wordml" xmlns:w15="http://schemas.microsoft.com/office/word/2012/wordml" xmlns:w16cex="http://schemas.microsoft.com/office/word/2018/wordml/cex" xmlns:w16cid="http://schemas.microsoft.com/office/word/2016/wordml/cid" xmlns:w16="http://schemas.microsoft.com/office/word/2018/wordml" xmlns:w16du="http://schemas.microsoft.com/office/word/2023/wordml/word16du" xmlns:w16sdtdh="http://schemas.microsoft.com/office/word/2020/wordml/sdtdatahash" xmlns:w16sdtfl="http://schemas.microsoft.com/office/word/2024/wordml/sdtformatlock" xmlns:w16se="http://schemas.microsoft.com/office/word/2015/wordml/symex" mc:Ignorable="w14 w15 w16se w16cid w16 w16cex w16sdtdh w16sdtfl w16du">
   <w:optimizeForBrowser/>
   <w:allowPNG/>
 </w:webSettings>
@@ -5223,37 +5377,6 @@
 </file>
 
 <file path=customXml/item1.xml><?xml version="1.0" encoding="utf-8"?>
-<b:Sources xmlns:b="http://schemas.openxmlformats.org/officeDocument/2006/bibliography" xmlns="http://schemas.openxmlformats.org/officeDocument/2006/bibliography" SelectedStyle="\APASixthEditionOfficeOnline.xsl" StyleName="APA" Version="6">
-  <b:Source>
-    <b:Tag>HPi10</b:Tag>
-    <b:SourceType>Report</b:SourceType>
-    <b:Guid>{EB17E8B4-CD9E-4929-8DF0-41ED47E182D5}</b:Guid>
-    <b:Author>
-      <b:Author>
-        <b:NameList>
-          <b:Person>
-            <b:Last>Pijnenburg</b:Last>
-            <b:First>H.</b:First>
-          </b:Person>
-        </b:NameList>
-      </b:Author>
-    </b:Author>
-    <b:Title>Zorgen dat het werkt</b:Title>
-    <b:Year>2010</b:Year>
-    <b:Publisher>Lectoraat Werkzame Factoren in de Zorg voor Jeugd, HAN</b:Publisher>
-    <b:City>Nijmegen</b:City>
-    <b:RefOrder>1</b:RefOrder>
-  </b:Source>
-</b:Sources>
-</file>
-
-<file path=customXml/item2.xml><?xml version="1.0" encoding="utf-8"?>
-<p:properties xmlns:p="http://schemas.microsoft.com/office/2006/metadata/properties" xmlns:xsi="http://www.w3.org/2001/XMLSchema-instance" xmlns:pc="http://schemas.microsoft.com/office/infopath/2007/PartnerControls">
-  <documentManagement/>
-</p:properties>
-</file>
-
-<file path=customXml/item3.xml><?xml version="1.0" encoding="utf-8"?>
 <ct:contentTypeSchema xmlns:ct="http://schemas.microsoft.com/office/2006/metadata/contentType" xmlns:ma="http://schemas.microsoft.com/office/2006/metadata/properties/metaAttributes" ct:_="" ma:_="" ma:contentTypeName="Document" ma:contentTypeID="0x010100748BC2F0AC01C04BA37F8A3EE99EF9B2" ma:contentTypeVersion="0" ma:contentTypeDescription="Een nieuw document maken." ma:contentTypeScope="" ma:versionID="b7054971a46f065470bc0e490339fad3">
   <xsd:schema xmlns:xsd="http://www.w3.org/2001/XMLSchema" xmlns:xs="http://www.w3.org/2001/XMLSchema" xmlns:p="http://schemas.microsoft.com/office/2006/metadata/properties" targetNamespace="http://schemas.microsoft.com/office/2006/metadata/properties" ma:root="true" ma:fieldsID="1978a156f712f99d6452530788f7ffe9">
     <xsd:element name="properties">
@@ -5367,6 +5490,37 @@
 </ct:contentTypeSchema>
 </file>
 
+<file path=customXml/item2.xml><?xml version="1.0" encoding="utf-8"?>
+<p:properties xmlns:p="http://schemas.microsoft.com/office/2006/metadata/properties" xmlns:xsi="http://www.w3.org/2001/XMLSchema-instance" xmlns:pc="http://schemas.microsoft.com/office/infopath/2007/PartnerControls">
+  <documentManagement/>
+</p:properties>
+</file>
+
+<file path=customXml/item3.xml><?xml version="1.0" encoding="utf-8"?>
+<b:Sources xmlns:b="http://schemas.openxmlformats.org/officeDocument/2006/bibliography" xmlns="http://schemas.openxmlformats.org/officeDocument/2006/bibliography" SelectedStyle="\APASixthEditionOfficeOnline.xsl" StyleName="APA" Version="6">
+  <b:Source>
+    <b:Tag>HPi10</b:Tag>
+    <b:SourceType>Report</b:SourceType>
+    <b:Guid>{EB17E8B4-CD9E-4929-8DF0-41ED47E182D5}</b:Guid>
+    <b:Author>
+      <b:Author>
+        <b:NameList>
+          <b:Person>
+            <b:Last>Pijnenburg</b:Last>
+            <b:First>H.</b:First>
+          </b:Person>
+        </b:NameList>
+      </b:Author>
+    </b:Author>
+    <b:Title>Zorgen dat het werkt</b:Title>
+    <b:Year>2010</b:Year>
+    <b:Publisher>Lectoraat Werkzame Factoren in de Zorg voor Jeugd, HAN</b:Publisher>
+    <b:City>Nijmegen</b:City>
+    <b:RefOrder>1</b:RefOrder>
+  </b:Source>
+</b:Sources>
+</file>
+
 <file path=customXml/item4.xml><?xml version="1.0" encoding="utf-8"?>
 <?mso-contentType ?>
 <FormTemplates xmlns="http://schemas.microsoft.com/sharepoint/v3/contenttype/forms">
@@ -5377,23 +5531,6 @@
 </file>
 
 <file path=customXml/itemProps1.xml><?xml version="1.0" encoding="utf-8"?>
-<ds:datastoreItem xmlns:ds="http://schemas.openxmlformats.org/officeDocument/2006/customXml" ds:itemID="{FC5467D7-69FE-4180-BE19-1D4073F22D60}">
-  <ds:schemaRefs>
-    <ds:schemaRef ds:uri="http://schemas.openxmlformats.org/officeDocument/2006/bibliography"/>
-  </ds:schemaRefs>
-</ds:datastoreItem>
-</file>
-
-<file path=customXml/itemProps2.xml><?xml version="1.0" encoding="utf-8"?>
-<ds:datastoreItem xmlns:ds="http://schemas.openxmlformats.org/officeDocument/2006/customXml" ds:itemID="{A96086A9-C93B-4195-9942-41863CCC68C6}">
-  <ds:schemaRefs>
-    <ds:schemaRef ds:uri="http://schemas.microsoft.com/office/2006/metadata/properties"/>
-    <ds:schemaRef ds:uri="http://schemas.microsoft.com/office/infopath/2007/PartnerControls"/>
-  </ds:schemaRefs>
-</ds:datastoreItem>
-</file>
-
-<file path=customXml/itemProps3.xml><?xml version="1.0" encoding="utf-8"?>
 <ds:datastoreItem xmlns:ds="http://schemas.openxmlformats.org/officeDocument/2006/customXml" ds:itemID="{FC2F32BA-D461-4C36-B9B8-FD7B4CD0577C}">
   <ds:schemaRefs>
     <ds:schemaRef ds:uri="http://schemas.microsoft.com/office/2006/metadata/contentType"/>
@@ -5409,6 +5546,23 @@
 </ds:datastoreItem>
 </file>
 
+<file path=customXml/itemProps2.xml><?xml version="1.0" encoding="utf-8"?>
+<ds:datastoreItem xmlns:ds="http://schemas.openxmlformats.org/officeDocument/2006/customXml" ds:itemID="{A96086A9-C93B-4195-9942-41863CCC68C6}">
+  <ds:schemaRefs>
+    <ds:schemaRef ds:uri="http://schemas.microsoft.com/office/2006/metadata/properties"/>
+    <ds:schemaRef ds:uri="http://schemas.microsoft.com/office/infopath/2007/PartnerControls"/>
+  </ds:schemaRefs>
+</ds:datastoreItem>
+</file>
+
+<file path=customXml/itemProps3.xml><?xml version="1.0" encoding="utf-8"?>
+<ds:datastoreItem xmlns:ds="http://schemas.openxmlformats.org/officeDocument/2006/customXml" ds:itemID="{FC5467D7-69FE-4180-BE19-1D4073F22D60}">
+  <ds:schemaRefs>
+    <ds:schemaRef ds:uri="http://schemas.openxmlformats.org/officeDocument/2006/bibliography"/>
+  </ds:schemaRefs>
+</ds:datastoreItem>
+</file>
+
 <file path=customXml/itemProps4.xml><?xml version="1.0" encoding="utf-8"?>
 <ds:datastoreItem xmlns:ds="http://schemas.openxmlformats.org/officeDocument/2006/customXml" ds:itemID="{A05A2F34-0CE7-4D6F-9850-E83E48AF91B1}">
   <ds:schemaRefs>

</xml_diff>

<commit_message>
RLE compressie algortihme gemaakt met comments.
</commit_message>
<xml_diff>
--- a/HAN-Rapport.docx
+++ b/HAN-Rapport.docx
@@ -72,21 +72,12 @@
           <w:p>
             <w:pPr>
               <w:pStyle w:val="Ondertitel"/>
-              <w:rPr>
-                <w:lang w:val="en-NL"/>
-              </w:rPr>
             </w:pPr>
             <w:r>
-              <w:rPr>
-                <w:lang w:val="en-NL"/>
-              </w:rPr>
               <w:t xml:space="preserve">Michel </w:t>
             </w:r>
             <w:proofErr w:type="spellStart"/>
             <w:r>
-              <w:rPr>
-                <w:lang w:val="en-NL"/>
-              </w:rPr>
               <w:t>Koolwaaij</w:t>
             </w:r>
             <w:proofErr w:type="spellEnd"/>
@@ -154,8 +145,14 @@
     <w:p>
       <w:pPr>
         <w:pStyle w:val="Kopvaninhoudsopgave"/>
-      </w:pPr>
-      <w:r>
+        <w:rPr>
+          <w:lang w:val="nl-NL"/>
+        </w:rPr>
+      </w:pPr>
+      <w:r>
+        <w:rPr>
+          <w:lang w:val="nl-NL"/>
+        </w:rPr>
         <w:lastRenderedPageBreak/>
         <w:t>INHOUDSOPGAVE</w:t>
       </w:r>
@@ -163,6 +160,9 @@
     <w:p/>
     <w:sdt>
       <w:sdtPr>
+        <w:rPr>
+          <w:noProof w:val="0"/>
+        </w:rPr>
         <w:id w:val="1536852759"/>
         <w:docPartObj>
           <w:docPartGallery w:val="Table of Contents"/>
@@ -186,15 +186,24 @@
             </w:rPr>
           </w:pPr>
           <w:r>
+            <w:rPr>
+              <w:noProof w:val="0"/>
+            </w:rPr>
             <w:fldChar w:fldCharType="begin"/>
           </w:r>
           <w:r>
+            <w:rPr>
+              <w:noProof w:val="0"/>
+            </w:rPr>
             <w:instrText xml:space="preserve"> TOC \o "1-3" \h \z \t "Kop 1 - geen nr;1;Bijlage;1" </w:instrText>
           </w:r>
           <w:r>
+            <w:rPr>
+              <w:noProof w:val="0"/>
+            </w:rPr>
             <w:fldChar w:fldCharType="separate"/>
           </w:r>
-          <w:hyperlink w:anchor="_Toc223702473" w:history="1">
+          <w:hyperlink w:anchor="_Toc223709943" w:history="1">
             <w:r>
               <w:rPr>
                 <w:rStyle w:val="Hyperlink"/>
@@ -237,7 +246,7 @@
               <w:rPr>
                 <w:webHidden/>
               </w:rPr>
-              <w:instrText xml:space="preserve"> PAGEREF _Toc223702473 \h </w:instrText>
+              <w:instrText xml:space="preserve"> PAGEREF _Toc223709943 \h </w:instrText>
             </w:r>
             <w:r>
               <w:rPr>
@@ -277,7 +286,7 @@
               <w14:ligatures w14:val="standardContextual"/>
             </w:rPr>
           </w:pPr>
-          <w:hyperlink w:anchor="_Toc223702474" w:history="1">
+          <w:hyperlink w:anchor="_Toc223709944" w:history="1">
             <w:r>
               <w:rPr>
                 <w:rStyle w:val="Hyperlink"/>
@@ -300,7 +309,7 @@
               <w:rPr>
                 <w:rStyle w:val="Hyperlink"/>
               </w:rPr>
-              <w:t>[Paragraaftitel]</w:t>
+              <w:t>Functioneel programmeren</w:t>
             </w:r>
             <w:r>
               <w:rPr>
@@ -318,7 +327,7 @@
               <w:rPr>
                 <w:webHidden/>
               </w:rPr>
-              <w:instrText xml:space="preserve"> PAGEREF _Toc223702474 \h </w:instrText>
+              <w:instrText xml:space="preserve"> PAGEREF _Toc223709944 \h </w:instrText>
             </w:r>
             <w:r>
               <w:rPr>
@@ -339,6 +348,639 @@
             </w:r>
             <w:r>
               <w:rPr>
+                <w:webHidden/>
+              </w:rPr>
+              <w:fldChar w:fldCharType="end"/>
+            </w:r>
+          </w:hyperlink>
+        </w:p>
+        <w:p>
+          <w:pPr>
+            <w:pStyle w:val="Inhopg2"/>
+            <w:rPr>
+              <w:rFonts w:eastAsiaTheme="minorEastAsia" w:cstheme="minorBidi"/>
+              <w:color w:val="auto"/>
+              <w:kern w:val="2"/>
+              <w:sz w:val="24"/>
+              <w:szCs w:val="24"/>
+              <w:lang w:val="en-NL" w:eastAsia="en-NL"/>
+              <w14:ligatures w14:val="standardContextual"/>
+            </w:rPr>
+          </w:pPr>
+          <w:hyperlink w:anchor="_Toc223709945" w:history="1">
+            <w:r>
+              <w:rPr>
+                <w:rStyle w:val="Hyperlink"/>
+              </w:rPr>
+              <w:t>1.2</w:t>
+            </w:r>
+            <w:r>
+              <w:rPr>
+                <w:rFonts w:eastAsiaTheme="minorEastAsia" w:cstheme="minorBidi"/>
+                <w:color w:val="auto"/>
+                <w:kern w:val="2"/>
+                <w:sz w:val="24"/>
+                <w:szCs w:val="24"/>
+                <w:lang w:val="en-NL" w:eastAsia="en-NL"/>
+                <w14:ligatures w14:val="standardContextual"/>
+              </w:rPr>
+              <w:tab/>
+            </w:r>
+            <w:r>
+              <w:rPr>
+                <w:rStyle w:val="Hyperlink"/>
+              </w:rPr>
+              <w:t>Functionele concepten</w:t>
+            </w:r>
+            <w:r>
+              <w:rPr>
+                <w:webHidden/>
+              </w:rPr>
+              <w:tab/>
+            </w:r>
+            <w:r>
+              <w:rPr>
+                <w:webHidden/>
+              </w:rPr>
+              <w:fldChar w:fldCharType="begin"/>
+            </w:r>
+            <w:r>
+              <w:rPr>
+                <w:webHidden/>
+              </w:rPr>
+              <w:instrText xml:space="preserve"> PAGEREF _Toc223709945 \h </w:instrText>
+            </w:r>
+            <w:r>
+              <w:rPr>
+                <w:webHidden/>
+              </w:rPr>
+            </w:r>
+            <w:r>
+              <w:rPr>
+                <w:webHidden/>
+              </w:rPr>
+              <w:fldChar w:fldCharType="separate"/>
+            </w:r>
+            <w:r>
+              <w:rPr>
+                <w:webHidden/>
+              </w:rPr>
+              <w:t>4</w:t>
+            </w:r>
+            <w:r>
+              <w:rPr>
+                <w:webHidden/>
+              </w:rPr>
+              <w:fldChar w:fldCharType="end"/>
+            </w:r>
+          </w:hyperlink>
+        </w:p>
+        <w:p>
+          <w:pPr>
+            <w:pStyle w:val="Inhopg3"/>
+            <w:rPr>
+              <w:rFonts w:eastAsiaTheme="minorEastAsia" w:cstheme="minorBidi"/>
+              <w:noProof/>
+              <w:color w:val="auto"/>
+              <w:kern w:val="2"/>
+              <w:sz w:val="24"/>
+              <w:szCs w:val="24"/>
+              <w:lang w:val="en-NL" w:eastAsia="en-NL"/>
+              <w14:ligatures w14:val="standardContextual"/>
+            </w:rPr>
+          </w:pPr>
+          <w:hyperlink w:anchor="_Toc223709946" w:history="1">
+            <w:r>
+              <w:rPr>
+                <w:rStyle w:val="Hyperlink"/>
+                <w:noProof/>
+              </w:rPr>
+              <w:t>1.2.1</w:t>
+            </w:r>
+            <w:r>
+              <w:rPr>
+                <w:rFonts w:eastAsiaTheme="minorEastAsia" w:cstheme="minorBidi"/>
+                <w:noProof/>
+                <w:color w:val="auto"/>
+                <w:kern w:val="2"/>
+                <w:sz w:val="24"/>
+                <w:szCs w:val="24"/>
+                <w:lang w:val="en-NL" w:eastAsia="en-NL"/>
+                <w14:ligatures w14:val="standardContextual"/>
+              </w:rPr>
+              <w:tab/>
+            </w:r>
+            <w:r>
+              <w:rPr>
+                <w:rStyle w:val="Hyperlink"/>
+                <w:noProof/>
+              </w:rPr>
+              <w:t>Pure functies</w:t>
+            </w:r>
+            <w:r>
+              <w:rPr>
+                <w:noProof/>
+                <w:webHidden/>
+              </w:rPr>
+              <w:tab/>
+            </w:r>
+            <w:r>
+              <w:rPr>
+                <w:noProof/>
+                <w:webHidden/>
+              </w:rPr>
+              <w:fldChar w:fldCharType="begin"/>
+            </w:r>
+            <w:r>
+              <w:rPr>
+                <w:noProof/>
+                <w:webHidden/>
+              </w:rPr>
+              <w:instrText xml:space="preserve"> PAGEREF _Toc223709946 \h </w:instrText>
+            </w:r>
+            <w:r>
+              <w:rPr>
+                <w:noProof/>
+                <w:webHidden/>
+              </w:rPr>
+            </w:r>
+            <w:r>
+              <w:rPr>
+                <w:noProof/>
+                <w:webHidden/>
+              </w:rPr>
+              <w:fldChar w:fldCharType="separate"/>
+            </w:r>
+            <w:r>
+              <w:rPr>
+                <w:noProof/>
+                <w:webHidden/>
+              </w:rPr>
+              <w:t>4</w:t>
+            </w:r>
+            <w:r>
+              <w:rPr>
+                <w:noProof/>
+                <w:webHidden/>
+              </w:rPr>
+              <w:fldChar w:fldCharType="end"/>
+            </w:r>
+          </w:hyperlink>
+        </w:p>
+        <w:p>
+          <w:pPr>
+            <w:pStyle w:val="Inhopg3"/>
+            <w:rPr>
+              <w:rFonts w:eastAsiaTheme="minorEastAsia" w:cstheme="minorBidi"/>
+              <w:noProof/>
+              <w:color w:val="auto"/>
+              <w:kern w:val="2"/>
+              <w:sz w:val="24"/>
+              <w:szCs w:val="24"/>
+              <w:lang w:val="en-NL" w:eastAsia="en-NL"/>
+              <w14:ligatures w14:val="standardContextual"/>
+            </w:rPr>
+          </w:pPr>
+          <w:hyperlink w:anchor="_Toc223709947" w:history="1">
+            <w:r>
+              <w:rPr>
+                <w:rStyle w:val="Hyperlink"/>
+                <w:noProof/>
+              </w:rPr>
+              <w:t>1.2.2</w:t>
+            </w:r>
+            <w:r>
+              <w:rPr>
+                <w:rFonts w:eastAsiaTheme="minorEastAsia" w:cstheme="minorBidi"/>
+                <w:noProof/>
+                <w:color w:val="auto"/>
+                <w:kern w:val="2"/>
+                <w:sz w:val="24"/>
+                <w:szCs w:val="24"/>
+                <w:lang w:val="en-NL" w:eastAsia="en-NL"/>
+                <w14:ligatures w14:val="standardContextual"/>
+              </w:rPr>
+              <w:tab/>
+            </w:r>
+            <w:r>
+              <w:rPr>
+                <w:rStyle w:val="Hyperlink"/>
+                <w:noProof/>
+              </w:rPr>
+              <w:t>Higher-order functies</w:t>
+            </w:r>
+            <w:r>
+              <w:rPr>
+                <w:noProof/>
+                <w:webHidden/>
+              </w:rPr>
+              <w:tab/>
+            </w:r>
+            <w:r>
+              <w:rPr>
+                <w:noProof/>
+                <w:webHidden/>
+              </w:rPr>
+              <w:fldChar w:fldCharType="begin"/>
+            </w:r>
+            <w:r>
+              <w:rPr>
+                <w:noProof/>
+                <w:webHidden/>
+              </w:rPr>
+              <w:instrText xml:space="preserve"> PAGEREF _Toc223709947 \h </w:instrText>
+            </w:r>
+            <w:r>
+              <w:rPr>
+                <w:noProof/>
+                <w:webHidden/>
+              </w:rPr>
+            </w:r>
+            <w:r>
+              <w:rPr>
+                <w:noProof/>
+                <w:webHidden/>
+              </w:rPr>
+              <w:fldChar w:fldCharType="separate"/>
+            </w:r>
+            <w:r>
+              <w:rPr>
+                <w:noProof/>
+                <w:webHidden/>
+              </w:rPr>
+              <w:t>4</w:t>
+            </w:r>
+            <w:r>
+              <w:rPr>
+                <w:noProof/>
+                <w:webHidden/>
+              </w:rPr>
+              <w:fldChar w:fldCharType="end"/>
+            </w:r>
+          </w:hyperlink>
+        </w:p>
+        <w:p>
+          <w:pPr>
+            <w:pStyle w:val="Inhopg3"/>
+            <w:rPr>
+              <w:rFonts w:eastAsiaTheme="minorEastAsia" w:cstheme="minorBidi"/>
+              <w:noProof/>
+              <w:color w:val="auto"/>
+              <w:kern w:val="2"/>
+              <w:sz w:val="24"/>
+              <w:szCs w:val="24"/>
+              <w:lang w:val="en-NL" w:eastAsia="en-NL"/>
+              <w14:ligatures w14:val="standardContextual"/>
+            </w:rPr>
+          </w:pPr>
+          <w:hyperlink w:anchor="_Toc223709948" w:history="1">
+            <w:r>
+              <w:rPr>
+                <w:rStyle w:val="Hyperlink"/>
+                <w:noProof/>
+              </w:rPr>
+              <w:t>1.2.3</w:t>
+            </w:r>
+            <w:r>
+              <w:rPr>
+                <w:rFonts w:eastAsiaTheme="minorEastAsia" w:cstheme="minorBidi"/>
+                <w:noProof/>
+                <w:color w:val="auto"/>
+                <w:kern w:val="2"/>
+                <w:sz w:val="24"/>
+                <w:szCs w:val="24"/>
+                <w:lang w:val="en-NL" w:eastAsia="en-NL"/>
+                <w14:ligatures w14:val="standardContextual"/>
+              </w:rPr>
+              <w:tab/>
+            </w:r>
+            <w:r>
+              <w:rPr>
+                <w:rStyle w:val="Hyperlink"/>
+                <w:noProof/>
+              </w:rPr>
+              <w:t>Immutability</w:t>
+            </w:r>
+            <w:r>
+              <w:rPr>
+                <w:noProof/>
+                <w:webHidden/>
+              </w:rPr>
+              <w:tab/>
+            </w:r>
+            <w:r>
+              <w:rPr>
+                <w:noProof/>
+                <w:webHidden/>
+              </w:rPr>
+              <w:fldChar w:fldCharType="begin"/>
+            </w:r>
+            <w:r>
+              <w:rPr>
+                <w:noProof/>
+                <w:webHidden/>
+              </w:rPr>
+              <w:instrText xml:space="preserve"> PAGEREF _Toc223709948 \h </w:instrText>
+            </w:r>
+            <w:r>
+              <w:rPr>
+                <w:noProof/>
+                <w:webHidden/>
+              </w:rPr>
+            </w:r>
+            <w:r>
+              <w:rPr>
+                <w:noProof/>
+                <w:webHidden/>
+              </w:rPr>
+              <w:fldChar w:fldCharType="separate"/>
+            </w:r>
+            <w:r>
+              <w:rPr>
+                <w:noProof/>
+                <w:webHidden/>
+              </w:rPr>
+              <w:t>4</w:t>
+            </w:r>
+            <w:r>
+              <w:rPr>
+                <w:noProof/>
+                <w:webHidden/>
+              </w:rPr>
+              <w:fldChar w:fldCharType="end"/>
+            </w:r>
+          </w:hyperlink>
+        </w:p>
+        <w:p>
+          <w:pPr>
+            <w:pStyle w:val="Inhopg3"/>
+            <w:rPr>
+              <w:rFonts w:eastAsiaTheme="minorEastAsia" w:cstheme="minorBidi"/>
+              <w:noProof/>
+              <w:color w:val="auto"/>
+              <w:kern w:val="2"/>
+              <w:sz w:val="24"/>
+              <w:szCs w:val="24"/>
+              <w:lang w:val="en-NL" w:eastAsia="en-NL"/>
+              <w14:ligatures w14:val="standardContextual"/>
+            </w:rPr>
+          </w:pPr>
+          <w:hyperlink w:anchor="_Toc223709949" w:history="1">
+            <w:r>
+              <w:rPr>
+                <w:rStyle w:val="Hyperlink"/>
+                <w:noProof/>
+              </w:rPr>
+              <w:t>1.2.4</w:t>
+            </w:r>
+            <w:r>
+              <w:rPr>
+                <w:rFonts w:eastAsiaTheme="minorEastAsia" w:cstheme="minorBidi"/>
+                <w:noProof/>
+                <w:color w:val="auto"/>
+                <w:kern w:val="2"/>
+                <w:sz w:val="24"/>
+                <w:szCs w:val="24"/>
+                <w:lang w:val="en-NL" w:eastAsia="en-NL"/>
+                <w14:ligatures w14:val="standardContextual"/>
+              </w:rPr>
+              <w:tab/>
+            </w:r>
+            <w:r>
+              <w:rPr>
+                <w:rStyle w:val="Hyperlink"/>
+                <w:noProof/>
+              </w:rPr>
+              <w:t>Recursie</w:t>
+            </w:r>
+            <w:r>
+              <w:rPr>
+                <w:noProof/>
+                <w:webHidden/>
+              </w:rPr>
+              <w:tab/>
+            </w:r>
+            <w:r>
+              <w:rPr>
+                <w:noProof/>
+                <w:webHidden/>
+              </w:rPr>
+              <w:fldChar w:fldCharType="begin"/>
+            </w:r>
+            <w:r>
+              <w:rPr>
+                <w:noProof/>
+                <w:webHidden/>
+              </w:rPr>
+              <w:instrText xml:space="preserve"> PAGEREF _Toc223709949 \h </w:instrText>
+            </w:r>
+            <w:r>
+              <w:rPr>
+                <w:noProof/>
+                <w:webHidden/>
+              </w:rPr>
+            </w:r>
+            <w:r>
+              <w:rPr>
+                <w:noProof/>
+                <w:webHidden/>
+              </w:rPr>
+              <w:fldChar w:fldCharType="separate"/>
+            </w:r>
+            <w:r>
+              <w:rPr>
+                <w:noProof/>
+                <w:webHidden/>
+              </w:rPr>
+              <w:t>4</w:t>
+            </w:r>
+            <w:r>
+              <w:rPr>
+                <w:noProof/>
+                <w:webHidden/>
+              </w:rPr>
+              <w:fldChar w:fldCharType="end"/>
+            </w:r>
+          </w:hyperlink>
+        </w:p>
+        <w:p>
+          <w:pPr>
+            <w:pStyle w:val="Inhopg3"/>
+            <w:rPr>
+              <w:rFonts w:eastAsiaTheme="minorEastAsia" w:cstheme="minorBidi"/>
+              <w:noProof/>
+              <w:color w:val="auto"/>
+              <w:kern w:val="2"/>
+              <w:sz w:val="24"/>
+              <w:szCs w:val="24"/>
+              <w:lang w:val="en-NL" w:eastAsia="en-NL"/>
+              <w14:ligatures w14:val="standardContextual"/>
+            </w:rPr>
+          </w:pPr>
+          <w:hyperlink w:anchor="_Toc223709950" w:history="1">
+            <w:r>
+              <w:rPr>
+                <w:rStyle w:val="Hyperlink"/>
+                <w:noProof/>
+              </w:rPr>
+              <w:t>1.2.5</w:t>
+            </w:r>
+            <w:r>
+              <w:rPr>
+                <w:rFonts w:eastAsiaTheme="minorEastAsia" w:cstheme="minorBidi"/>
+                <w:noProof/>
+                <w:color w:val="auto"/>
+                <w:kern w:val="2"/>
+                <w:sz w:val="24"/>
+                <w:szCs w:val="24"/>
+                <w:lang w:val="en-NL" w:eastAsia="en-NL"/>
+                <w14:ligatures w14:val="standardContextual"/>
+              </w:rPr>
+              <w:tab/>
+            </w:r>
+            <w:r>
+              <w:rPr>
+                <w:rStyle w:val="Hyperlink"/>
+                <w:noProof/>
+              </w:rPr>
+              <w:t>Lazy evaluation</w:t>
+            </w:r>
+            <w:r>
+              <w:rPr>
+                <w:noProof/>
+                <w:webHidden/>
+              </w:rPr>
+              <w:tab/>
+            </w:r>
+            <w:r>
+              <w:rPr>
+                <w:noProof/>
+                <w:webHidden/>
+              </w:rPr>
+              <w:fldChar w:fldCharType="begin"/>
+            </w:r>
+            <w:r>
+              <w:rPr>
+                <w:noProof/>
+                <w:webHidden/>
+              </w:rPr>
+              <w:instrText xml:space="preserve"> PAGEREF _Toc223709950 \h </w:instrText>
+            </w:r>
+            <w:r>
+              <w:rPr>
+                <w:noProof/>
+                <w:webHidden/>
+              </w:rPr>
+            </w:r>
+            <w:r>
+              <w:rPr>
+                <w:noProof/>
+                <w:webHidden/>
+              </w:rPr>
+              <w:fldChar w:fldCharType="separate"/>
+            </w:r>
+            <w:r>
+              <w:rPr>
+                <w:noProof/>
+                <w:webHidden/>
+              </w:rPr>
+              <w:t>4</w:t>
+            </w:r>
+            <w:r>
+              <w:rPr>
+                <w:noProof/>
+                <w:webHidden/>
+              </w:rPr>
+              <w:fldChar w:fldCharType="end"/>
+            </w:r>
+          </w:hyperlink>
+        </w:p>
+        <w:p>
+          <w:pPr>
+            <w:pStyle w:val="Inhopg3"/>
+            <w:rPr>
+              <w:rFonts w:eastAsiaTheme="minorEastAsia" w:cstheme="minorBidi"/>
+              <w:noProof/>
+              <w:color w:val="auto"/>
+              <w:kern w:val="2"/>
+              <w:sz w:val="24"/>
+              <w:szCs w:val="24"/>
+              <w:lang w:val="en-NL" w:eastAsia="en-NL"/>
+              <w14:ligatures w14:val="standardContextual"/>
+            </w:rPr>
+          </w:pPr>
+          <w:hyperlink w:anchor="_Toc223709951" w:history="1">
+            <w:r>
+              <w:rPr>
+                <w:rStyle w:val="Hyperlink"/>
+                <w:noProof/>
+              </w:rPr>
+              <w:t>1.2.6</w:t>
+            </w:r>
+            <w:r>
+              <w:rPr>
+                <w:rFonts w:eastAsiaTheme="minorEastAsia" w:cstheme="minorBidi"/>
+                <w:noProof/>
+                <w:color w:val="auto"/>
+                <w:kern w:val="2"/>
+                <w:sz w:val="24"/>
+                <w:szCs w:val="24"/>
+                <w:lang w:val="en-NL" w:eastAsia="en-NL"/>
+                <w14:ligatures w14:val="standardContextual"/>
+              </w:rPr>
+              <w:tab/>
+            </w:r>
+            <w:r>
+              <w:rPr>
+                <w:rStyle w:val="Hyperlink"/>
+                <w:noProof/>
+              </w:rPr>
+              <w:t>Pattern matching</w:t>
+            </w:r>
+            <w:r>
+              <w:rPr>
+                <w:noProof/>
+                <w:webHidden/>
+              </w:rPr>
+              <w:tab/>
+            </w:r>
+            <w:r>
+              <w:rPr>
+                <w:noProof/>
+                <w:webHidden/>
+              </w:rPr>
+              <w:fldChar w:fldCharType="begin"/>
+            </w:r>
+            <w:r>
+              <w:rPr>
+                <w:noProof/>
+                <w:webHidden/>
+              </w:rPr>
+              <w:instrText xml:space="preserve"> PAGEREF _Toc223709951 \h </w:instrText>
+            </w:r>
+            <w:r>
+              <w:rPr>
+                <w:noProof/>
+                <w:webHidden/>
+              </w:rPr>
+            </w:r>
+            <w:r>
+              <w:rPr>
+                <w:noProof/>
+                <w:webHidden/>
+              </w:rPr>
+              <w:fldChar w:fldCharType="separate"/>
+            </w:r>
+            <w:r>
+              <w:rPr>
+                <w:noProof/>
+                <w:webHidden/>
+              </w:rPr>
+              <w:t>4</w:t>
+            </w:r>
+            <w:r>
+              <w:rPr>
+                <w:noProof/>
                 <w:webHidden/>
               </w:rPr>
               <w:fldChar w:fldCharType="end"/>
@@ -360,7 +1002,7 @@
               <w14:ligatures w14:val="standardContextual"/>
             </w:rPr>
           </w:pPr>
-          <w:hyperlink w:anchor="_Toc223702475" w:history="1">
+          <w:hyperlink w:anchor="_Toc223709952" w:history="1">
             <w:r>
               <w:rPr>
                 <w:rStyle w:val="Hyperlink"/>
@@ -403,7 +1045,7 @@
               <w:rPr>
                 <w:webHidden/>
               </w:rPr>
-              <w:instrText xml:space="preserve"> PAGEREF _Toc223702475 \h </w:instrText>
+              <w:instrText xml:space="preserve"> PAGEREF _Toc223709952 \h </w:instrText>
             </w:r>
             <w:r>
               <w:rPr>
@@ -420,7 +1062,7 @@
               <w:rPr>
                 <w:webHidden/>
               </w:rPr>
-              <w:t>4</w:t>
+              <w:t>5</w:t>
             </w:r>
             <w:r>
               <w:rPr>
@@ -445,7 +1087,7 @@
               <w14:ligatures w14:val="standardContextual"/>
             </w:rPr>
           </w:pPr>
-          <w:hyperlink w:anchor="_Toc223702476" w:history="1">
+          <w:hyperlink w:anchor="_Toc223709953" w:history="1">
             <w:r>
               <w:rPr>
                 <w:rStyle w:val="Hyperlink"/>
@@ -488,7 +1130,7 @@
               <w:rPr>
                 <w:webHidden/>
               </w:rPr>
-              <w:instrText xml:space="preserve"> PAGEREF _Toc223702476 \h </w:instrText>
+              <w:instrText xml:space="preserve"> PAGEREF _Toc223709953 \h </w:instrText>
             </w:r>
             <w:r>
               <w:rPr>
@@ -505,7 +1147,7 @@
               <w:rPr>
                 <w:webHidden/>
               </w:rPr>
-              <w:t>4</w:t>
+              <w:t>5</w:t>
             </w:r>
             <w:r>
               <w:rPr>
@@ -530,7 +1172,7 @@
               <w14:ligatures w14:val="standardContextual"/>
             </w:rPr>
           </w:pPr>
-          <w:hyperlink w:anchor="_Toc223702477" w:history="1">
+          <w:hyperlink w:anchor="_Toc223709954" w:history="1">
             <w:r>
               <w:rPr>
                 <w:rStyle w:val="Hyperlink"/>
@@ -573,7 +1215,7 @@
               <w:rPr>
                 <w:webHidden/>
               </w:rPr>
-              <w:instrText xml:space="preserve"> PAGEREF _Toc223702477 \h </w:instrText>
+              <w:instrText xml:space="preserve"> PAGEREF _Toc223709954 \h </w:instrText>
             </w:r>
             <w:r>
               <w:rPr>
@@ -590,7 +1232,7 @@
               <w:rPr>
                 <w:webHidden/>
               </w:rPr>
-              <w:t>4</w:t>
+              <w:t>5</w:t>
             </w:r>
             <w:r>
               <w:rPr>
@@ -615,7 +1257,7 @@
               <w14:ligatures w14:val="standardContextual"/>
             </w:rPr>
           </w:pPr>
-          <w:hyperlink w:anchor="_Toc223702478" w:history="1">
+          <w:hyperlink w:anchor="_Toc223709955" w:history="1">
             <w:r>
               <w:rPr>
                 <w:rStyle w:val="Hyperlink"/>
@@ -658,7 +1300,7 @@
               <w:rPr>
                 <w:webHidden/>
               </w:rPr>
-              <w:instrText xml:space="preserve"> PAGEREF _Toc223702478 \h </w:instrText>
+              <w:instrText xml:space="preserve"> PAGEREF _Toc223709955 \h </w:instrText>
             </w:r>
             <w:r>
               <w:rPr>
@@ -675,7 +1317,7 @@
               <w:rPr>
                 <w:webHidden/>
               </w:rPr>
-              <w:t>4</w:t>
+              <w:t>5</w:t>
             </w:r>
             <w:r>
               <w:rPr>
@@ -688,8 +1330,99 @@
         <w:p>
           <w:pPr>
             <w:pStyle w:val="Inhopg1"/>
+            <w:rPr>
+              <w:rFonts w:eastAsiaTheme="minorEastAsia" w:cstheme="minorBidi"/>
+              <w:b w:val="0"/>
+              <w:caps w:val="0"/>
+              <w:color w:val="auto"/>
+              <w:kern w:val="2"/>
+              <w:sz w:val="24"/>
+              <w:szCs w:val="24"/>
+              <w:lang w:val="en-NL" w:eastAsia="en-NL"/>
+              <w14:ligatures w14:val="standardContextual"/>
+            </w:rPr>
+          </w:pPr>
+          <w:hyperlink w:anchor="_Toc223709956" w:history="1">
+            <w:r>
+              <w:rPr>
+                <w:rStyle w:val="Hyperlink"/>
+              </w:rPr>
+              <w:t>6</w:t>
+            </w:r>
+            <w:r>
+              <w:rPr>
+                <w:rFonts w:eastAsiaTheme="minorEastAsia" w:cstheme="minorBidi"/>
+                <w:b w:val="0"/>
+                <w:caps w:val="0"/>
+                <w:color w:val="auto"/>
+                <w:kern w:val="2"/>
+                <w:sz w:val="24"/>
+                <w:szCs w:val="24"/>
+                <w:lang w:val="en-NL" w:eastAsia="en-NL"/>
+                <w14:ligatures w14:val="standardContextual"/>
+              </w:rPr>
+              <w:tab/>
+            </w:r>
+            <w:r>
+              <w:rPr>
+                <w:rStyle w:val="Hyperlink"/>
+              </w:rPr>
+              <w:t>Verwijzingen</w:t>
+            </w:r>
+            <w:r>
+              <w:rPr>
+                <w:webHidden/>
+              </w:rPr>
+              <w:tab/>
+            </w:r>
+            <w:r>
+              <w:rPr>
+                <w:webHidden/>
+              </w:rPr>
+              <w:fldChar w:fldCharType="begin"/>
+            </w:r>
+            <w:r>
+              <w:rPr>
+                <w:webHidden/>
+              </w:rPr>
+              <w:instrText xml:space="preserve"> PAGEREF _Toc223709956 \h </w:instrText>
+            </w:r>
+            <w:r>
+              <w:rPr>
+                <w:webHidden/>
+              </w:rPr>
+            </w:r>
+            <w:r>
+              <w:rPr>
+                <w:webHidden/>
+              </w:rPr>
+              <w:fldChar w:fldCharType="separate"/>
+            </w:r>
+            <w:r>
+              <w:rPr>
+                <w:webHidden/>
+              </w:rPr>
+              <w:t>6</w:t>
+            </w:r>
+            <w:r>
+              <w:rPr>
+                <w:webHidden/>
+              </w:rPr>
+              <w:fldChar w:fldCharType="end"/>
+            </w:r>
+          </w:hyperlink>
+        </w:p>
+        <w:p>
+          <w:pPr>
+            <w:pStyle w:val="Inhopg1"/>
+            <w:rPr>
+              <w:noProof w:val="0"/>
+            </w:rPr>
           </w:pPr>
           <w:r>
+            <w:rPr>
+              <w:noProof w:val="0"/>
+            </w:rPr>
             <w:fldChar w:fldCharType="end"/>
           </w:r>
         </w:p>
@@ -762,7 +1495,7 @@
       <w:pPr>
         <w:pStyle w:val="Kop1"/>
       </w:pPr>
-      <w:bookmarkStart w:id="8" w:name="_Toc223702473"/>
+      <w:bookmarkStart w:id="8" w:name="_Toc223709943"/>
       <w:r>
         <w:lastRenderedPageBreak/>
         <w:t>Onderzoek</w:t>
@@ -779,24 +1512,9 @@
       <w:pPr>
         <w:spacing w:after="98" w:line="259" w:lineRule="auto"/>
       </w:pPr>
-      <w:sdt>
-        <w:sdtPr>
-          <w:id w:val="835500411"/>
-          <w:placeholder>
-            <w:docPart w:val="9A51542F33794396A25966C937903A5F"/>
-          </w:placeholder>
-          <w:temporary/>
-          <w:showingPlcHdr/>
-        </w:sdtPr>
-        <w:sdtContent>
-          <w:r>
-            <w:rPr>
-              <w:rStyle w:val="Tekstvantijdelijkeaanduiding"/>
-            </w:rPr>
-            <w:t>[Klik hier als je tekst wilt invoeren.]</w:t>
-          </w:r>
-        </w:sdtContent>
-      </w:sdt>
+      <w:r>
+        <w:t>In dit hoofdstuk wordt functioneel programmeren en concepten die hierbij horen onderzocht. Dit wordt specifiek gedaan voor de taal Elixir.</w:t>
+      </w:r>
     </w:p>
     <w:p>
       <w:pPr>
@@ -806,129 +1524,660 @@
         </w:rPr>
       </w:pPr>
     </w:p>
-    <w:bookmarkStart w:id="9" w:name="_Toc223702474"/>
     <w:p>
       <w:pPr>
         <w:pStyle w:val="Kop2"/>
       </w:pPr>
+      <w:bookmarkStart w:id="9" w:name="_Toc223709944"/>
+      <w:r>
+        <w:t>Functioneel programmeren</w:t>
+      </w:r>
+      <w:bookmarkEnd w:id="9"/>
+    </w:p>
+    <w:p>
+      <w:r>
+        <w:t xml:space="preserve">Functioneel programmeren is een programmeerparadigma waarin programma’s worden uitgevoerd door expressies te evalueren </w:t>
+      </w:r>
       <w:sdt>
         <w:sdtPr>
-          <w:id w:val="-1867437649"/>
-          <w:placeholder>
-            <w:docPart w:val="93BEF86AB9DD40D5BDCF2D4AD9CD55A4"/>
-          </w:placeholder>
-          <w:temporary/>
-          <w:showingPlcHdr/>
+          <w:id w:val="-1114354203"/>
+          <w:citation/>
         </w:sdtPr>
         <w:sdtContent>
           <w:r>
+            <w:fldChar w:fldCharType="begin"/>
+          </w:r>
+          <w:r>
+            <w:instrText xml:space="preserve"> CITATION Fun \l 1033 </w:instrText>
+          </w:r>
+          <w:r>
+            <w:fldChar w:fldCharType="separate"/>
+          </w:r>
+          <w:r>
             <w:rPr>
-              <w:rStyle w:val="Tekstvantijdelijkeaanduiding"/>
+              <w:noProof/>
             </w:rPr>
-            <w:t>[Paragraaftitel]</w:t>
+            <w:t>(Functional Programming, n.d.)</w:t>
+          </w:r>
+          <w:r>
+            <w:fldChar w:fldCharType="end"/>
           </w:r>
         </w:sdtContent>
       </w:sdt>
-      <w:bookmarkEnd w:id="9"/>
+      <w:r>
+        <w:t>. Functionele code kan dus in tegenstelling tot imperatieve code geen globale state aanpassen of side</w:t>
+      </w:r>
+      <w:r>
+        <w:t xml:space="preserve"> </w:t>
+      </w:r>
+      <w:proofErr w:type="spellStart"/>
+      <w:r>
+        <w:t>effects</w:t>
+      </w:r>
+      <w:proofErr w:type="spellEnd"/>
+      <w:r>
+        <w:t xml:space="preserve"> veroorzaken. Dit leidt tot voorspelbare en beter testbare code. Functies zijn in dit paradigma first class, dit houdt in dat functies als data behandelt kunnen worden. Functies kunnen dus bijvoorbeeld </w:t>
+      </w:r>
+      <w:r>
+        <w:t>meegegeven</w:t>
+      </w:r>
+      <w:r>
+        <w:t xml:space="preserve"> worden aan andere functies als parameters of door een functie als return waarde worden gegeven. De nadruk bij functioneel programmeren ligt dus op wat er moet worden berekend in plaats van wat er stap voor stap moet gebeuren. </w:t>
+      </w:r>
     </w:p>
+    <w:p/>
     <w:p>
       <w:pPr>
-        <w:pStyle w:val="Kop1"/>
-      </w:pPr>
-      <w:bookmarkStart w:id="10" w:name="_Toc223702475"/>
-      <w:r>
-        <w:t>Challenge</w:t>
+        <w:pStyle w:val="Kop2"/>
+      </w:pPr>
+      <w:bookmarkStart w:id="10" w:name="_Toc223709945"/>
+      <w:r>
+        <w:t>Functionele concepten</w:t>
       </w:r>
       <w:bookmarkEnd w:id="10"/>
     </w:p>
     <w:p>
       <w:r>
-        <w:t>Voor deze opdracht heb ik gekozen voor Run-</w:t>
-      </w:r>
-      <w:proofErr w:type="spellStart"/>
-      <w:r>
-        <w:t>Length</w:t>
-      </w:r>
-      <w:proofErr w:type="spellEnd"/>
-      <w:r>
-        <w:t>-</w:t>
-      </w:r>
-      <w:proofErr w:type="spellStart"/>
-      <w:r>
-        <w:t>Encoding</w:t>
-      </w:r>
-      <w:proofErr w:type="spellEnd"/>
-      <w:r>
-        <w:t xml:space="preserve"> compressie (RLE-compressie). Dit </w:t>
-      </w:r>
-      <w:proofErr w:type="spellStart"/>
-      <w:r>
-        <w:t>algorithem</w:t>
-      </w:r>
-      <w:proofErr w:type="spellEnd"/>
-      <w:r>
-        <w:t xml:space="preserve"> comprimeert en decomprimeert herhalende data. RLE is geschikt om functionele concepten zoals </w:t>
-      </w:r>
-      <w:proofErr w:type="spellStart"/>
-      <w:r>
-        <w:t>patternmatching</w:t>
-      </w:r>
-      <w:proofErr w:type="spellEnd"/>
-      <w:r>
-        <w:t xml:space="preserve"> en </w:t>
-      </w:r>
-      <w:proofErr w:type="spellStart"/>
-      <w:r>
-        <w:t>recursion</w:t>
-      </w:r>
-      <w:proofErr w:type="spellEnd"/>
-      <w:r>
-        <w:t xml:space="preserve"> op toe te passen.</w:t>
-      </w:r>
-      <w:r>
-        <w:t xml:space="preserve"> Voor mijn implementatie wil ik RLE uitvoeren op </w:t>
-      </w:r>
-      <w:proofErr w:type="spellStart"/>
-      <w:r>
-        <w:t>teskstbestanden</w:t>
-      </w:r>
-      <w:proofErr w:type="spellEnd"/>
-      <w:r>
-        <w:t>.</w:t>
+        <w:t>In dit hoofdstuk worden een aantal functionele concepten onderzocht die relevant zijn voor Elixir en de implementatie van RLE-algoritme. Niet alle theoretische definities komen rechtstreeks vanuit Elixir documentatie. Dit zijn algemene functionele concepten die ook van toepassing zijn op Elixir. Het doel is om deze concepten te onderzoeken zodat deze toegepast kunnen worden.</w:t>
       </w:r>
     </w:p>
     <w:p/>
-    <w:p/>
     <w:p>
       <w:pPr>
-        <w:pStyle w:val="Kop1"/>
-      </w:pPr>
-      <w:bookmarkStart w:id="11" w:name="_Toc223702476"/>
-      <w:r>
-        <w:t>Implementatie</w:t>
+        <w:pStyle w:val="Kop3"/>
+      </w:pPr>
+      <w:bookmarkStart w:id="11" w:name="_Toc223709946"/>
+      <w:r>
+        <w:t>Pure functie</w:t>
+      </w:r>
+      <w:r>
+        <w:t>s</w:t>
       </w:r>
       <w:bookmarkEnd w:id="11"/>
     </w:p>
     <w:p>
-      <w:pPr>
-        <w:pStyle w:val="Kop1"/>
-      </w:pPr>
-      <w:bookmarkStart w:id="12" w:name="_Toc223702477"/>
-      <w:r>
-        <w:t>reflectie</w:t>
+      <w:r>
+        <w:t xml:space="preserve">Pure functies zijn functies die met dezelfde input altijd dezelfde output teruggeven </w:t>
+      </w:r>
+      <w:sdt>
+        <w:sdtPr>
+          <w:id w:val="1767106667"/>
+          <w:citation/>
+        </w:sdtPr>
+        <w:sdtContent>
+          <w:r>
+            <w:fldChar w:fldCharType="begin"/>
+          </w:r>
+          <w:r>
+            <w:rPr>
+              <w:lang w:val="en-US"/>
+            </w:rPr>
+            <w:instrText xml:space="preserve"> CITATION Pur \l 1033 </w:instrText>
+          </w:r>
+          <w:r>
+            <w:fldChar w:fldCharType="separate"/>
+          </w:r>
+          <w:r>
+            <w:rPr>
+              <w:noProof/>
+              <w:lang w:val="en-US"/>
+            </w:rPr>
+            <w:t>(Pure, n.d.)</w:t>
+          </w:r>
+          <w:r>
+            <w:fldChar w:fldCharType="end"/>
+          </w:r>
+        </w:sdtContent>
+      </w:sdt>
+      <w:r>
+        <w:t xml:space="preserve">. Je kunt bijvoorbeeld een functie hebben </w:t>
+      </w:r>
+      <w:proofErr w:type="spellStart"/>
+      <w:proofErr w:type="gramStart"/>
+      <w:r>
+        <w:t>add</w:t>
+      </w:r>
+      <w:proofErr w:type="spellEnd"/>
+      <w:r>
+        <w:t>(</w:t>
+      </w:r>
+      <w:proofErr w:type="gramEnd"/>
+      <w:r>
+        <w:t>x, y) die x en y optelt, deze functie geeft bij dezelfde input waarde altijd dezelfde output en is dus puur.</w:t>
+      </w:r>
+    </w:p>
+    <w:p/>
+    <w:p>
+      <w:pPr>
+        <w:pStyle w:val="Kop3"/>
+      </w:pPr>
+      <w:bookmarkStart w:id="12" w:name="_Toc223709947"/>
+      <w:proofErr w:type="spellStart"/>
+      <w:r>
+        <w:t>Higher</w:t>
+      </w:r>
+      <w:proofErr w:type="spellEnd"/>
+      <w:r>
+        <w:t>-order functies</w:t>
       </w:r>
       <w:bookmarkEnd w:id="12"/>
     </w:p>
     <w:p>
+      <w:r>
+        <w:t xml:space="preserve">Een </w:t>
+      </w:r>
+      <w:proofErr w:type="spellStart"/>
+      <w:r>
+        <w:t>higher</w:t>
+      </w:r>
+      <w:proofErr w:type="spellEnd"/>
+      <w:r>
+        <w:t xml:space="preserve">-order functie is een functie die functies neemt als parameters of een functie als return waarde geeft </w:t>
+      </w:r>
+      <w:sdt>
+        <w:sdtPr>
+          <w:id w:val="1230660137"/>
+          <w:citation/>
+        </w:sdtPr>
+        <w:sdtContent>
+          <w:r>
+            <w:fldChar w:fldCharType="begin"/>
+          </w:r>
+          <w:r>
+            <w:rPr>
+              <w:lang w:val="en-US"/>
+            </w:rPr>
+            <w:instrText xml:space="preserve"> CITATION Hig \l 1033 </w:instrText>
+          </w:r>
+          <w:r>
+            <w:fldChar w:fldCharType="separate"/>
+          </w:r>
+          <w:r>
+            <w:rPr>
+              <w:noProof/>
+              <w:lang w:val="en-US"/>
+            </w:rPr>
+            <w:t>(Higher order function, n.d.)</w:t>
+          </w:r>
+          <w:r>
+            <w:fldChar w:fldCharType="end"/>
+          </w:r>
+        </w:sdtContent>
+      </w:sdt>
+      <w:r>
+        <w:t xml:space="preserve">. </w:t>
+      </w:r>
+    </w:p>
+    <w:p/>
+    <w:p>
+      <w:pPr>
+        <w:pStyle w:val="Kop3"/>
+      </w:pPr>
+      <w:bookmarkStart w:id="13" w:name="_Toc223709948"/>
+      <w:proofErr w:type="spellStart"/>
+      <w:r>
+        <w:t>Immutability</w:t>
+      </w:r>
+      <w:bookmarkEnd w:id="13"/>
+      <w:proofErr w:type="spellEnd"/>
+    </w:p>
+    <w:p>
+      <w:pPr>
+        <w:pStyle w:val="Kop3"/>
+      </w:pPr>
+      <w:bookmarkStart w:id="14" w:name="_Toc223709949"/>
+      <w:r>
+        <w:t>Recursie</w:t>
+      </w:r>
+      <w:bookmarkEnd w:id="14"/>
+    </w:p>
+    <w:p>
+      <w:r>
+        <w:t xml:space="preserve">Recursie is een techniek waarbij een functie zichzelf stapsgewijs aanroept om een probleem op te lossen, totdat een eindconditie is bereikt </w:t>
+      </w:r>
+      <w:sdt>
+        <w:sdtPr>
+          <w:id w:val="1511412643"/>
+          <w:citation/>
+        </w:sdtPr>
+        <w:sdtContent>
+          <w:r>
+            <w:fldChar w:fldCharType="begin"/>
+          </w:r>
+          <w:r>
+            <w:rPr>
+              <w:lang w:val="en-US"/>
+            </w:rPr>
+            <w:instrText xml:space="preserve"> CITATION Rec \l 1033 </w:instrText>
+          </w:r>
+          <w:r>
+            <w:fldChar w:fldCharType="separate"/>
+          </w:r>
+          <w:r>
+            <w:rPr>
+              <w:noProof/>
+              <w:lang w:val="en-US"/>
+            </w:rPr>
+            <w:t>(Recursion, n.d.)</w:t>
+          </w:r>
+          <w:r>
+            <w:fldChar w:fldCharType="end"/>
+          </w:r>
+        </w:sdtContent>
+      </w:sdt>
+      <w:r>
+        <w:t xml:space="preserve">. In Elixir wordt recursie gebruikt als alternatief voor loops vanwege </w:t>
+      </w:r>
+      <w:proofErr w:type="spellStart"/>
+      <w:r>
+        <w:t>immutability</w:t>
+      </w:r>
+      <w:proofErr w:type="spellEnd"/>
+      <w:r>
+        <w:t>.</w:t>
+      </w:r>
+    </w:p>
+    <w:p/>
+    <w:p>
+      <w:pPr>
+        <w:pStyle w:val="Kop3"/>
+      </w:pPr>
+      <w:bookmarkStart w:id="15" w:name="_Toc223709951"/>
+      <w:proofErr w:type="spellStart"/>
+      <w:r>
+        <w:lastRenderedPageBreak/>
+        <w:t>Pattern</w:t>
+      </w:r>
+      <w:proofErr w:type="spellEnd"/>
+      <w:r>
+        <w:t xml:space="preserve"> matching</w:t>
+      </w:r>
+      <w:bookmarkEnd w:id="15"/>
+    </w:p>
+    <w:p>
+      <w:proofErr w:type="spellStart"/>
+      <w:r>
+        <w:t>Pattern</w:t>
+      </w:r>
+      <w:proofErr w:type="spellEnd"/>
+      <w:r>
+        <w:t xml:space="preserve"> matching is een techniek waarbij datastructuren worden vergeleken op basis van hun vorm, in plaats van conditionele logica </w:t>
+      </w:r>
+      <w:sdt>
+        <w:sdtPr>
+          <w:id w:val="705449066"/>
+          <w:citation/>
+        </w:sdtPr>
+        <w:sdtContent>
+          <w:r>
+            <w:fldChar w:fldCharType="begin"/>
+          </w:r>
+          <w:r>
+            <w:rPr>
+              <w:lang w:val="en-US"/>
+            </w:rPr>
+            <w:instrText xml:space="preserve"> CITATION Pat \l 1033 </w:instrText>
+          </w:r>
+          <w:r>
+            <w:fldChar w:fldCharType="separate"/>
+          </w:r>
+          <w:r>
+            <w:rPr>
+              <w:noProof/>
+              <w:lang w:val="en-US"/>
+            </w:rPr>
+            <w:t>(Pattern matching, n.d.)</w:t>
+          </w:r>
+          <w:r>
+            <w:fldChar w:fldCharType="end"/>
+          </w:r>
+        </w:sdtContent>
+      </w:sdt>
+      <w:r>
+        <w:t xml:space="preserve">. Stel je hebt de variabele x die gebonden is aan de waarde 1, kun je </w:t>
+      </w:r>
+      <w:proofErr w:type="spellStart"/>
+      <w:r>
+        <w:t>pattern</w:t>
+      </w:r>
+      <w:proofErr w:type="spellEnd"/>
+      <w:r>
+        <w:t xml:space="preserve"> matching als volgt gebruiken 1 = x. In een imperatieve taal zou je hier bijvoorbeeld x == 1 moeten doen.</w:t>
+      </w:r>
+    </w:p>
+    <w:p>
       <w:pPr>
         <w:pStyle w:val="Kop1"/>
       </w:pPr>
-      <w:bookmarkStart w:id="13" w:name="_Toc223702478"/>
+      <w:bookmarkStart w:id="16" w:name="_Toc223709952"/>
+      <w:r>
+        <w:t>Challenge</w:t>
+      </w:r>
+      <w:bookmarkEnd w:id="16"/>
+    </w:p>
+    <w:p>
+      <w:r>
+        <w:t>Voor deze opdracht heb ik gekozen voor Run-</w:t>
+      </w:r>
+      <w:proofErr w:type="spellStart"/>
+      <w:r>
+        <w:t>Length</w:t>
+      </w:r>
+      <w:proofErr w:type="spellEnd"/>
+      <w:r>
+        <w:t>-</w:t>
+      </w:r>
+      <w:proofErr w:type="spellStart"/>
+      <w:r>
+        <w:t>Encoding</w:t>
+      </w:r>
+      <w:proofErr w:type="spellEnd"/>
+      <w:r>
+        <w:t xml:space="preserve"> compressie (RLE-compressie). Dit </w:t>
+      </w:r>
+      <w:proofErr w:type="spellStart"/>
+      <w:r>
+        <w:t>algorithem</w:t>
+      </w:r>
+      <w:proofErr w:type="spellEnd"/>
+      <w:r>
+        <w:t xml:space="preserve"> comprimeert en decomprimeert herhalende data. RLE is geschikt om functionele concepten zoals </w:t>
+      </w:r>
+      <w:proofErr w:type="spellStart"/>
+      <w:r>
+        <w:t>patternmatching</w:t>
+      </w:r>
+      <w:proofErr w:type="spellEnd"/>
+      <w:r>
+        <w:t xml:space="preserve"> en </w:t>
+      </w:r>
+      <w:proofErr w:type="spellStart"/>
+      <w:r>
+        <w:t>recursion</w:t>
+      </w:r>
+      <w:proofErr w:type="spellEnd"/>
+      <w:r>
+        <w:t xml:space="preserve"> op toe te passen.</w:t>
+      </w:r>
+      <w:r>
+        <w:t xml:space="preserve"> </w:t>
+      </w:r>
+    </w:p>
+    <w:p/>
+    <w:p>
+      <w:r>
+        <w:t xml:space="preserve">De </w:t>
+      </w:r>
+      <w:proofErr w:type="spellStart"/>
+      <w:r>
+        <w:t>challenge</w:t>
+      </w:r>
+      <w:proofErr w:type="spellEnd"/>
+      <w:r>
+        <w:t xml:space="preserve"> is uitdagend omdat ik naast het inlezen en het schrijven naar bestanden ook </w:t>
+      </w:r>
+      <w:r>
+        <w:t xml:space="preserve">de data verwerk op een functionele manier. Eerder zou ik dit aangepakt hebben op een imperatieve manier met loops. Omdat ik vooral met imperatieve en object </w:t>
+      </w:r>
+      <w:proofErr w:type="spellStart"/>
+      <w:r>
+        <w:t>georienteerde</w:t>
+      </w:r>
+      <w:proofErr w:type="spellEnd"/>
+      <w:r>
+        <w:t xml:space="preserve"> talen heb gewerkt is het denken in pure functies en </w:t>
+      </w:r>
+      <w:proofErr w:type="spellStart"/>
+      <w:r>
+        <w:t>immutable</w:t>
+      </w:r>
+      <w:proofErr w:type="spellEnd"/>
+      <w:r>
+        <w:t xml:space="preserve"> data een nieuwe manier van programmeren. Dit maakt de opdracht leerzaam en uitdagen voor mij.</w:t>
+      </w:r>
+    </w:p>
+    <w:p>
+      <w:pPr>
+        <w:pStyle w:val="Kop1"/>
+      </w:pPr>
+      <w:bookmarkStart w:id="17" w:name="_Toc223709953"/>
+      <w:r>
+        <w:t>Implementatie</w:t>
+      </w:r>
+      <w:bookmarkEnd w:id="17"/>
+    </w:p>
+    <w:p>
+      <w:pPr>
+        <w:pStyle w:val="Kop1"/>
+      </w:pPr>
+      <w:bookmarkStart w:id="18" w:name="_Toc223709954"/>
+      <w:r>
+        <w:t>reflectie</w:t>
+      </w:r>
+      <w:bookmarkEnd w:id="18"/>
+    </w:p>
+    <w:p>
+      <w:pPr>
+        <w:pStyle w:val="Kop1"/>
+      </w:pPr>
+      <w:bookmarkStart w:id="19" w:name="_Toc223709955"/>
       <w:r>
         <w:t>Conclusie</w:t>
       </w:r>
-      <w:bookmarkEnd w:id="13"/>
+      <w:bookmarkEnd w:id="19"/>
     </w:p>
+    <w:p>
+      <w:pPr>
+        <w:rPr>
+          <w:color w:val="auto"/>
+        </w:rPr>
+      </w:pPr>
+    </w:p>
+    <w:p>
+      <w:pPr>
+        <w:rPr>
+          <w:color w:val="auto"/>
+        </w:rPr>
+      </w:pPr>
+      <w:r>
+        <w:rPr>
+          <w:color w:val="auto"/>
+        </w:rPr>
+        <w:br w:type="page"/>
+      </w:r>
+    </w:p>
+    <w:bookmarkStart w:id="20" w:name="_Toc223709956" w:displacedByCustomXml="next"/>
+    <w:sdt>
+      <w:sdtPr>
+        <w:id w:val="-139666133"/>
+        <w:docPartObj>
+          <w:docPartGallery w:val="Bibliographies"/>
+          <w:docPartUnique/>
+        </w:docPartObj>
+      </w:sdtPr>
+      <w:sdtEndPr>
+        <w:rPr>
+          <w:rFonts w:asciiTheme="minorHAnsi" w:hAnsiTheme="minorHAnsi"/>
+          <w:b w:val="0"/>
+          <w:caps w:val="0"/>
+          <w:sz w:val="20"/>
+        </w:rPr>
+      </w:sdtEndPr>
+      <w:sdtContent>
+        <w:p>
+          <w:pPr>
+            <w:pStyle w:val="Kop1"/>
+          </w:pPr>
+          <w:r>
+            <w:t>Verwijzingen</w:t>
+          </w:r>
+          <w:bookmarkEnd w:id="20"/>
+        </w:p>
+        <w:sdt>
+          <w:sdtPr>
+            <w:id w:val="-573587230"/>
+            <w:bibliography/>
+          </w:sdtPr>
+          <w:sdtContent>
+            <w:p>
+              <w:pPr>
+                <w:pStyle w:val="Bibliografie"/>
+                <w:ind w:left="720" w:hanging="720"/>
+                <w:rPr>
+                  <w:noProof/>
+                  <w:sz w:val="24"/>
+                  <w:szCs w:val="24"/>
+                </w:rPr>
+              </w:pPr>
+              <w:r>
+                <w:fldChar w:fldCharType="begin"/>
+              </w:r>
+              <w:r>
+                <w:instrText>BIBLIOGRAPHY</w:instrText>
+              </w:r>
+              <w:r>
+                <w:fldChar w:fldCharType="separate"/>
+              </w:r>
+              <w:r>
+                <w:rPr>
+                  <w:i/>
+                  <w:iCs/>
+                  <w:noProof/>
+                </w:rPr>
+                <w:t>Functional Programming</w:t>
+              </w:r>
+              <w:r>
+                <w:rPr>
+                  <w:noProof/>
+                </w:rPr>
+                <w:t>. (sd). Opgehaald van haskell: https://wiki.haskell.org/index.php?title=Functional_programming</w:t>
+              </w:r>
+            </w:p>
+            <w:p>
+              <w:pPr>
+                <w:pStyle w:val="Bibliografie"/>
+                <w:ind w:left="720" w:hanging="720"/>
+                <w:rPr>
+                  <w:noProof/>
+                </w:rPr>
+              </w:pPr>
+              <w:r>
+                <w:rPr>
+                  <w:i/>
+                  <w:iCs/>
+                  <w:noProof/>
+                </w:rPr>
+                <w:t>Higher order function</w:t>
+              </w:r>
+              <w:r>
+                <w:rPr>
+                  <w:noProof/>
+                </w:rPr>
+                <w:t>. (sd). Opgehaald van haskell: https://wiki.haskell.org/index.php?title=Higher_order_function</w:t>
+              </w:r>
+            </w:p>
+            <w:p>
+              <w:pPr>
+                <w:pStyle w:val="Bibliografie"/>
+                <w:ind w:left="720" w:hanging="720"/>
+                <w:rPr>
+                  <w:noProof/>
+                </w:rPr>
+              </w:pPr>
+              <w:r>
+                <w:rPr>
+                  <w:i/>
+                  <w:iCs/>
+                  <w:noProof/>
+                </w:rPr>
+                <w:t>Pattern matching</w:t>
+              </w:r>
+              <w:r>
+                <w:rPr>
+                  <w:noProof/>
+                </w:rPr>
+                <w:t>. (sd). Opgehaald van hexdocs: https://hexdocs.pm/elixir/1.19.5/pattern-matching.html</w:t>
+              </w:r>
+            </w:p>
+            <w:p>
+              <w:pPr>
+                <w:pStyle w:val="Bibliografie"/>
+                <w:ind w:left="720" w:hanging="720"/>
+                <w:rPr>
+                  <w:noProof/>
+                </w:rPr>
+              </w:pPr>
+              <w:r>
+                <w:rPr>
+                  <w:i/>
+                  <w:iCs/>
+                  <w:noProof/>
+                </w:rPr>
+                <w:t>Pure</w:t>
+              </w:r>
+              <w:r>
+                <w:rPr>
+                  <w:noProof/>
+                </w:rPr>
+                <w:t>. (sd). Opgehaald van haskell: https://wiki.haskell.org/Pure</w:t>
+              </w:r>
+            </w:p>
+            <w:p>
+              <w:pPr>
+                <w:pStyle w:val="Bibliografie"/>
+                <w:ind w:left="720" w:hanging="720"/>
+                <w:rPr>
+                  <w:noProof/>
+                </w:rPr>
+              </w:pPr>
+              <w:r>
+                <w:rPr>
+                  <w:i/>
+                  <w:iCs/>
+                  <w:noProof/>
+                </w:rPr>
+                <w:t>Recursion</w:t>
+              </w:r>
+              <w:r>
+                <w:rPr>
+                  <w:noProof/>
+                </w:rPr>
+                <w:t>. (sd). Opgehaald van hexdocs: https://hexdocs.pm/elixir/1.19.5/recursion.html</w:t>
+              </w:r>
+            </w:p>
+            <w:p>
+              <w:r>
+                <w:rPr>
+                  <w:b/>
+                  <w:bCs/>
+                </w:rPr>
+                <w:fldChar w:fldCharType="end"/>
+              </w:r>
+            </w:p>
+          </w:sdtContent>
+        </w:sdt>
+      </w:sdtContent>
+    </w:sdt>
     <w:p>
       <w:pPr>
         <w:rPr>
@@ -959,9 +2208,6 @@
         <w:spacing w:line="240" w:lineRule="auto"/>
       </w:pPr>
       <w:r>
-        <w:rPr>
-          <w:noProof/>
-        </w:rPr>
         <w:lastRenderedPageBreak/>
         <mc:AlternateContent>
           <mc:Choice Requires="wpg">
@@ -1203,9 +2449,6 @@
       </w:tabs>
     </w:pPr>
     <w:r>
-      <w:rPr>
-        <w:noProof/>
-      </w:rPr>
       <w:drawing>
         <wp:anchor distT="0" distB="0" distL="114300" distR="114300" simplePos="0" relativeHeight="251670528" behindDoc="1" locked="0" layoutInCell="1" allowOverlap="1" wp14:anchorId="42E47975" wp14:editId="5214644E">
           <wp:simplePos x="0" y="0"/>
@@ -1280,9 +2523,6 @@
       <w:pStyle w:val="Voettekst"/>
     </w:pPr>
     <w:r>
-      <w:rPr>
-        <w:noProof/>
-      </w:rPr>
       <w:drawing>
         <wp:anchor distT="0" distB="0" distL="114300" distR="114300" simplePos="0" relativeHeight="251659264" behindDoc="1" locked="0" layoutInCell="1" allowOverlap="1" wp14:anchorId="37C14344" wp14:editId="3555C134">
           <wp:simplePos x="0" y="0"/>
@@ -1376,7 +2616,6 @@
         <w:r>
           <w:rPr>
             <w:rFonts w:ascii="Arial" w:hAnsi="Arial" w:cs="Arial"/>
-            <w:noProof/>
             <w:szCs w:val="16"/>
           </w:rPr>
           <mc:AlternateContent>
@@ -1444,9 +2683,6 @@
                                 <w:fldChar w:fldCharType="separate"/>
                               </w:r>
                               <w:r>
-                                <w:rPr>
-                                  <w:noProof/>
-                                </w:rPr>
                                 <w:t>2</w:t>
                               </w:r>
                               <w:r>
@@ -1457,9 +2693,6 @@
                               </w:r>
                               <w:fldSimple w:instr=" NUMPAGES   \* MERGEFORMAT ">
                                 <w:r>
-                                  <w:rPr>
-                                    <w:noProof/>
-                                  </w:rPr>
                                   <w:t>5</w:t>
                                 </w:r>
                               </w:fldSimple>
@@ -1508,9 +2741,6 @@
                           <w:fldChar w:fldCharType="separate"/>
                         </w:r>
                         <w:r>
-                          <w:rPr>
-                            <w:noProof/>
-                          </w:rPr>
                           <w:t>2</w:t>
                         </w:r>
                         <w:r>
@@ -1521,9 +2751,6 @@
                         </w:r>
                         <w:fldSimple w:instr=" NUMPAGES   \* MERGEFORMAT ">
                           <w:r>
-                            <w:rPr>
-                              <w:noProof/>
-                            </w:rPr>
                             <w:t>5</w:t>
                           </w:r>
                         </w:fldSimple>
@@ -1718,9 +2945,6 @@
       <w:spacing w:after="160" w:line="259" w:lineRule="auto"/>
     </w:pPr>
     <w:r>
-      <w:rPr>
-        <w:noProof/>
-      </w:rPr>
       <w:drawing>
         <wp:anchor distT="0" distB="0" distL="114300" distR="114300" simplePos="0" relativeHeight="251668480" behindDoc="1" locked="0" layoutInCell="1" allowOverlap="1" wp14:anchorId="17F4281D" wp14:editId="0CB3A745">
           <wp:simplePos x="0" y="0"/>
@@ -1868,9 +3092,6 @@
       <w:spacing w:after="160" w:line="259" w:lineRule="auto"/>
     </w:pPr>
     <w:r>
-      <w:rPr>
-        <w:noProof/>
-      </w:rPr>
       <w:drawing>
         <wp:anchor distT="0" distB="0" distL="114300" distR="114300" simplePos="0" relativeHeight="251661312" behindDoc="1" locked="0" layoutInCell="1" allowOverlap="1" wp14:anchorId="3F49E87A" wp14:editId="3C1F6B1E">
           <wp:simplePos x="0" y="0"/>
@@ -1945,9 +3166,6 @@
       <w:pStyle w:val="Koptekst"/>
     </w:pPr>
     <w:r>
-      <w:rPr>
-        <w:noProof/>
-      </w:rPr>
       <w:drawing>
         <wp:anchor distT="0" distB="0" distL="114300" distR="114300" simplePos="0" relativeHeight="251672576" behindDoc="0" locked="0" layoutInCell="1" allowOverlap="1" wp14:anchorId="63788751" wp14:editId="21EC2D0F">
           <wp:simplePos x="0" y="0"/>
@@ -4147,6 +5365,14 @@
       <w:szCs w:val="24"/>
     </w:rPr>
   </w:style>
+  <w:style w:type="paragraph" w:styleId="Bibliografie">
+    <w:name w:val="Bibliography"/>
+    <w:basedOn w:val="Standaard"/>
+    <w:next w:val="Standaard"/>
+    <w:uiPriority w:val="37"/>
+    <w:unhideWhenUsed/>
+    <w:rsid w:val="004D5F48"/>
+  </w:style>
 </w:styles>
 </file>
 
@@ -4245,64 +5471,6 @@
               <w:rStyle w:val="Tekstvantijdelijkeaanduiding"/>
             </w:rPr>
             <w:t>[Klik hier als je tekst wilt invoeren, maak gebruik van de stijlen op de tab MIJN DOCUMENT voor het typen van (genummerde) koppen.]</w:t>
-          </w:r>
-        </w:p>
-      </w:docPartBody>
-    </w:docPart>
-    <w:docPart>
-      <w:docPartPr>
-        <w:name w:val="9A51542F33794396A25966C937903A5F"/>
-        <w:category>
-          <w:name w:val="Algemeen"/>
-          <w:gallery w:val="placeholder"/>
-        </w:category>
-        <w:types>
-          <w:type w:val="bbPlcHdr"/>
-        </w:types>
-        <w:behaviors>
-          <w:behavior w:val="content"/>
-        </w:behaviors>
-        <w:guid w:val="{571265B2-4FCF-4559-8C35-9D7FCC7C673A}"/>
-      </w:docPartPr>
-      <w:docPartBody>
-        <w:p>
-          <w:pPr>
-            <w:pStyle w:val="9A51542F33794396A25966C937903A5F3"/>
-          </w:pPr>
-          <w:r>
-            <w:rPr>
-              <w:rStyle w:val="Tekstvantijdelijkeaanduiding"/>
-            </w:rPr>
-            <w:t>[Klik hier als je tekst wilt invoeren.]</w:t>
-          </w:r>
-        </w:p>
-      </w:docPartBody>
-    </w:docPart>
-    <w:docPart>
-      <w:docPartPr>
-        <w:name w:val="93BEF86AB9DD40D5BDCF2D4AD9CD55A4"/>
-        <w:category>
-          <w:name w:val="Algemeen"/>
-          <w:gallery w:val="placeholder"/>
-        </w:category>
-        <w:types>
-          <w:type w:val="bbPlcHdr"/>
-        </w:types>
-        <w:behaviors>
-          <w:behavior w:val="content"/>
-        </w:behaviors>
-        <w:guid w:val="{B34DB7D2-B5AD-4572-97F8-5BA36AB10DE5}"/>
-      </w:docPartPr>
-      <w:docPartBody>
-        <w:p>
-          <w:pPr>
-            <w:pStyle w:val="93BEF86AB9DD40D5BDCF2D4AD9CD55A42"/>
-          </w:pPr>
-          <w:r>
-            <w:rPr>
-              <w:rStyle w:val="Tekstvantijdelijkeaanduiding"/>
-            </w:rPr>
-            <w:t>[Paragraaftitel]</w:t>
           </w:r>
         </w:p>
       </w:docPartBody>
@@ -4559,12 +5727,12 @@
   <w:rsids>
     <w:rsidRoot w:val="00AC2175"/>
     <w:rsid w:val="0003236B"/>
-    <w:rsid w:val="00447398"/>
     <w:rsid w:val="00936A26"/>
     <w:rsid w:val="009568D7"/>
     <w:rsid w:val="00AC2175"/>
     <w:rsid w:val="00AF2DB0"/>
     <w:rsid w:val="00BC329E"/>
+    <w:rsid w:val="00DF5F17"/>
     <w:rsid w:val="00E30130"/>
     <w:rsid w:val="00E372BD"/>
   </w:rsids>
@@ -5497,37 +6665,71 @@
 </file>
 
 <file path=customXml/item3.xml><?xml version="1.0" encoding="utf-8"?>
-<b:Sources xmlns:b="http://schemas.openxmlformats.org/officeDocument/2006/bibliography" xmlns="http://schemas.openxmlformats.org/officeDocument/2006/bibliography" SelectedStyle="\APASixthEditionOfficeOnline.xsl" StyleName="APA" Version="6">
-  <b:Source>
-    <b:Tag>HPi10</b:Tag>
-    <b:SourceType>Report</b:SourceType>
-    <b:Guid>{EB17E8B4-CD9E-4929-8DF0-41ED47E182D5}</b:Guid>
-    <b:Author>
-      <b:Author>
-        <b:NameList>
-          <b:Person>
-            <b:Last>Pijnenburg</b:Last>
-            <b:First>H.</b:First>
-          </b:Person>
-        </b:NameList>
-      </b:Author>
-    </b:Author>
-    <b:Title>Zorgen dat het werkt</b:Title>
-    <b:Year>2010</b:Year>
-    <b:Publisher>Lectoraat Werkzame Factoren in de Zorg voor Jeugd, HAN</b:Publisher>
-    <b:City>Nijmegen</b:City>
-    <b:RefOrder>1</b:RefOrder>
-  </b:Source>
-</b:Sources>
-</file>
-
-<file path=customXml/item4.xml><?xml version="1.0" encoding="utf-8"?>
 <?mso-contentType ?>
 <FormTemplates xmlns="http://schemas.microsoft.com/sharepoint/v3/contenttype/forms">
   <Display>DocumentLibraryForm</Display>
   <Edit>DocumentLibraryForm</Edit>
   <New>DocumentLibraryForm</New>
 </FormTemplates>
+</file>
+
+<file path=customXml/item4.xml><?xml version="1.0" encoding="utf-8"?>
+<b:Sources xmlns:b="http://schemas.openxmlformats.org/officeDocument/2006/bibliography" xmlns="http://schemas.openxmlformats.org/officeDocument/2006/bibliography" SelectedStyle="\APASixthEditionOfficeOnline.xsl" StyleName="APA" Version="6">
+  <b:Source>
+    <b:Tag>Fun</b:Tag>
+    <b:SourceType>InternetSite</b:SourceType>
+    <b:Guid>{30B4D1D7-4E7E-4A62-A547-BD013B45133C}</b:Guid>
+    <b:Title>Functional Programming</b:Title>
+    <b:InternetSiteTitle>haskell</b:InternetSiteTitle>
+    <b:URL>https://wiki.haskell.org/index.php?title=Functional_programming</b:URL>
+    <b:RefOrder>1</b:RefOrder>
+  </b:Source>
+  <b:Source>
+    <b:Tag>Pur</b:Tag>
+    <b:SourceType>InternetSite</b:SourceType>
+    <b:Guid>{792496CD-069E-44D7-B922-F4D61E2C9F4D}</b:Guid>
+    <b:Title>Pure</b:Title>
+    <b:InternetSiteTitle>haskell</b:InternetSiteTitle>
+    <b:URL>https://wiki.haskell.org/Pure</b:URL>
+    <b:RefOrder>2</b:RefOrder>
+  </b:Source>
+  <b:Source>
+    <b:Tag>Hig</b:Tag>
+    <b:SourceType>InternetSite</b:SourceType>
+    <b:Guid>{11A5E517-AE9B-4A0A-B81A-5F7BA693177F}</b:Guid>
+    <b:Title>Higher order function</b:Title>
+    <b:InternetSiteTitle>haskell</b:InternetSiteTitle>
+    <b:URL>https://wiki.haskell.org/index.php?title=Higher_order_function</b:URL>
+    <b:RefOrder>3</b:RefOrder>
+  </b:Source>
+  <b:Source>
+    <b:Tag>Pat</b:Tag>
+    <b:SourceType>InternetSite</b:SourceType>
+    <b:Guid>{8D958E39-7F02-4A37-A483-5E5C017DCD07}</b:Guid>
+    <b:Title>Pattern matching</b:Title>
+    <b:InternetSiteTitle>hexdocs</b:InternetSiteTitle>
+    <b:URL>https://hexdocs.pm/elixir/1.19.5/pattern-matching.html</b:URL>
+    <b:RefOrder>6</b:RefOrder>
+  </b:Source>
+  <b:Source>
+    <b:Tag>Rec</b:Tag>
+    <b:SourceType>InternetSite</b:SourceType>
+    <b:Guid>{F0DDF316-C12A-4BED-968D-7910D2FB1AC9}</b:Guid>
+    <b:Title>Recursion</b:Title>
+    <b:InternetSiteTitle>hexdocs</b:InternetSiteTitle>
+    <b:URL>https://hexdocs.pm/elixir/1.19.5/recursion.html</b:URL>
+    <b:RefOrder>4</b:RefOrder>
+  </b:Source>
+  <b:Source>
+    <b:Tag>Laz</b:Tag>
+    <b:SourceType>InternetSite</b:SourceType>
+    <b:Guid>{A8CAC06D-1A35-4DB6-A460-D0D8A5F7CF11}</b:Guid>
+    <b:Title>Lazy evaluation</b:Title>
+    <b:InternetSiteTitle>Haskell</b:InternetSiteTitle>
+    <b:URL>https://wiki.haskell.org/Lazy_evaluation</b:URL>
+    <b:RefOrder>5</b:RefOrder>
+  </b:Source>
+</b:Sources>
 </file>
 
 <file path=customXml/itemProps1.xml><?xml version="1.0" encoding="utf-8"?>
@@ -5556,17 +6758,17 @@
 </file>
 
 <file path=customXml/itemProps3.xml><?xml version="1.0" encoding="utf-8"?>
-<ds:datastoreItem xmlns:ds="http://schemas.openxmlformats.org/officeDocument/2006/customXml" ds:itemID="{FC5467D7-69FE-4180-BE19-1D4073F22D60}">
+<ds:datastoreItem xmlns:ds="http://schemas.openxmlformats.org/officeDocument/2006/customXml" ds:itemID="{A05A2F34-0CE7-4D6F-9850-E83E48AF91B1}">
   <ds:schemaRefs>
-    <ds:schemaRef ds:uri="http://schemas.openxmlformats.org/officeDocument/2006/bibliography"/>
+    <ds:schemaRef ds:uri="http://schemas.microsoft.com/sharepoint/v3/contenttype/forms"/>
   </ds:schemaRefs>
 </ds:datastoreItem>
 </file>
 
 <file path=customXml/itemProps4.xml><?xml version="1.0" encoding="utf-8"?>
-<ds:datastoreItem xmlns:ds="http://schemas.openxmlformats.org/officeDocument/2006/customXml" ds:itemID="{A05A2F34-0CE7-4D6F-9850-E83E48AF91B1}">
+<ds:datastoreItem xmlns:ds="http://schemas.openxmlformats.org/officeDocument/2006/customXml" ds:itemID="{197E187B-6330-4528-B957-E18B3C0E9592}">
   <ds:schemaRefs>
-    <ds:schemaRef ds:uri="http://schemas.microsoft.com/sharepoint/v3/contenttype/forms"/>
+    <ds:schemaRef ds:uri="http://schemas.openxmlformats.org/officeDocument/2006/bibliography"/>
   </ds:schemaRefs>
 </ds:datastoreItem>
 </file>
</xml_diff>